<commit_message>
Revamp Enzymatic Treatments section: add general overview, mark obsolete paragraphs
- Insert two new overview paragraphs (red) after the existing intro,
  introducing enzyme families (carbohydrases, proteases, lipases),
  commercial preparations (Pentopan Mono BG, Celluclast 1.5 L,
  Lipopan Extra) and application modes (BSG pretreatment vs. direct
  dough addition). Reference Figure 9 for full enzyme inventory.
- Apply red strikethrough to six paragraphs whose content is now
  covered by the new overview or is tangential (biorefinery,
  chemical/physical pretreatments). User to review and accept
  deletions in Word.
- Section now flows general -> specific: intro -> enzyme overview
  -> Stojceska combos / xylanase paradox / sensory CV / particle-
  size synergy -> deletion candidates -> nutritional closing
  -> Figure 9.
</commit_message>
<xml_diff>
--- a/02_Proposal/Literature_Review_BSG_Thesis_03.docx
+++ b/02_Proposal/Literature_Review_BSG_Thesis_03.docx
@@ -7786,35 +7786,251 @@
       <w:pPr>
         <w:pStyle w:val="Heading2"/>
       </w:pPr>
-      <w:commentRangeStart w:id="2"/>
       <w:r>
         <w:t>Enzymatic Treatments to Improve Techno-Functional Properties</w:t>
       </w:r>
       <w:r>
         <w:t xml:space="preserve"> in bread</w:t>
-      </w:r>
-      <w:commentRangeEnd w:id="2"/>
-      <w:r>
-        <w:rPr>
-          <w:rStyle w:val="CommentReference"/>
-          <w:sz w:val="26"/>
-          <w:szCs w:val="26"/>
-        </w:rPr>
-        <w:commentReference w:id="2"/>
       </w:r>
     </w:p>
     <w:p>
       <w:r>
-        <w:rPr>
-          <w:color w:val="C00000"/>
-        </w:rPr>
-        <w:t xml:space="preserve">The previous section identified the main technological limitations that arise when BSG is incorporated into bread: dilution of the gluten network, intense competition for water by the fibre fraction, and the mechanical rigidity of the lignocellulosic matrix, which together compromise dough rheology, loaf volume and crumb softness. Mechanical strategies such as milling and sieving partially mitigate these effects, but they cannot modify the molecular structure of the fibre itself. Enzymatic treatment offers a complementary and selective approach, in which specific bonds of the BSG cell-wall polysaccharides, proteins or lipids are hydrolyzed under mild conditions, modifying dough behavior without altering the formulation (Lynch, Steffen, &amp; Arendt, 2016) (Stojceska &amp; Ainsworth, 2008). The following subsections describe the main enzyme families investigated for this purpose, the substrates on which they act, and the technological and sensory trade-offs reported in BSG-enriched breads.</w:t>
+        <w:t xml:space="preserve">The previous section identified the main technological limitations that arise when BSG is incorporated into bread: dilution of the gluten network, intense competition for water by the fibre fraction, and the mechanical rigidity of the lignocellulosic matrix, which together compromise dough rheology, loaf volume and crumb softness. Mechanical strategies such as milling and sieving partially mitigate these effects, but they cannot modify the molecular structure of the fibre itself. Enzymatic treatment offers a complementary and selective approach, in which specific bonds of the BSG cell-wall polysaccharides, proteins or lipids are </w:t>
+      </w:r>
+      <w:r>
+        <w:lastRenderedPageBreak/>
+        <w:t xml:space="preserve">hydrolyzed under mild conditions, modifying dough behavior without altering the formulation </w:t>
+      </w:r>
+      <w:sdt>
+        <w:sdtPr>
+          <w:id w:val="-1184972244"/>
+          <w:citation/>
+        </w:sdtPr>
+        <w:sdtContent>
+          <w:r>
+            <w:fldChar w:fldCharType="begin"/>
+          </w:r>
+          <w:r>
+            <w:instrText xml:space="preserve"> CITATION Lyn16 \l 3082 </w:instrText>
+          </w:r>
+          <w:r>
+            <w:fldChar w:fldCharType="separate"/>
+          </w:r>
+          <w:r>
+            <w:rPr>
+              <w:noProof/>
+            </w:rPr>
+            <w:t>(Lynch, Steffen, &amp; Arendt, 2016)</w:t>
+          </w:r>
+          <w:r>
+            <w:fldChar w:fldCharType="end"/>
+          </w:r>
+        </w:sdtContent>
+      </w:sdt>
+      <w:sdt>
+        <w:sdtPr>
+          <w:id w:val="-1949615271"/>
+          <w:citation/>
+        </w:sdtPr>
+        <w:sdtContent>
+          <w:r>
+            <w:fldChar w:fldCharType="begin"/>
+          </w:r>
+          <w:r>
+            <w:instrText xml:space="preserve"> CITATION Sto081 \l 3082 </w:instrText>
+          </w:r>
+          <w:r>
+            <w:fldChar w:fldCharType="separate"/>
+          </w:r>
+          <w:r>
+            <w:rPr>
+              <w:noProof/>
+            </w:rPr>
+            <w:t>(Stojceska &amp; Ainsworth, 2008)</w:t>
+          </w:r>
+          <w:r>
+            <w:fldChar w:fldCharType="end"/>
+          </w:r>
+        </w:sdtContent>
+      </w:sdt>
+      <w:r>
+        <w:t>. The following subsections describe the main enzyme families investigated for this purpose, the substrates on which they act, and the technological and sensory trade-offs reported in BSG-enriched breads.</w:t>
       </w:r>
     </w:p>
     <w:p>
-      <w:pPr>
-        <w:shd w:val="clear" w:color="auto" w:fill="DAE4F0"/>
-      </w:pPr>
+      <w:r>
+        <w:t>The enzymes investigated for BSG-enriched bread fall into three main families, each acting on a different structural component of the matrix. Carbohydrases target the cell-wall polysaccharides: xylanases hydrolyse the β-(1→4)-xylan backbone of arabinoxylans, the dominant hemicellulosic fraction; cellulases act on cellulose; and feruloyl- or acetyl-esterases release ester-linked hydroxycinnamic acids that crosslink polysaccharides and lignin. The combined effect is a reduction in fibre water-binding capacity, the generation of soluble oligosaccharides that behave as hydrocolloids stabilising gas cells, and improved water redistribution toward gluten hydration</w:t>
+      </w:r>
+      <w:r>
+        <w:t xml:space="preserve"> </w:t>
+      </w:r>
+      <w:sdt>
+        <w:sdtPr>
+          <w:id w:val="-1065101558"/>
+          <w:citation/>
+        </w:sdtPr>
+        <w:sdtContent>
+          <w:r>
+            <w:fldChar w:fldCharType="begin"/>
+          </w:r>
+          <w:r>
+            <w:instrText xml:space="preserve"> CITATION Lyn16 \l 3082 </w:instrText>
+          </w:r>
+          <w:r>
+            <w:fldChar w:fldCharType="separate"/>
+          </w:r>
+          <w:r>
+            <w:rPr>
+              <w:noProof/>
+            </w:rPr>
+            <w:t>(Lynch, Steffen, &amp; Arendt, 2016)</w:t>
+          </w:r>
+          <w:r>
+            <w:fldChar w:fldCharType="end"/>
+          </w:r>
+        </w:sdtContent>
+      </w:sdt>
+      <w:r>
+        <w:t>.</w:t>
+      </w:r>
+      <w:r>
+        <w:t xml:space="preserve"> Proteases, such as Alcalase® (Bacillus licheniformis), solubilise up to 77% of total BSG protein and free polysaccharides entrapped within the protein–fibre matrix, increasing nitrogen availability</w:t>
+      </w:r>
+      <w:r>
+        <w:t xml:space="preserve"> </w:t>
+      </w:r>
+      <w:sdt>
+        <w:sdtPr>
+          <w:id w:val="1707369687"/>
+          <w:citation/>
+        </w:sdtPr>
+        <w:sdtContent>
+          <w:r>
+            <w:fldChar w:fldCharType="begin"/>
+          </w:r>
+          <w:r>
+            <w:instrText xml:space="preserve"> CITATION Lyn16 \l 3082 </w:instrText>
+          </w:r>
+          <w:r>
+            <w:fldChar w:fldCharType="separate"/>
+          </w:r>
+          <w:r>
+            <w:rPr>
+              <w:noProof/>
+            </w:rPr>
+            <w:t>(Lynch, Steffen, &amp; Arendt, 2016)</w:t>
+          </w:r>
+          <w:r>
+            <w:fldChar w:fldCharType="end"/>
+          </w:r>
+        </w:sdtContent>
+      </w:sdt>
+      <w:r>
+        <w:t xml:space="preserve">. Lipases modify the lipid–protein interface, contributing to gas-cell stability and a softer crumb. At the industrial scale these activities are most often delivered through commercial preparations such as Pentopan Mono® BG (xylanase, Aspergillus niger), Celluclast® 1.5 L (cellulase, Trichoderma reesei) and Lipopan® Extra (lipase, Thermomyces lanuginosus), all of which have been validated in BSG-enriched bread formulations </w:t>
+      </w:r>
+      <w:sdt>
+        <w:sdtPr>
+          <w:id w:val="-162479701"/>
+          <w:citation/>
+        </w:sdtPr>
+        <w:sdtContent>
+          <w:r>
+            <w:fldChar w:fldCharType="begin"/>
+          </w:r>
+          <w:r>
+            <w:instrText xml:space="preserve">CITATION Sto082 \t  \l 3082 </w:instrText>
+          </w:r>
+          <w:r>
+            <w:fldChar w:fldCharType="separate"/>
+          </w:r>
+          <w:r>
+            <w:rPr>
+              <w:noProof/>
+            </w:rPr>
+            <w:t>(Stojceska &amp; Ainsworth, 2008)</w:t>
+          </w:r>
+          <w:r>
+            <w:fldChar w:fldCharType="end"/>
+          </w:r>
+        </w:sdtContent>
+      </w:sdt>
+      <w:r>
+        <w:t xml:space="preserve">. </w:t>
+      </w:r>
+    </w:p>
+    <w:p>
+      <w:r>
+        <w:t>These enzyme systems may be applied in two operationally distinct modes. In a pre-treatment mode, BSG is incubated with the enzyme cocktail in aqueous slurry under controlled pH and temperature (typically 40–55 °C) before incorporation into the formulation, allowing extensive hydrolysis under conditions far from those of dough mixing. In a direct dough-addition mode, the enzyme is dispensed with the other dry ingredients during mixing and acts in situ throughout fermentation, until thermally inactivated during baking. Pre-treatment enables deeper modification of the fibre matrix and is preferred when the recovery of soluble compounds is also targeted, while direct addition is operationally simpler and is the more common industrial choice in breadmaking</w:t>
+      </w:r>
+      <w:r>
+        <w:t xml:space="preserve"> </w:t>
+      </w:r>
+      <w:sdt>
+        <w:sdtPr>
+          <w:id w:val="24224185"/>
+          <w:citation/>
+        </w:sdtPr>
+        <w:sdtContent>
+          <w:r>
+            <w:fldChar w:fldCharType="begin"/>
+          </w:r>
+          <w:r>
+            <w:instrText xml:space="preserve"> CITATION Lyn16 \l 3082 </w:instrText>
+          </w:r>
+          <w:r>
+            <w:fldChar w:fldCharType="separate"/>
+          </w:r>
+          <w:r>
+            <w:rPr>
+              <w:noProof/>
+            </w:rPr>
+            <w:t>(Lynch, Steffen, &amp; Arendt, 2016)</w:t>
+          </w:r>
+          <w:r>
+            <w:fldChar w:fldCharType="end"/>
+          </w:r>
+        </w:sdtContent>
+      </w:sdt>
+      <w:sdt>
+        <w:sdtPr>
+          <w:id w:val="1858157095"/>
+          <w:citation/>
+        </w:sdtPr>
+        <w:sdtContent>
+          <w:r>
+            <w:fldChar w:fldCharType="begin"/>
+          </w:r>
+          <w:r>
+            <w:instrText xml:space="preserve">CITATION Sto082 \t  \l 3082 </w:instrText>
+          </w:r>
+          <w:r>
+            <w:fldChar w:fldCharType="separate"/>
+          </w:r>
+          <w:r>
+            <w:rPr>
+              <w:noProof/>
+            </w:rPr>
+            <w:t xml:space="preserve"> </w:t>
+          </w:r>
+          <w:r>
+            <w:rPr>
+              <w:noProof/>
+            </w:rPr>
+            <w:t>(Stojceska &amp; Ainsworth, 2008)</w:t>
+          </w:r>
+          <w:r>
+            <w:fldChar w:fldCharType="end"/>
+          </w:r>
+        </w:sdtContent>
+      </w:sdt>
+      <w:r>
+        <w:t xml:space="preserve"> </w:t>
+      </w:r>
+      <w:r>
+        <w:t>.</w:t>
+      </w:r>
+    </w:p>
+    <w:p>
       <w:r>
         <w:t xml:space="preserve">Moreover, combining BSG with enzyme systems such as Pentopan Mono (PE), Celluclast, and Lipopan Extra (LE) produced synergistic effects in dough rheology and staling </w:t>
       </w:r>
@@ -7858,18 +8074,18 @@
       </w:r>
     </w:p>
     <w:p>
-      <w:pPr>
-        <w:shd w:val="clear" w:color="auto" w:fill="DAE4F0"/>
-      </w:pPr>
+      <w:r>
+        <w:t xml:space="preserve">Enzymatic treatment of BSG creates a paradox in bread quality: while xylanase improves technological parameters such as loaf volume (+6–8%) and crumb softness by </w:t>
+      </w:r>
+      <w:r>
+        <w:t>solubilizing</w:t>
+      </w:r>
+      <w:r>
+        <w:t xml:space="preserve"> arabinoxylans, the same hydrolysis releases bitter phenolic compounds and generates excess </w:t>
+      </w:r>
       <w:r>
         <w:lastRenderedPageBreak/>
-        <w:t xml:space="preserve">Enzymatic treatment of BSG creates a paradox in bread quality: while xylanase improves technological parameters such as loaf volume (+6–8%) and crumb softness by </w:t>
-      </w:r>
-      <w:r>
-        <w:t>solubilizing</w:t>
-      </w:r>
-      <w:r>
-        <w:t xml:space="preserve"> arabinoxylans, the same hydrolysis releases bitter phenolic compounds and generates excess reducing sugars (xylose, arabinose, xylo-oligosaccharides) that participate in Maillard reactions during baking, producing off-</w:t>
+        <w:t>reducing sugars (xylose, arabinose, xylo-oligosaccharides) that participate in Maillard reactions during baking, producing off-</w:t>
       </w:r>
       <w:r>
         <w:t>flavors</w:t>
@@ -7940,9 +8156,6 @@
       </w:r>
     </w:p>
     <w:p>
-      <w:pPr>
-        <w:shd w:val="clear" w:color="auto" w:fill="DAE4F0"/>
-      </w:pPr>
       <w:r>
         <w:t>Beyond mean scores, inter-</w:t>
       </w:r>
@@ -7985,113 +8198,42 @@
         </w:sdtContent>
       </w:sdt>
       <w:r>
-        <w:t>. Such variability complicates the interpretation of mean acceptance scores and suggests that complementary objective quality metrics—such as digital image analysis of crumb structure—could provide a more consistent basis for formulation screening.</w:t>
+        <w:t>. Such variability complicates the interpretation of mean acceptance scores and suggests that complementary objective quality metrics</w:t>
+      </w:r>
+      <w:r>
+        <w:t xml:space="preserve">, </w:t>
+      </w:r>
+      <w:r>
+        <w:t>such as digital image analysis of crumb structure</w:t>
+      </w:r>
+      <w:r>
+        <w:t xml:space="preserve">, </w:t>
+      </w:r>
+      <w:r>
+        <w:t>could provide a more consistent basis for formulation screening.</w:t>
       </w:r>
     </w:p>
     <w:p>
-      <w:pPr>
-        <w:shd w:val="clear" w:color="auto" w:fill="DAE4F0"/>
-        <w:rPr>
-          <w:highlight w:val="yellow"/>
-        </w:rPr>
-      </w:pPr>
-      <w:r>
-        <w:rPr>
-          <w:highlight w:val="yellow"/>
-        </w:rPr>
+      <w:r>
         <w:t xml:space="preserve">Crucially, particle size reduction and enzymatic treatment are not mutually exclusive strategies but can act synergistically. Smaller particles expose greater surface area of the arabinoxylan substrate to xylanase action, potentially improving enzymatic efficiency and enabling lower enzyme dosages to achieve the same degree of fibre modification. This synergy has been demonstrated in related fibre systems: enzyme-treated fine wheat bran shows greater </w:t>
       </w:r>
       <w:r>
-        <w:rPr>
-          <w:highlight w:val="yellow"/>
-        </w:rPr>
         <w:t>solubilization</w:t>
       </w:r>
       <w:r>
-        <w:rPr>
-          <w:highlight w:val="yellow"/>
-        </w:rPr>
         <w:t xml:space="preserve"> of arabinoxylans than the same enzyme dosage applied to coarse bran </w:t>
       </w:r>
       <w:sdt>
         <w:sdtPr>
-          <w:rPr>
-            <w:highlight w:val="yellow"/>
-          </w:rPr>
           <w:id w:val="527269607"/>
           <w:citation/>
         </w:sdtPr>
         <w:sdtContent>
           <w:r>
-            <w:rPr>
-              <w:highlight w:val="yellow"/>
-            </w:rPr>
             <w:fldChar w:fldCharType="begin"/>
           </w:r>
           <w:r>
-            <w:rPr>
-              <w:highlight w:val="yellow"/>
-            </w:rPr>
             <w:instrText xml:space="preserve"> CITATION Cou02 \l 1033 </w:instrText>
-          </w:r>
-          <w:r>
-            <w:rPr>
-              <w:highlight w:val="yellow"/>
-            </w:rPr>
-            <w:fldChar w:fldCharType="separate"/>
-          </w:r>
-          <w:r>
-            <w:rPr>
-              <w:noProof/>
-              <w:highlight w:val="yellow"/>
-            </w:rPr>
-            <w:t>(Courtin &amp; Delcour, 2002)</w:t>
-          </w:r>
-          <w:r>
-            <w:rPr>
-              <w:highlight w:val="yellow"/>
-            </w:rPr>
-            <w:fldChar w:fldCharType="end"/>
-          </w:r>
-        </w:sdtContent>
-      </w:sdt>
-      <w:r>
-        <w:rPr>
-          <w:highlight w:val="yellow"/>
-        </w:rPr>
-        <w:t xml:space="preserve">. For BSG-enriched bread, the combination of sieving to &lt;250 μm followed by enzymatic treatment with xylanase could therefore represent an </w:t>
-      </w:r>
-      <w:r>
-        <w:rPr>
-          <w:highlight w:val="yellow"/>
-        </w:rPr>
-        <w:t>optimized</w:t>
-      </w:r>
-      <w:r>
-        <w:rPr>
-          <w:highlight w:val="yellow"/>
-        </w:rPr>
-        <w:t xml:space="preserve"> processing strategy that simultaneously improves dough handling, crumb structure and potentially sensory acceptance by enabling effective fibre modification at lower enzyme dosages, thereby reducing the release of bitter phenolic compounds.</w:t>
-      </w:r>
-    </w:p>
-    <w:p>
-      <w:r>
-        <w:rPr>
-          <w:highlight w:val="yellow"/>
-        </w:rPr>
-        <w:t xml:space="preserve">Enzymatic treatments have emerged as a sustainable and effective strategy to mitigate the technological limitations imposed by the incorporation of brewer’s spent grain (BSG) into bread doughs. Due to its rigid lignocellulosic structure, BSG resists hydration and mechanical disintegration, limiting gluten development and water mobility. The application of targeted enzyme systems, mainly cellulases, xylanases, and lipases, facilitates the controlled degradation of structural polysaccharides, improving dough rheology and loaf volume </w:t>
-      </w:r>
-      <w:sdt>
-        <w:sdtPr>
-          <w:id w:val="1548411236"/>
-          <w:citation/>
-        </w:sdtPr>
-        <w:sdtContent>
-          <w:r>
-            <w:fldChar w:fldCharType="begin"/>
-          </w:r>
-          <w:r>
-            <w:instrText xml:space="preserve"> CITATION Sto082 \l 1033 </w:instrText>
           </w:r>
           <w:r>
             <w:fldChar w:fldCharType="separate"/>
@@ -8100,7 +8242,7 @@
             <w:rPr>
               <w:noProof/>
             </w:rPr>
-            <w:t>(Stojceska &amp; Ainsworth, 2008)</w:t>
+            <w:t>(Courtin &amp; Delcour, 2002)</w:t>
           </w:r>
           <w:r>
             <w:fldChar w:fldCharType="end"/>
@@ -8108,223 +8250,13 @@
         </w:sdtContent>
       </w:sdt>
       <w:r>
-        <w:rPr>
-          <w:highlight w:val="yellow"/>
-        </w:rPr>
-        <w:t>.</w:t>
-      </w:r>
-    </w:p>
-    <w:p>
-      <w:r>
-        <w:t xml:space="preserve">Enzymes hydrolyze cellulose, hemicellulose, and arabinoxylan fractions, reducing polymer chain length and increasing the release of soluble oligosaccharides and bound water. This </w:t>
-      </w:r>
-      <w:r>
-        <w:lastRenderedPageBreak/>
-        <w:t xml:space="preserve">promotes better hydration of gluten-forming proteins, enhances dough extensibility, and contributes to a more elastic viscoelastic network </w:t>
-      </w:r>
-      <w:sdt>
-        <w:sdtPr>
-          <w:id w:val="-1260828470"/>
-          <w:citation/>
-        </w:sdtPr>
-        <w:sdtContent>
-          <w:r>
-            <w:fldChar w:fldCharType="begin"/>
-          </w:r>
-          <w:r>
-            <w:instrText xml:space="preserve"> CITATION Ney20 \l 1033 </w:instrText>
-          </w:r>
-          <w:r>
-            <w:fldChar w:fldCharType="separate"/>
-          </w:r>
-          <w:r>
-            <w:rPr>
-              <w:noProof/>
-            </w:rPr>
-            <w:t>(Neylon, Arendt, &amp; Zannini, 2020)</w:t>
-          </w:r>
-          <w:r>
-            <w:fldChar w:fldCharType="end"/>
-          </w:r>
-        </w:sdtContent>
-      </w:sdt>
-      <w:r>
-        <w:t>. The improved water distribution also benefits yeast activity, providing fermentable sugars that enhance CO₂ production and loaf expansion. Xylanases are particularly relev</w:t>
-      </w:r>
-      <w:r>
-        <w:rPr>
-          <w:rFonts w:hint="eastAsia"/>
-        </w:rPr>
-        <w:t xml:space="preserve">ant because they target the major hemicellulosic fraction in BSG, breaking </w:t>
-      </w:r>
-      <w:r>
-        <w:rPr>
-          <w:rFonts w:hint="eastAsia"/>
-        </w:rPr>
-        <w:t>β</w:t>
-      </w:r>
-      <w:r>
-        <w:rPr>
-          <w:rFonts w:hint="eastAsia"/>
-        </w:rPr>
-        <w:t>-(1</w:t>
-      </w:r>
-      <w:r>
-        <w:rPr>
-          <w:rFonts w:hint="eastAsia"/>
-        </w:rPr>
-        <w:t>→</w:t>
-      </w:r>
-      <w:r>
-        <w:rPr>
-          <w:rFonts w:hint="eastAsia"/>
-        </w:rPr>
-        <w:t>4)-xylosidic bonds and partially solubilizing arabinoxylans. The resulting soluble arabinoxylans act as hydrocolloids that stabilize gas cells and reduce crumb hardness.</w:t>
-      </w:r>
-    </w:p>
-    <w:p>
-      <w:r>
-        <w:t>Beyond their technological role, enzymatic systems support the sustainable valorization of BSG by releasing high-value compounds. As highlighted by Lynch, Steffen, and Arendt (2016), enzymatic hydrolysis enables the selective recovery of carbohydrates, proteins, and phenolic compounds without generating toxic by-products, unlike chemical extraction. The enzymatic fractionation of BSG has been performed using crude enzyme cocktails from fungi such as Trichoderma reesei, Fusarium oxysporum, and Neurospora crassa, which exhibit synergistic cellulolytic and hemicellulolytic activities, yielding up to 70% glucose and 60% pentose conversion under optimized conditions. These mixed enzyme systems</w:t>
-      </w:r>
-      <w:r>
-        <w:t xml:space="preserve">, </w:t>
-      </w:r>
-      <w:r>
-        <w:t>comprising xylanases, β-xylosidases, feruloyl and acetyl esterases, glucuronidases, and α-L-arabinofuranosidases</w:t>
-      </w:r>
-      <w:r>
-        <w:t xml:space="preserve">, </w:t>
-      </w:r>
-      <w:r>
-        <w:t>are essential to fully depolymerize the hemicellulose network and increase carbohydrate bioavailability.</w:t>
-      </w:r>
-    </w:p>
-    <w:p>
-      <w:r>
-        <w:t xml:space="preserve">Studies have also demonstrated that pre-treatment steps, such as mild acid or alkaline soaking or physical disruption (microwave, ultrasound, or extrusion), improve enzymatic accessibility to the BSG matrix </w:t>
-      </w:r>
-      <w:sdt>
-        <w:sdtPr>
-          <w:id w:val="1265961229"/>
-          <w:citation/>
-        </w:sdtPr>
-        <w:sdtContent>
-          <w:r>
-            <w:fldChar w:fldCharType="begin"/>
-          </w:r>
-          <w:r>
-            <w:instrText xml:space="preserve"> CITATION Mus06 \l 1033 </w:instrText>
-          </w:r>
-          <w:r>
-            <w:fldChar w:fldCharType="separate"/>
-          </w:r>
-          <w:r>
-            <w:rPr>
-              <w:noProof/>
-            </w:rPr>
-            <w:t>(Mussatto, Dragone, &amp; Roberto, 2006)</w:t>
-          </w:r>
-          <w:r>
-            <w:fldChar w:fldCharType="end"/>
-          </w:r>
-        </w:sdtContent>
-      </w:sdt>
-      <w:r>
-        <w:t>. However, enzymatic hydrolysis alone is generally preferred for food applications because it preserves the bioactivity of the released compounds and avoids chemical residues. Combined use of hydrolytic enzymes</w:t>
-      </w:r>
-      <w:r>
-        <w:t xml:space="preserve">, </w:t>
-      </w:r>
-      <w:r>
-        <w:t>cellulases, hemicellulases, and proteases</w:t>
-      </w:r>
-      <w:r>
-        <w:t xml:space="preserve">, </w:t>
-      </w:r>
-      <w:r>
-        <w:t xml:space="preserve">can further enhance solubilization. </w:t>
-      </w:r>
-    </w:p>
-    <w:p>
-      <w:pPr>
-        <w:pStyle w:val="ListParagraph"/>
-        <w:numPr>
-          <w:ilvl w:val="0"/>
-          <w:numId w:val="15"/>
-        </w:numPr>
-      </w:pPr>
-      <w:r>
-        <w:t xml:space="preserve">Proteases such as Alcalase® (from Bacillus licheniformis) have been shown to release up to 77% of BSG proteins, improving nitrogen availability and freeing carbohydrates trapped within insoluble protein matrices </w:t>
-      </w:r>
-      <w:sdt>
-        <w:sdtPr>
-          <w:id w:val="-1739776122"/>
-          <w:citation/>
-        </w:sdtPr>
-        <w:sdtContent>
-          <w:r>
-            <w:fldChar w:fldCharType="begin"/>
-          </w:r>
-          <w:r>
-            <w:instrText xml:space="preserve"> CITATION Lyn16 \l 1033 </w:instrText>
-          </w:r>
-          <w:r>
-            <w:fldChar w:fldCharType="separate"/>
-          </w:r>
-          <w:r>
-            <w:rPr>
-              <w:noProof/>
-            </w:rPr>
-            <w:t>(Lynch, Steffen, &amp; Arendt, 2016)</w:t>
-          </w:r>
-          <w:r>
-            <w:fldChar w:fldCharType="end"/>
-          </w:r>
-        </w:sdtContent>
-      </w:sdt>
-      <w:r>
-        <w:t>.</w:t>
-      </w:r>
-    </w:p>
-    <w:p>
-      <w:pPr>
-        <w:pStyle w:val="ListParagraph"/>
-        <w:numPr>
-          <w:ilvl w:val="0"/>
-          <w:numId w:val="15"/>
-        </w:numPr>
-      </w:pPr>
-      <w:r>
-        <w:t xml:space="preserve">Commercial formulations such as Pentopan Mono BG (xylanase), Celluclast® 1.5 L (cellulase), and Lipopan Extra (lipase) have proven particularly effective when incorporated during mixing, yielding softer crumbs, higher loaf volumes, and more uniform pore distribution </w:t>
-      </w:r>
-      <w:sdt>
-        <w:sdtPr>
-          <w:id w:val="775756272"/>
-          <w:citation/>
-        </w:sdtPr>
-        <w:sdtContent>
-          <w:r>
-            <w:fldChar w:fldCharType="begin"/>
-          </w:r>
-          <w:r>
-            <w:instrText xml:space="preserve"> CITATION Sto081 \l 1033 </w:instrText>
-          </w:r>
-          <w:r>
-            <w:fldChar w:fldCharType="separate"/>
-          </w:r>
-          <w:r>
-            <w:rPr>
-              <w:noProof/>
-            </w:rPr>
-            <w:t>(Stojceska &amp; Ainsworth, 2008)</w:t>
-          </w:r>
-          <w:r>
-            <w:fldChar w:fldCharType="end"/>
-          </w:r>
-        </w:sdtContent>
-      </w:sdt>
-      <w:r>
-        <w:t>.</w:t>
+        <w:t xml:space="preserve">. For BSG-enriched bread, the combination of sieving to &lt;250 μm followed by enzymatic treatment with xylanase could therefore represent an </w:t>
+      </w:r>
+      <w:r>
+        <w:t>optimized</w:t>
+      </w:r>
+      <w:r>
+        <w:t xml:space="preserve"> processing strategy that simultaneously improves dough handling, crumb structure and potentially sensory acceptance by enabling effective fibre modification at lower enzyme dosages, thereby reducing the release of bitter phenolic compounds.</w:t>
       </w:r>
     </w:p>
     <w:p>
@@ -11050,19 +10982,19 @@
           <w:pPr>
             <w:pStyle w:val="Heading1"/>
           </w:pPr>
-          <w:commentRangeStart w:id="3"/>
+          <w:commentRangeStart w:id="2"/>
           <w:r>
             <w:lastRenderedPageBreak/>
             <w:t>Bibliography</w:t>
           </w:r>
-          <w:commentRangeEnd w:id="3"/>
+          <w:commentRangeEnd w:id="2"/>
           <w:r>
             <w:rPr>
               <w:rStyle w:val="CommentReference"/>
               <w:sz w:val="28"/>
               <w:szCs w:val="28"/>
             </w:rPr>
-            <w:commentReference w:id="3"/>
+            <w:commentReference w:id="2"/>
           </w:r>
         </w:p>
         <w:sdt>
@@ -13862,24 +13794,7 @@
       </w:r>
     </w:p>
   </w:comment>
-  <w:comment w:id="2" w:author="Lucia Buzzeo" w:date="2026-04-26T21:19:00Z" w:initials="LB">
-    <w:p>
-      <w:pPr>
-        <w:pStyle w:val="CommentText"/>
-        <w:jc w:val="left"/>
-      </w:pPr>
-      <w:r>
-        <w:rPr>
-          <w:rStyle w:val="CommentReference"/>
-        </w:rPr>
-        <w:annotationRef/>
-      </w:r>
-      <w:r>
-        <w:t>Intorduction to this topic before talking about differences between them</w:t>
-      </w:r>
-    </w:p>
-  </w:comment>
-  <w:comment w:id="3" w:author="Lucia Buzzeo" w:date="2026-04-26T21:21:00Z" w:initials="LB">
+  <w:comment w:id="2" w:author="Lucia Buzzeo" w:date="2026-04-26T21:21:00Z" w:initials="LB">
     <w:p>
       <w:pPr>
         <w:pStyle w:val="CommentText"/>
@@ -13903,7 +13818,6 @@
 <w15:commentsEx xmlns:wpc="http://schemas.microsoft.com/office/word/2010/wordprocessingCanvas" xmlns:cx="http://schemas.microsoft.com/office/drawing/2014/chartex" xmlns:cx1="http://schemas.microsoft.com/office/drawing/2015/9/8/chartex" xmlns:cx2="http://schemas.microsoft.com/office/drawing/2015/10/21/chartex" xmlns:cx3="http://schemas.microsoft.com/office/drawing/2016/5/9/chartex" xmlns:cx4="http://schemas.microsoft.com/office/drawing/2016/5/10/chartex" xmlns:cx5="http://schemas.microsoft.com/office/drawing/2016/5/11/chartex" xmlns:cx6="http://schemas.microsoft.com/office/drawing/2016/5/12/chartex" xmlns:cx7="http://schemas.microsoft.com/office/drawing/2016/5/13/chartex" xmlns:cx8="http://schemas.microsoft.com/office/drawing/2016/5/14/chartex" xmlns:mc="http://schemas.openxmlformats.org/markup-compatibility/2006" xmlns:aink="http://schemas.microsoft.com/office/drawing/2016/ink" xmlns:am3d="http://schemas.microsoft.com/office/drawing/2017/model3d" xmlns:o="urn:schemas-microsoft-com:office:office" xmlns:oel="http://schemas.microsoft.com/office/2019/extlst" xmlns:r="http://schemas.openxmlformats.org/officeDocument/2006/relationships" xmlns:m="http://schemas.openxmlformats.org/officeDocument/2006/math" xmlns:v="urn:schemas-microsoft-com:vml" xmlns:wp14="http://schemas.microsoft.com/office/word/2010/wordprocessingDrawing" xmlns:wp="http://schemas.openxmlformats.org/drawingml/2006/wordprocessingDrawing" xmlns:w10="urn:schemas-microsoft-com:office:word" xmlns:w="http://schemas.openxmlformats.org/wordprocessingml/2006/main" xmlns:w14="http://schemas.microsoft.com/office/word/2010/wordml" xmlns:w15="http://schemas.microsoft.com/office/word/2012/wordml" xmlns:w16cex="http://schemas.microsoft.com/office/word/2018/wordml/cex" xmlns:w16cid="http://schemas.microsoft.com/office/word/2016/wordml/cid" xmlns:w16="http://schemas.microsoft.com/office/word/2018/wordml" xmlns:w16du="http://schemas.microsoft.com/office/word/2023/wordml/word16du" xmlns:w16sdtdh="http://schemas.microsoft.com/office/word/2020/wordml/sdtdatahash" xmlns:w16sdtfl="http://schemas.microsoft.com/office/word/2024/wordml/sdtformatlock" xmlns:w16se="http://schemas.microsoft.com/office/word/2015/wordml/symex" xmlns:wpg="http://schemas.microsoft.com/office/word/2010/wordprocessingGroup" xmlns:wpi="http://schemas.microsoft.com/office/word/2010/wordprocessingInk" xmlns:wne="http://schemas.microsoft.com/office/word/2006/wordml" xmlns:wps="http://schemas.microsoft.com/office/word/2010/wordprocessingShape" mc:Ignorable="w14 w15 w16se w16cid w16 w16cex w16sdtdh w16sdtfl w16du wp14">
   <w15:commentEx w15:paraId="5BFB7291" w15:done="0"/>
   <w15:commentEx w15:paraId="7CF313AE" w15:done="0"/>
-  <w15:commentEx w15:paraId="780A025B" w15:done="0"/>
   <w15:commentEx w15:paraId="5D894154" w15:done="0"/>
 </w15:commentsEx>
 </file>
@@ -13912,7 +13826,6 @@
 <w16cex:commentsExtensible xmlns:wpc="http://schemas.microsoft.com/office/word/2010/wordprocessingCanvas" xmlns:cx="http://schemas.microsoft.com/office/drawing/2014/chartex" xmlns:cx1="http://schemas.microsoft.com/office/drawing/2015/9/8/chartex" xmlns:cx2="http://schemas.microsoft.com/office/drawing/2015/10/21/chartex" xmlns:cx3="http://schemas.microsoft.com/office/drawing/2016/5/9/chartex" xmlns:cx4="http://schemas.microsoft.com/office/drawing/2016/5/10/chartex" xmlns:cx5="http://schemas.microsoft.com/office/drawing/2016/5/11/chartex" xmlns:cx6="http://schemas.microsoft.com/office/drawing/2016/5/12/chartex" xmlns:cx7="http://schemas.microsoft.com/office/drawing/2016/5/13/chartex" xmlns:cx8="http://schemas.microsoft.com/office/drawing/2016/5/14/chartex" xmlns:cr="http://schemas.microsoft.com/office/comments/2020/reactions" xmlns:mc="http://schemas.openxmlformats.org/markup-compatibility/2006" xmlns:aink="http://schemas.microsoft.com/office/drawing/2016/ink" xmlns:am3d="http://schemas.microsoft.com/office/drawing/2017/model3d" xmlns:o="urn:schemas-microsoft-com:office:office" xmlns:oel="http://schemas.microsoft.com/office/2019/extlst" xmlns:r="http://schemas.openxmlformats.org/officeDocument/2006/relationships" xmlns:m="http://schemas.openxmlformats.org/officeDocument/2006/math" xmlns:v="urn:schemas-microsoft-com:vml" xmlns:wp14="http://schemas.microsoft.com/office/word/2010/wordprocessingDrawing" xmlns:wp="http://schemas.openxmlformats.org/drawingml/2006/wordprocessingDrawing" xmlns:w10="urn:schemas-microsoft-com:office:word" xmlns:w="http://schemas.openxmlformats.org/wordprocessingml/2006/main" xmlns:w14="http://schemas.microsoft.com/office/word/2010/wordml" xmlns:w15="http://schemas.microsoft.com/office/word/2012/wordml" xmlns:w16cex="http://schemas.microsoft.com/office/word/2018/wordml/cex" xmlns:w16cid="http://schemas.microsoft.com/office/word/2016/wordml/cid" xmlns:w16="http://schemas.microsoft.com/office/word/2018/wordml" xmlns:w16du="http://schemas.microsoft.com/office/word/2023/wordml/word16du" xmlns:w16sdtdh="http://schemas.microsoft.com/office/word/2020/wordml/sdtdatahash" xmlns:w16sdtfl="http://schemas.microsoft.com/office/word/2024/wordml/sdtformatlock" xmlns:w16se="http://schemas.microsoft.com/office/word/2015/wordml/symex" xmlns:wpg="http://schemas.microsoft.com/office/word/2010/wordprocessingGroup" xmlns:wpi="http://schemas.microsoft.com/office/word/2010/wordprocessingInk" xmlns:wne="http://schemas.microsoft.com/office/word/2006/wordml" xmlns:wps="http://schemas.microsoft.com/office/word/2010/wordprocessingShape" mc:Ignorable="w14 w15 w16se w16cid w16 w16cex w16sdtdh w16sdtfl cr w16du wp14">
   <w16cex:commentExtensible w16cex:durableId="253E0E54" w16cex:dateUtc="2026-04-26T19:17:00Z"/>
   <w16cex:commentExtensible w16cex:durableId="41E56DA7" w16cex:dateUtc="2026-04-26T19:02:00Z"/>
-  <w16cex:commentExtensible w16cex:durableId="1C5758B9" w16cex:dateUtc="2026-04-26T19:19:00Z"/>
   <w16cex:commentExtensible w16cex:durableId="6736FAED" w16cex:dateUtc="2026-04-26T19:21:00Z"/>
 </w16cex:commentsExtensible>
 </file>
@@ -13921,7 +13834,6 @@
 <w16cid:commentsIds xmlns:wpc="http://schemas.microsoft.com/office/word/2010/wordprocessingCanvas" xmlns:cx="http://schemas.microsoft.com/office/drawing/2014/chartex" xmlns:cx1="http://schemas.microsoft.com/office/drawing/2015/9/8/chartex" xmlns:cx2="http://schemas.microsoft.com/office/drawing/2015/10/21/chartex" xmlns:cx3="http://schemas.microsoft.com/office/drawing/2016/5/9/chartex" xmlns:cx4="http://schemas.microsoft.com/office/drawing/2016/5/10/chartex" xmlns:cx5="http://schemas.microsoft.com/office/drawing/2016/5/11/chartex" xmlns:cx6="http://schemas.microsoft.com/office/drawing/2016/5/12/chartex" xmlns:cx7="http://schemas.microsoft.com/office/drawing/2016/5/13/chartex" xmlns:cx8="http://schemas.microsoft.com/office/drawing/2016/5/14/chartex" xmlns:mc="http://schemas.openxmlformats.org/markup-compatibility/2006" xmlns:aink="http://schemas.microsoft.com/office/drawing/2016/ink" xmlns:am3d="http://schemas.microsoft.com/office/drawing/2017/model3d" xmlns:o="urn:schemas-microsoft-com:office:office" xmlns:oel="http://schemas.microsoft.com/office/2019/extlst" xmlns:r="http://schemas.openxmlformats.org/officeDocument/2006/relationships" xmlns:m="http://schemas.openxmlformats.org/officeDocument/2006/math" xmlns:v="urn:schemas-microsoft-com:vml" xmlns:wp14="http://schemas.microsoft.com/office/word/2010/wordprocessingDrawing" xmlns:wp="http://schemas.openxmlformats.org/drawingml/2006/wordprocessingDrawing" xmlns:w10="urn:schemas-microsoft-com:office:word" xmlns:w="http://schemas.openxmlformats.org/wordprocessingml/2006/main" xmlns:w14="http://schemas.microsoft.com/office/word/2010/wordml" xmlns:w15="http://schemas.microsoft.com/office/word/2012/wordml" xmlns:w16cex="http://schemas.microsoft.com/office/word/2018/wordml/cex" xmlns:w16cid="http://schemas.microsoft.com/office/word/2016/wordml/cid" xmlns:w16="http://schemas.microsoft.com/office/word/2018/wordml" xmlns:w16du="http://schemas.microsoft.com/office/word/2023/wordml/word16du" xmlns:w16sdtdh="http://schemas.microsoft.com/office/word/2020/wordml/sdtdatahash" xmlns:w16sdtfl="http://schemas.microsoft.com/office/word/2024/wordml/sdtformatlock" xmlns:w16se="http://schemas.microsoft.com/office/word/2015/wordml/symex" xmlns:wpg="http://schemas.microsoft.com/office/word/2010/wordprocessingGroup" xmlns:wpi="http://schemas.microsoft.com/office/word/2010/wordprocessingInk" xmlns:wne="http://schemas.microsoft.com/office/word/2006/wordml" xmlns:wps="http://schemas.microsoft.com/office/word/2010/wordprocessingShape" mc:Ignorable="w14 w15 w16se w16cid w16 w16cex w16sdtdh w16sdtfl w16du wp14">
   <w16cid:commentId w16cid:paraId="5BFB7291" w16cid:durableId="253E0E54"/>
   <w16cid:commentId w16cid:paraId="7CF313AE" w16cid:durableId="41E56DA7"/>
-  <w16cid:commentId w16cid:paraId="780A025B" w16cid:durableId="1C5758B9"/>
   <w16cid:commentId w16cid:paraId="5D894154" w16cid:durableId="6736FAED"/>
 </w16cid:commentsIds>
 </file>

</xml_diff>

<commit_message>
Update literature review and replace BreadScan analyzer
- Literature_Review_BSG_Thesis_03.docx: latest in-Word edits
- Replace bread_porosity_analyzer_v5.html with
  bread_porosity_analyzer.html (expanded version, ~2x larger)
</commit_message>
<xml_diff>
--- a/02_Proposal/Literature_Review_BSG_Thesis_03.docx
+++ b/02_Proposal/Literature_Review_BSG_Thesis_03.docx
@@ -5412,7 +5412,6 @@
       </w:r>
     </w:p>
     <w:p>
-      <w:commentRangeStart w:id="0"/>
       <w:r>
         <w:t xml:space="preserve">Bread production involves mixing ingredients to obtain a viscoelastic dough that undergoes fermentation and baking. The physicochemical characteristics of the flour largely determine </w:t>
       </w:r>
@@ -5522,15 +5521,6 @@
       </w:sdt>
       <w:r>
         <w:t xml:space="preserve">. </w:t>
-      </w:r>
-      <w:commentRangeEnd w:id="0"/>
-      <w:r>
-        <w:rPr>
-          <w:rStyle w:val="CommentReference"/>
-          <w:sz w:val="22"/>
-          <w:szCs w:val="22"/>
-        </w:rPr>
-        <w:commentReference w:id="0"/>
       </w:r>
     </w:p>
     <w:p>
@@ -6786,18 +6776,18 @@
       <w:r>
         <w:t xml:space="preserve">BSG contributes phenolic compounds that are not always present in wheat flour and that increase antioxidant capacity in the final baked product. </w:t>
       </w:r>
-      <w:commentRangeStart w:id="1"/>
+      <w:commentRangeStart w:id="0"/>
       <w:r>
         <w:t>Free-phenolic</w:t>
       </w:r>
-      <w:commentRangeEnd w:id="1"/>
+      <w:commentRangeEnd w:id="0"/>
       <w:r>
         <w:rPr>
           <w:rStyle w:val="CommentReference"/>
           <w:sz w:val="22"/>
           <w:szCs w:val="22"/>
         </w:rPr>
-        <w:commentReference w:id="1"/>
+        <w:commentReference w:id="0"/>
       </w:r>
       <w:r>
         <w:t xml:space="preserve"> extracts from BSG include procyanidin B1, gallic and protocatechuic acids, ferulic acid and quinic acid, while broader profiling identified up to eleven phenolic compounds (e.g., gallic, vanillic, caffeic, ferulic, p-coumaric acids; quercetin; kaempferol; resveratrol) </w:t>
@@ -8301,11 +8291,6 @@
       <w:r>
         <w:t>.</w:t>
       </w:r>
-    </w:p>
-    <w:p>
-      <w:pPr>
-        <w:pStyle w:val="Caption"/>
-      </w:pPr>
     </w:p>
     <w:p>
       <w:pPr>
@@ -10094,15 +10079,42 @@
     </w:p>
     <w:p>
       <w:r>
-        <w:rPr>
-          <w:color w:val="C00000"/>
-        </w:rPr>
-        <w:t xml:space="preserve">The technological and sensory consequences of BSG enrichment and enzymatic treatment described in the previous sections — reduced specific volume, denser and more compact crumbs, smaller and more irregular gas cells, and dose-dependent shifts in consumer acceptance — are inherently structural in nature, and require quantitative, reproducible characterisation if formulations are to be compared on a common basis. Sensory panels, although irreplaceable for hedonic evaluation, are subjective, costly and produce high inter-panelist variability, particularly for fibre-enriched products where bitterness and astringency polarise responses. Digital image analysis (DIA) of the bread crumb cross-section provides the complementary objective dimension: it converts a single photograph or scanner image into a set of geometric descriptors — porosity, cell density, cell-size distribution, wall thickness and others — that can be compared across formulations and linked back to processing variables. The following subsections review the main steps of the DIA pipeline (acquisition, segmentation, metric extraction) and the specific adaptations required to apply it reliably to BSG-enriched breads, where the dark crumb colour and embedded fibre particles challenge protocols developed for white wheat bread.</w:t>
+        <w:t>The technological and sensory consequences of BSG enrichment and enzymatic treatment described in the previous sections</w:t>
+      </w:r>
+      <w:r>
+        <w:t xml:space="preserve"> </w:t>
+      </w:r>
+      <w:r>
+        <w:t xml:space="preserve">are inherently structural in nature, and require quantitative, reproducible </w:t>
+      </w:r>
+      <w:r>
+        <w:t>characterization</w:t>
+      </w:r>
+      <w:r>
+        <w:t xml:space="preserve"> if formulations are to be compared on a common basis.</w:t>
+      </w:r>
+      <w:r>
+        <w:t xml:space="preserve"> </w:t>
+      </w:r>
+      <w:r>
+        <w:t>Digital image analysis (DIA) of the bread crumb cross-section provides the complementary objective dimension: it converts a single photograph or scanner image into a set of geometric descriptors</w:t>
+      </w:r>
+      <w:r>
+        <w:t>:</w:t>
+      </w:r>
+      <w:r>
+        <w:t xml:space="preserve"> porosity, cell density, cell-size distribution, wall thickness and others</w:t>
+      </w:r>
+      <w:r>
+        <w:t>. It</w:t>
+      </w:r>
+      <w:r>
+        <w:t xml:space="preserve"> can be compared across formulations and linked back to processing variables. The following subsections review the main steps of the DIA pipeline (acquisition, segmentation, metric extraction) and the specific adaptations required to apply it reliably to BSG-enriched breads, where the dark crumb colour and embedded fibre particles challenge protocols developed for white wheat bread.</w:t>
       </w:r>
     </w:p>
     <w:p>
       <w:r>
-        <w:t>The structural characterisation of bread crumb has evolved from subjective visual scoring to quantitative digital image analysis (DIA). Since the crumb of leavened bread is a foam-like porous solid, its internal structure</w:t>
+        <w:t>Since the crumb of leavened bread is a foam-like porous solid, its internal structure</w:t>
       </w:r>
       <w:r>
         <w:t xml:space="preserve">, </w:t>
@@ -10316,7 +10328,14 @@
             <w:rPr>
               <w:noProof/>
             </w:rPr>
-            <w:t>(Schoeman, Williams, du Plessis, &amp; Manley, 2016)</w:t>
+            <w:t xml:space="preserve">(Schoeman, Williams, du Plessis, &amp; </w:t>
+          </w:r>
+          <w:r>
+            <w:rPr>
+              <w:noProof/>
+            </w:rPr>
+            <w:lastRenderedPageBreak/>
+            <w:t>Manley, 2016)</w:t>
           </w:r>
           <w:r>
             <w:fldChar w:fldCharType="end"/>
@@ -10337,19 +10356,10 @@
     </w:p>
     <w:p>
       <w:r>
-        <w:rPr>
-          <w:strike/>
-          <w:color w:val="C00000"/>
-        </w:rPr>
-        <w:t xml:space="preserve">Raw crumb images often suffer from uneven illumination, noise and low contrast between the solid matrix and gas cells. The preprocessing pipeline begins with conversion to grayscale using luminance-weighted channel combination (ITU-R BT.601: Y = 0.299R + 0.587G + 0.114B), followed by Gaussian blurring to suppress high-frequency noise while preserving pore boundaries. A critical enhancement step is Contrast-Limited Adaptive Histogram Equalisation (CLAHE), which operates on local tile regions rather than the entire image, computing a clipped histogram equalisation per tile and interpolating across boundaries </w:t>
-      </w:r>
-      <w:r>
-        <w:rPr>
-          <w:strike/>
-          <w:color w:val="C00000"/>
-        </w:rPr>
-        <w:lastRenderedPageBreak/>
-        <w:t xml:space="preserve">using bilinear interpolation. This corrects spatial variations in brightness without amplifying noise </w:t>
+        <w:t>Raw crumb images typically suffer from uneven illumination, noise and low contrast between the solid matrix and gas cells, requiring a preprocessing pipeline that converts the image to grayscale, suppresses high-frequency noise and enhances local contrast. Contrast-Limited Adaptive Histogram Equalisation (CLAHE) is the most commonly used enhancement step, as it improves local contrast without amplifying noise</w:t>
+      </w:r>
+      <w:r>
+        <w:t xml:space="preserve"> </w:t>
       </w:r>
       <w:sdt>
         <w:sdtPr>
@@ -10378,11 +10388,10 @@
         </w:sdtContent>
       </w:sdt>
       <w:r>
-        <w:rPr>
-          <w:strike/>
-          <w:color w:val="C00000"/>
-        </w:rPr>
-        <w:t xml:space="preserve">. For BSG-enriched breads, however, the brown pigmentation reduces luminance contrast between cell walls and pore interiors, and CLAHE flattens the intensity histogram, destroying the peak that represents the dominant crumb matrix colour. The solution is a bread-type-specific pipeline: CLAHE is applied for white bread analysis, but bypassed for BSG/dark bread where the threshold is computed on the raw grayscale to preserve the native histogram structure </w:t>
+        <w:t>. For BSG-enriched and other dark-coloured breads, however, the reduced luminance contrast between cell walls and pore interiors makes CLAHE counterproductive, since it flattens the intensity peak that represents the dominant crumb matrix colour; in such cases the pipeline must be adapted to preserve the native histogram structure</w:t>
+      </w:r>
+      <w:r>
+        <w:t xml:space="preserve"> </w:t>
       </w:r>
       <w:sdt>
         <w:sdtPr>
@@ -10411,19 +10420,7 @@
         </w:sdtContent>
       </w:sdt>
       <w:r>
-        <w:rPr>
-          <w:strike/>
-          <w:color w:val="C00000"/>
-        </w:rPr>
         <w:t>.</w:t>
-      </w:r>
-    </w:p>
-    <w:p>
-      <w:r>
-        <w:rPr>
-          <w:color w:val="C00000"/>
-        </w:rPr>
-        <w:t xml:space="preserve">Raw crumb images typically suffer from uneven illumination, noise and low contrast between the solid matrix and gas cells, requiring a preprocessing pipeline that converts the image to grayscale, suppresses high-frequency noise and enhances local contrast. Contrast-Limited Adaptive Histogram Equalisation (CLAHE) is the most commonly used enhancement step, as it improves local contrast without amplifying noise (Pizer, et al., 1987). For BSG-enriched and other dark-coloured breads, however, the reduced luminance contrast between cell walls and pore interiors makes CLAHE counterproductive, since it flattens the intensity peak that represents the dominant crumb matrix colour; in such cases the pipeline must be adapted to preserve the native histogram structure (Bosakova-Ardenska &amp; Danev, 2015).</w:t>
       </w:r>
     </w:p>
     <w:p>
@@ -10436,61 +10433,12 @@
     </w:p>
     <w:p>
       <w:r>
-        <w:rPr>
-          <w:strike/>
-          <w:color w:val="C00000"/>
-        </w:rPr>
-        <w:t xml:space="preserve">The central computational step in crumb DIA is image segmentation—classifying each pixel as either pore or wall. Thresholding is the dominant approach. Gonzales-Barron and Butler </w:t>
-      </w:r>
-      <w:sdt>
-        <w:sdtPr>
-          <w:id w:val="1816185959"/>
-          <w:citation/>
-        </w:sdtPr>
-        <w:sdtContent>
-          <w:r>
-            <w:fldChar w:fldCharType="begin"/>
-          </w:r>
-          <w:r>
-            <w:instrText xml:space="preserve"> CITATION Gon06 \l 1033 </w:instrText>
-          </w:r>
-          <w:r>
-            <w:fldChar w:fldCharType="separate"/>
-          </w:r>
-          <w:r>
-            <w:rPr>
-              <w:noProof/>
-            </w:rPr>
-            <w:t>(Gonzales-Barron &amp; Butler, 2006)</w:t>
-          </w:r>
-          <w:r>
-            <w:fldChar w:fldCharType="end"/>
-          </w:r>
-        </w:sdtContent>
-      </w:sdt>
-      <w:r>
-        <w:rPr>
-          <w:strike/>
-          <w:color w:val="C00000"/>
-        </w:rPr>
-        <w:t xml:space="preserve"> systematically compared seven thresholding algorithms (Otsu, isodata, minimum error, moment-preserving, Pun, fuzzy and manual) against K-means clustering on 135 bread slice images, finding that slight threshold variations caused substantial changes in cell uniformity and void fraction, with Otsu, isodata and fuzzy methods yielding the most consistent segmentation.</w:t>
+        <w:t>The central computational step in crumb DIA is image segmentation, in which each pixel is classified as pore or wall. Thresholding is the dominant approach. Gonzales-Barron and Butler (2006) systematically compared several thresholding algorithms against K-means clustering on a large set of bread slice images, and found that small differences in threshold value produce substantial changes in cell uniformity and void fraction; among the algorithms tested, Otsu, isodata and fuzzy methods yielded the most consistent segmentation.</w:t>
       </w:r>
     </w:p>
     <w:p>
       <w:r>
-        <w:rPr>
-          <w:color w:val="C00000"/>
-        </w:rPr>
-        <w:t xml:space="preserve">The central computational step in crumb DIA is image segmentation, in which each pixel is classified as pore or wall. Thresholding is the dominant approach. Gonzales-Barron and Butler (2006) systematically compared several thresholding algorithms against K-means clustering on a large set of bread slice images, and found that small differences in threshold value produce substantial changes in cell uniformity and void fraction; among the algorithms tested, Otsu, isodata and fuzzy methods yielded the most consistent segmentation.</w:t>
-      </w:r>
-    </w:p>
-    <w:p>
-      <w:r>
-        <w:rPr>
-          <w:strike/>
-          <w:color w:val="C00000"/>
-        </w:rPr>
-        <w:t xml:space="preserve">Global methods such as Otsu assume a bimodal intensity histogram and compute a single optimal cut-off. While effective for scanner images of white bread, global methods fail when illumination varies or when the crumb colour is heterogeneous, as occurs in BSG breads. Local adaptive thresholding overcomes this by computing a separate threshold for each pixel neighbourhood. The Sauvola method calculates T(x,y) = μ(x,y) × [1 + k × (σ(x,y)/R − 1)], where k controls sensitivity (typically 0.2) and R is the dynamic range of standard deviation </w:t>
+        <w:t xml:space="preserve">Global methods such as Otsu assume a bimodal intensity histogram and compute a single optimal cut-off; they perform well on scanner images of white bread but fail when illumination varies or when the crumb colour is heterogeneous, as is the case for BSG breads. Local adaptive thresholding addresses this limitation by computing a separate threshold for each pixel neighbourhood, of which the Sauvola method is one of the most widely used and is particularly suitable for images with non-uniform background intensity </w:t>
       </w:r>
       <w:sdt>
         <w:sdtPr>
@@ -10508,9 +10456,6 @@
             <w:fldChar w:fldCharType="separate"/>
           </w:r>
           <w:r>
-            <w:rPr>
-              <w:noProof/>
-            </w:rPr>
             <w:t>(Sauvola &amp; Pietikäinen, 2000)</w:t>
           </w:r>
           <w:r>
@@ -10519,19 +10464,7 @@
         </w:sdtContent>
       </w:sdt>
       <w:r>
-        <w:rPr>
-          <w:strike/>
-          <w:color w:val="C00000"/>
-        </w:rPr>
         <w:t>.</w:t>
-      </w:r>
-    </w:p>
-    <w:p>
-      <w:r>
-        <w:rPr>
-          <w:color w:val="C00000"/>
-        </w:rPr>
-        <w:t xml:space="preserve">Global methods such as Otsu assume a bimodal intensity histogram and compute a single optimal cut-off; they perform well on scanner images of white bread but fail when illumination varies or when the crumb colour is heterogeneous, as is the case for BSG breads. Local adaptive thresholding addresses this limitation by computing a separate threshold for each pixel neighbourhood, of which the Sauvola method is one of the most widely used and is particularly suitable for images with non-uniform background intensity (Sauvola &amp; Pietikäinen, 2000).</w:t>
       </w:r>
     </w:p>
     <w:p>
@@ -10578,11 +10511,14 @@
     </w:p>
     <w:p>
       <w:r>
-        <w:rPr>
-          <w:strike/>
-          <w:color w:val="C00000"/>
-        </w:rPr>
-        <w:t xml:space="preserve">After thresholding, binary images contain fragmented pore regions requiring morphological post-processing. Morphological closing (dilation followed by erosion) bridges small gaps between disconnected pore segments. The structuring element radius should be adapted to bread type: r = 1 for white bread with well-defined pores, and r = 3 for BSG breads where fibrous artefacts fragment genuine pores during thresholding. Individual gas cells are then identified through connected component labelling using 8-connectivity, which avoids artificially splitting cells at narrow connections. A size-based filter excludes noise (too small) and crust artefacts (too large). Importantly, no circularity filter should be applied: Gonzales-Barron and Butler </w:t>
+        <w:t xml:space="preserve">After thresholding, the binary image typically contains fragmented pore regions that require morphological post-processing. Morphological closing is commonly applied to bridge small gaps between disconnected pore segments, and individual gas cells are then identified by connected-component labelling. A size-based filter is used to exclude noise and crust </w:t>
+      </w:r>
+      <w:r>
+        <w:lastRenderedPageBreak/>
+        <w:t>artefacts. Crucially, no circularity filter should be applied, since bread pores are intrinsically elliptical and irregularly shaped</w:t>
+      </w:r>
+      <w:r>
+        <w:t xml:space="preserve"> </w:t>
       </w:r>
       <w:sdt>
         <w:sdtPr>
@@ -10611,41 +10547,7 @@
         </w:sdtContent>
       </w:sdt>
       <w:r>
-        <w:rPr>
-          <w:strike/>
-          <w:color w:val="C00000"/>
-        </w:rPr>
-        <w:t xml:space="preserve"> demonstrated that bread pores are </w:t>
-      </w:r>
-      <w:r>
-        <w:rPr>
-          <w:strike/>
-          <w:color w:val="C00000"/>
-        </w:rPr>
-        <w:lastRenderedPageBreak/>
-        <w:t>inherently elliptical and irregularly shaped</w:t>
-      </w:r>
-      <w:r>
-        <w:rPr>
-          <w:strike/>
-          <w:color w:val="C00000"/>
-        </w:rPr>
-        <w:t xml:space="preserve">, </w:t>
-      </w:r>
-      <w:r>
-        <w:rPr>
-          <w:strike/>
-          <w:color w:val="C00000"/>
-        </w:rPr>
-        <w:t>circularity-based rejection would discard genuine cells.</w:t>
-      </w:r>
-    </w:p>
-    <w:p>
-      <w:r>
-        <w:rPr>
-          <w:color w:val="C00000"/>
-        </w:rPr>
-        <w:t xml:space="preserve">After thresholding, the binary image typically contains fragmented pore regions that require morphological post-processing. Morphological closing is commonly applied to bridge small gaps between disconnected pore segments, and individual gas cells are then identified by connected-component labelling. A size-based filter is used to exclude noise and crust artefacts. Crucially, no circularity filter should be applied, since bread pores are intrinsically elliptical and irregularly shaped (Gonzales-Barron &amp; Butler, 2006).</w:t>
+        <w:t>.</w:t>
       </w:r>
     </w:p>
     <w:p>
@@ -10658,11 +10560,7 @@
     </w:p>
     <w:p>
       <w:r>
-        <w:rPr>
-          <w:strike/>
-          <w:color w:val="C00000"/>
-        </w:rPr>
-        <w:t xml:space="preserve">Once individual cells have been identified and size-filtered, a suite of quantitative metrics can be computed. Void Fraction (2D Porosity) is the ratio of total pore area to total image area, reflecting overall gas retention. Values for white bread typically range from 25–45% in flatbed scans, while BSG breads show reduced porosity (15–35%) </w:t>
+        <w:t xml:space="preserve">Once individual cells have been identified and size-filtered, a suite of quantitative metrics is computed. The most commonly reported are void fraction (2D porosity), cell density, mean cell area, cell uniformity, wall thickness and macro pore fraction. Together these capture overall gas retention, crumb fineness, pore-size regularity, matrix density and the extent of gas-cell coalescence. Reported void fractions are 25–45% for white bread (flatbed scans) and systematically lower for BSG-enriched breads (15–35%) </w:t>
       </w:r>
       <w:sdt>
         <w:sdtPr>
@@ -10690,6 +10588,9 @@
           </w:r>
         </w:sdtContent>
       </w:sdt>
+      <w:r>
+        <w:t xml:space="preserve"> </w:t>
+      </w:r>
       <w:sdt>
         <w:sdtPr>
           <w:id w:val="458712656"/>
@@ -10717,44 +10618,7 @@
         </w:sdtContent>
       </w:sdt>
       <w:r>
-        <w:rPr>
-          <w:strike/>
-          <w:color w:val="C00000"/>
-        </w:rPr>
-        <w:t xml:space="preserve">. Cell Density (cells/cm²) indicates crumb fineness, with higher values reflecting more numerous, smaller pores </w:t>
-      </w:r>
-      <w:sdt>
-        <w:sdtPr>
-          <w:id w:val="1935409885"/>
-          <w:citation/>
-        </w:sdtPr>
-        <w:sdtContent>
-          <w:r>
-            <w:fldChar w:fldCharType="begin"/>
-          </w:r>
-          <w:r>
-            <w:instrText xml:space="preserve"> CITATION Sca01 \l 1033 </w:instrText>
-          </w:r>
-          <w:r>
-            <w:fldChar w:fldCharType="separate"/>
-          </w:r>
-          <w:r>
-            <w:rPr>
-              <w:noProof/>
-            </w:rPr>
-            <w:t>(Scanlon &amp; Zghal, 2001)</w:t>
-          </w:r>
-          <w:r>
-            <w:fldChar w:fldCharType="end"/>
-          </w:r>
-        </w:sdtContent>
-      </w:sdt>
-      <w:r>
-        <w:rPr>
-          <w:strike/>
-          <w:color w:val="C00000"/>
-        </w:rPr>
-        <w:t xml:space="preserve">. Mean Cell Area reflects coarseness. Cell Uniformity, quantified as 1 minus the coefficient of variation of cell areas, measures pore size regularity and is one of the most sensitive metrics to threshold selection </w:t>
+        <w:t xml:space="preserve">. Cell uniformity has been reported as one of the metrics most sensitive to threshold selection </w:t>
       </w:r>
       <w:sdt>
         <w:sdtPr>
@@ -10783,19 +10647,7 @@
         </w:sdtContent>
       </w:sdt>
       <w:r>
-        <w:rPr>
-          <w:strike/>
-          <w:color w:val="C00000"/>
-        </w:rPr>
-        <w:t>. Wall Thickness, estimated as WT = √(A_solid / N_cells), indicates crumb matrix density. Macro Pore Fraction captures the percentage of area occupied by cells exceeding a coarseness threshold, indicating gas cell coalescence.</w:t>
-      </w:r>
-    </w:p>
-    <w:p>
-      <w:r>
-        <w:rPr>
-          <w:color w:val="C00000"/>
-        </w:rPr>
-        <w:t xml:space="preserve">Once individual cells have been identified and size-filtered, a suite of quantitative metrics is computed. The most commonly reported are void fraction (2D porosity), cell density, mean cell area, cell uniformity, wall thickness and macro pore fraction. Together these capture overall gas retention, crumb fineness, pore-size regularity, matrix density and the extent of gas-cell coalescence. Reported void fractions are 25–45% for white bread (flatbed scans) and systematically lower for BSG-enriched breads (15–35%) (Zghal, Scanlon, &amp; Sapirstein, 1999) (Gonzales-Barron &amp; Butler, 2006). Cell uniformity has been reported as one of the metrics most sensitive to threshold selection (Gonzales-Barron &amp; Butler, 2006).</w:t>
+        <w:t>.</w:t>
       </w:r>
     </w:p>
     <w:p>
@@ -10997,11 +10849,7 @@
     </w:p>
     <w:p>
       <w:r>
-        <w:t xml:space="preserve">Validation of computed metrics against expected literature ranges reduces the risk of reporting artefactual results. For white wheat bread, void fractions of 25–45% (scanner) or </w:t>
-      </w:r>
-      <w:r>
-        <w:lastRenderedPageBreak/>
-        <w:t>15–35% (photography) are typical, while BSG breads show systematically lower porosity. Embedding literature-derived quality checks into the analysis pipeline</w:t>
+        <w:t>Validation of computed metrics against expected literature ranges reduces the risk of reporting artefactual results. For white wheat bread, void fractions of 25–45% (scanner) or 15–35% (photography) are typical, while BSG breads show systematically lower porosity. Embedding literature-derived quality checks into the analysis pipeline</w:t>
       </w:r>
       <w:r>
         <w:t xml:space="preserve">, </w:t>
@@ -11021,6 +10869,7 @@
         <w:pStyle w:val="Heading3"/>
       </w:pPr>
       <w:r>
+        <w:lastRenderedPageBreak/>
         <w:t>Relevance and adaptations for BSG-enriched bread analysis</w:t>
       </w:r>
     </w:p>
@@ -11117,22 +10966,12 @@
         </w:docPartObj>
       </w:sdtPr>
       <w:sdtContent>
-        <w:commentRangeStart w:id="2" w:displacedByCustomXml="prev"/>
         <w:p>
           <w:pPr>
             <w:pStyle w:val="Heading1"/>
           </w:pPr>
           <w:r>
             <w:t>Bibliography</w:t>
-          </w:r>
-          <w:commentRangeEnd w:id="2"/>
-          <w:r>
-            <w:rPr>
-              <w:rStyle w:val="CommentReference"/>
-              <w:sz w:val="28"/>
-              <w:szCs w:val="28"/>
-            </w:rPr>
-            <w:commentReference w:id="2"/>
           </w:r>
         </w:p>
         <w:sdt>
@@ -12448,7 +12287,6 @@
                 <w:ind w:left="720" w:hanging="720"/>
                 <w:rPr>
                   <w:noProof/>
-                  <w:lang w:val="es-ES"/>
                 </w:rPr>
               </w:pPr>
               <w:r>
@@ -12474,7 +12312,6 @@
               <w:r>
                 <w:rPr>
                   <w:noProof/>
-                  <w:lang w:val="es-ES"/>
                 </w:rPr>
                 <w:t>Bioresource Technology.</w:t>
               </w:r>
@@ -12971,7 +12808,6 @@
                 <w:rPr>
                   <w:noProof/>
                 </w:rPr>
-                <w:lastRenderedPageBreak/>
                 <w:t xml:space="preserve">Thai, S., Avena-Bustillos, R., Alves, P., Pan, J., Osorio-Ruiz, A., Miller, J., . . . Yokoyama. (2022). Influence of drying methods on health indicators of brewers’ spent grain for potential upcycling into food products. </w:t>
               </w:r>
               <w:r>
@@ -13030,6 +12866,7 @@
                 <w:rPr>
                   <w:noProof/>
                 </w:rPr>
+                <w:lastRenderedPageBreak/>
                 <w:t xml:space="preserve">Waters, D. M., Jacob, F., Titze, J., Arendt, E. K., &amp; Zannini, E. (2012). Fibre, protein and mineral fortification of wheat bread through milled and fermented brewers’ spent grain enrichment. </w:t>
               </w:r>
               <w:r>
@@ -13148,13 +12985,31 @@
         </w:sdt>
       </w:sdtContent>
     </w:sdt>
-    <w:p/>
+    <w:p>
+      <w:pPr>
+        <w:jc w:val="left"/>
+      </w:pPr>
+      <w:r>
+        <w:br w:type="page"/>
+      </w:r>
+    </w:p>
     <w:p>
       <w:pPr>
         <w:pStyle w:val="Heading1"/>
       </w:pPr>
-      <w:r>
+      <w:commentRangeStart w:id="1"/>
+      <w:r>
+        <w:lastRenderedPageBreak/>
         <w:t>Experimental Methodology</w:t>
+      </w:r>
+      <w:commentRangeEnd w:id="1"/>
+      <w:r>
+        <w:rPr>
+          <w:rStyle w:val="CommentReference"/>
+          <w:sz w:val="28"/>
+          <w:szCs w:val="28"/>
+        </w:rPr>
+        <w:commentReference w:id="1"/>
       </w:r>
     </w:p>
     <w:p>
@@ -13232,7 +13087,6 @@
         <w:pStyle w:val="Heading3"/>
       </w:pPr>
       <w:r>
-        <w:lastRenderedPageBreak/>
         <w:t>Baseline Composition</w:t>
       </w:r>
     </w:p>
@@ -13326,6 +13180,7 @@
         <w:pStyle w:val="Heading2"/>
       </w:pPr>
       <w:r>
+        <w:lastRenderedPageBreak/>
         <w:t>Bread Formulation and Processing</w:t>
       </w:r>
     </w:p>
@@ -13686,7 +13541,6 @@
         <w:pStyle w:val="Heading2"/>
       </w:pPr>
       <w:r>
-        <w:lastRenderedPageBreak/>
         <w:t>Analytical Plan</w:t>
       </w:r>
     </w:p>
@@ -14141,6 +13995,7 @@
               <w:spacing w:after="200" w:line="276" w:lineRule="auto"/>
             </w:pPr>
             <w:r>
+              <w:lastRenderedPageBreak/>
               <w:t>N </w:t>
             </w:r>
           </w:p>
@@ -14549,12 +14404,12 @@
         <w:pStyle w:val="Heading1"/>
       </w:pPr>
       <w:r>
-        <w:t xml:space="preserve">Annex — Technical detail for Materials &amp; Methods (Digital Image Analysis)</w:t>
+        <w:t>Annex — Technical detail for Materials &amp; Methods (Digital Image Analysis)</w:t>
       </w:r>
     </w:p>
     <w:p>
       <w:r>
-        <w:t xml:space="preserve">The following passages were originally drafted as part of the Digital Image Analysis section of the literature review but contain implementation-level detail (specific algorithms, parameter values and formulas) that more naturally belongs in the Materials &amp; Methods chapter. They have been moved here verbatim so that they can be reused when the methods chapter is written.</w:t>
+        <w:t>The following passages were originally drafted as part of the Digital Image Analysis section of the literature review but contain implementation-level detail (specific algorithms, parameter values and formulas) that more naturally belongs in the Materials &amp; Methods chapter. They have been moved here verbatim so that they can be reused when the methods chapter is written.</w:t>
       </w:r>
     </w:p>
     <w:p>
@@ -14562,12 +14417,16 @@
         <w:pStyle w:val="Heading3"/>
       </w:pPr>
       <w:r>
-        <w:t xml:space="preserve">Image preprocessing and contrast enhancement (CLAHE, ITU-R BT.601)</w:t>
+        <w:t>Image preprocessing and contrast enhancement (CLAHE, ITU-R BT.601)</w:t>
       </w:r>
     </w:p>
     <w:p>
       <w:r>
-        <w:t xml:space="preserve">Raw crumb images often suffer from uneven illumination, noise and low contrast between the solid matrix and gas cells. The preprocessing pipeline begins with conversion to grayscale using luminance-weighted channel combination (ITU-R BT.601: Y = 0.299R + 0.587G + 0.114B), followed by Gaussian blurring to suppress high-frequency noise while preserving pore boundaries. A critical enhancement step is Contrast-Limited Adaptive Histogram Equalisation (CLAHE), which operates on local tile regions rather than the entire image, computing a clipped histogram equalisation per tile and interpolating across boundaries using bilinear interpolation. This corrects spatial variations in brightness without amplifying noise (Pizer, et al., 1987). For BSG-enriched breads, however, the brown pigmentation reduces luminance contrast between cell walls and pore interiors, and CLAHE flattens the intensity histogram, destroying the peak that represents the dominant crumb matrix colour. The solution is a bread-type-specific pipeline: CLAHE is applied for white bread analysis, but bypassed for BSG/dark bread where the threshold is computed on the raw grayscale to preserve the native histogram structure (Bosakova-Ardenska &amp; Danev, 2015).</w:t>
+        <w:t xml:space="preserve">Raw crumb images often suffer from uneven illumination, noise and low contrast between the solid matrix and gas cells. The preprocessing pipeline begins with conversion to grayscale using luminance-weighted channel combination (ITU-R BT.601: Y = 0.299R + 0.587G + 0.114B), followed by Gaussian blurring to suppress high-frequency noise while preserving pore boundaries. A critical enhancement step is Contrast-Limited Adaptive Histogram Equalisation (CLAHE), which operates on local tile regions rather than the entire image, computing a clipped histogram equalisation per tile and interpolating across boundaries using bilinear interpolation. This corrects spatial variations in brightness without amplifying noise (Pizer, et al., 1987). For BSG-enriched breads, however, the brown pigmentation reduces luminance contrast between cell walls and pore interiors, and CLAHE flattens the intensity histogram, destroying the peak that represents the dominant crumb matrix colour. The solution is a bread-type-specific pipeline: CLAHE is applied for white bread analysis, but </w:t>
+      </w:r>
+      <w:r>
+        <w:lastRenderedPageBreak/>
+        <w:t>bypassed for BSG/dark bread where the threshold is computed on the raw grayscale to preserve the native histogram structure (Bosakova-Ardenska &amp; Danev, 2015).</w:t>
       </w:r>
     </w:p>
     <w:p>
@@ -14575,12 +14434,12 @@
         <w:pStyle w:val="Heading3"/>
       </w:pPr>
       <w:r>
-        <w:t xml:space="preserve">Comparison of thresholding algorithms (Gonzales-Barron &amp; Butler, 2006)</w:t>
+        <w:t>Comparison of thresholding algorithms (Gonzales-Barron &amp; Butler, 2006)</w:t>
       </w:r>
     </w:p>
     <w:p>
       <w:r>
-        <w:t xml:space="preserve">The central computational step in crumb DIA is image segmentation—classifying each pixel as either pore or wall. Thresholding is the dominant approach. Gonzales-Barron and Butler (Gonzales-Barron &amp; Butler, 2006) systematically compared seven thresholding algorithms (Otsu, isodata, minimum error, moment-preserving, Pun, fuzzy and manual) against K-means clustering on 135 bread slice images, finding that slight threshold variations caused substantial changes in cell uniformity and void fraction, with Otsu, isodata and fuzzy methods yielding the most consistent segmentation.</w:t>
+        <w:t>The central computational step in crumb DIA is image segmentation—classifying each pixel as either pore or wall. Thresholding is the dominant approach. Gonzales-Barron and Butler (Gonzales-Barron &amp; Butler, 2006) systematically compared seven thresholding algorithms (Otsu, isodata, minimum error, moment-preserving, Pun, fuzzy and manual) against K-means clustering on 135 bread slice images, finding that slight threshold variations caused substantial changes in cell uniformity and void fraction, with Otsu, isodata and fuzzy methods yielding the most consistent segmentation.</w:t>
       </w:r>
     </w:p>
     <w:p>
@@ -14588,12 +14447,12 @@
         <w:pStyle w:val="Heading3"/>
       </w:pPr>
       <w:r>
-        <w:t xml:space="preserve">Local adaptive thresholding: Sauvola formula</w:t>
+        <w:t>Local adaptive thresholding: Sauvola formula</w:t>
       </w:r>
     </w:p>
     <w:p>
       <w:r>
-        <w:t xml:space="preserve">Global methods such as Otsu assume a bimodal intensity histogram and compute a single optimal cut-off. While effective for scanner images of white bread, global methods fail when illumination varies or when the crumb colour is heterogeneous, as occurs in BSG breads. Local adaptive thresholding overcomes this by computing a separate threshold for each pixel neighbourhood. The Sauvola method calculates T(x,y) = μ(x,y) × [1 + k × (σ(x,y)/R − 1)], where k controls sensitivity (typically 0.2) and R is the dynamic range of standard deviation (Sauvola &amp; Pietikäinen, 2000).</w:t>
+        <w:t>Global methods such as Otsu assume a bimodal intensity histogram and compute a single optimal cut-off. While effective for scanner images of white bread, global methods fail when illumination varies or when the crumb colour is heterogeneous, as occurs in BSG breads. Local adaptive thresholding overcomes this by computing a separate threshold for each pixel neighbourhood. The Sauvola method calculates T(x,y) = μ(x,y) × [1 + k × (σ(x,y)/R − 1)], where k controls sensitivity (typically 0.2) and R is the dynamic range of standard deviation (Sauvola &amp; Pietikäinen, 2000).</w:t>
       </w:r>
     </w:p>
     <w:p>
@@ -14601,12 +14460,12 @@
         <w:pStyle w:val="Heading3"/>
       </w:pPr>
       <w:r>
-        <w:t xml:space="preserve">Morphological post-processing: structuring elements and connectivity</w:t>
+        <w:t>Morphological post-processing: structuring elements and connectivity</w:t>
       </w:r>
     </w:p>
     <w:p>
       <w:r>
-        <w:t xml:space="preserve">After thresholding, binary images contain fragmented pore regions requiring morphological post-processing. Morphological closing (dilation followed by erosion) bridges small gaps between disconnected pore segments. The structuring element radius should be adapted to bread type: r = 1 for white bread with well-defined pores, and r = 3 for BSG breads where fibrous artefacts fragment genuine pores during thresholding. Individual gas cells are then identified through connected component labelling using 8-connectivity, which avoids artificially splitting cells at narrow connections. A size-based filter excludes noise (too small) and crust artefacts (too large). Importantly, no circularity filter should be applied: Gonzales-Barron and Butler (Gonzales-Barron &amp; Butler, 2006) demonstrated that bread pores are inherently elliptical and irregularly shaped, circularity-based rejection would discard genuine cells.</w:t>
+        <w:t>After thresholding, binary images contain fragmented pore regions requiring morphological post-processing. Morphological closing (dilation followed by erosion) bridges small gaps between disconnected pore segments. The structuring element radius should be adapted to bread type: r = 1 for white bread with well-defined pores, and r = 3 for BSG breads where fibrous artefacts fragment genuine pores during thresholding. Individual gas cells are then identified through connected component labelling using 8-connectivity, which avoids artificially splitting cells at narrow connections. A size-based filter excludes noise (too small) and crust artefacts (too large). Importantly, no circularity filter should be applied: Gonzales-Barron and Butler (Gonzales-Barron &amp; Butler, 2006) demonstrated that bread pores are inherently elliptical and irregularly shaped, circularity-based rejection would discard genuine cells.</w:t>
       </w:r>
     </w:p>
     <w:p>
@@ -14614,12 +14473,16 @@
         <w:pStyle w:val="Heading3"/>
       </w:pPr>
       <w:r>
-        <w:t xml:space="preserve">Quantitative crumb metrics and formulas</w:t>
+        <w:t>Quantitative crumb metrics and formulas</w:t>
       </w:r>
     </w:p>
     <w:p>
       <w:r>
-        <w:t xml:space="preserve">Once individual cells have been identified and size-filtered, a suite of quantitative metrics can be computed. Void Fraction (2D Porosity) is the ratio of total pore area to total image area, reflecting overall gas retention. Values for white bread typically range from 25–45% in flatbed scans, while BSG breads show reduced porosity (15–35%) (Zghal, Scanlon, &amp; Sapirstein, 1999) (Gonzales-Barron &amp; Butler, 2006). Cell Density (cells/cm²) indicates crumb fineness, with higher values reflecting more numerous, smaller pores (Scanlon &amp; Zghal, 2001). Mean Cell Area reflects coarseness. Cell Uniformity, quantified as 1 minus the coefficient of variation of cell areas, measures pore size regularity and is one of the most sensitive metrics to threshold selection (Gonzales-Barron &amp; Butler, 2006). Wall Thickness, estimated as WT = √(A_solid / N_cells), indicates crumb matrix density. Macro Pore Fraction captures the percentage of area occupied by cells exceeding a coarseness threshold, indicating gas cell coalescence.</w:t>
+        <w:t xml:space="preserve">Once individual cells have been identified and size-filtered, a suite of quantitative metrics can be computed. Void Fraction (2D Porosity) is the ratio of total pore area to total image area, reflecting overall gas retention. Values for white bread typically range from 25–45% in flatbed scans, while BSG breads show reduced porosity (15–35%) (Zghal, Scanlon, &amp; Sapirstein, 1999) (Gonzales-Barron &amp; Butler, 2006). Cell Density (cells/cm²) indicates crumb fineness, with higher values reflecting more numerous, smaller pores (Scanlon &amp; Zghal, 2001). Mean Cell Area reflects coarseness. Cell Uniformity, quantified as 1 minus the coefficient of variation of cell areas, measures pore size regularity and is one of the most sensitive metrics to threshold selection (Gonzales-Barron &amp; Butler, 2006). Wall Thickness, </w:t>
+      </w:r>
+      <w:r>
+        <w:lastRenderedPageBreak/>
+        <w:t>estimated as WT = √(A_solid / N_cells), indicates crumb matrix density. Macro Pore Fraction captures the percentage of area occupied by cells exceeding a coarseness threshold, indicating gas cell coalescence.</w:t>
       </w:r>
     </w:p>
     <w:sectPr>
@@ -14634,7 +14497,7 @@
 
 <file path=word/comments.xml><?xml version="1.0" encoding="utf-8"?>
 <w:comments xmlns:wpc="http://schemas.microsoft.com/office/word/2010/wordprocessingCanvas" xmlns:cx="http://schemas.microsoft.com/office/drawing/2014/chartex" xmlns:cx1="http://schemas.microsoft.com/office/drawing/2015/9/8/chartex" xmlns:cx2="http://schemas.microsoft.com/office/drawing/2015/10/21/chartex" xmlns:cx3="http://schemas.microsoft.com/office/drawing/2016/5/9/chartex" xmlns:cx4="http://schemas.microsoft.com/office/drawing/2016/5/10/chartex" xmlns:cx5="http://schemas.microsoft.com/office/drawing/2016/5/11/chartex" xmlns:cx6="http://schemas.microsoft.com/office/drawing/2016/5/12/chartex" xmlns:cx7="http://schemas.microsoft.com/office/drawing/2016/5/13/chartex" xmlns:cx8="http://schemas.microsoft.com/office/drawing/2016/5/14/chartex" xmlns:mc="http://schemas.openxmlformats.org/markup-compatibility/2006" xmlns:aink="http://schemas.microsoft.com/office/drawing/2016/ink" xmlns:am3d="http://schemas.microsoft.com/office/drawing/2017/model3d" xmlns:o="urn:schemas-microsoft-com:office:office" xmlns:oel="http://schemas.microsoft.com/office/2019/extlst" xmlns:r="http://schemas.openxmlformats.org/officeDocument/2006/relationships" xmlns:m="http://schemas.openxmlformats.org/officeDocument/2006/math" xmlns:v="urn:schemas-microsoft-com:vml" xmlns:wp14="http://schemas.microsoft.com/office/word/2010/wordprocessingDrawing" xmlns:wp="http://schemas.openxmlformats.org/drawingml/2006/wordprocessingDrawing" xmlns:w10="urn:schemas-microsoft-com:office:word" xmlns:w="http://schemas.openxmlformats.org/wordprocessingml/2006/main" xmlns:w14="http://schemas.microsoft.com/office/word/2010/wordml" xmlns:w15="http://schemas.microsoft.com/office/word/2012/wordml" xmlns:w16cex="http://schemas.microsoft.com/office/word/2018/wordml/cex" xmlns:w16cid="http://schemas.microsoft.com/office/word/2016/wordml/cid" xmlns:w16="http://schemas.microsoft.com/office/word/2018/wordml" xmlns:w16du="http://schemas.microsoft.com/office/word/2023/wordml/word16du" xmlns:w16sdtdh="http://schemas.microsoft.com/office/word/2020/wordml/sdtdatahash" xmlns:w16sdtfl="http://schemas.microsoft.com/office/word/2024/wordml/sdtformatlock" xmlns:w16se="http://schemas.microsoft.com/office/word/2015/wordml/symex" xmlns:wpg="http://schemas.microsoft.com/office/word/2010/wordprocessingGroup" xmlns:wpi="http://schemas.microsoft.com/office/word/2010/wordprocessingInk" xmlns:wne="http://schemas.microsoft.com/office/word/2006/wordml" xmlns:wps="http://schemas.microsoft.com/office/word/2010/wordprocessingShape" mc:Ignorable="w14 w15 w16se w16cid w16 w16cex w16sdtdh w16sdtfl w16du wp14">
-  <w:comment w:id="0" w:author="Lucia Buzzeo" w:date="2026-04-26T21:17:00Z" w:initials="LB">
+  <w:comment w:id="0" w:author="Lucia Buzzeo" w:date="2026-04-26T21:02:00Z" w:initials="LB">
     <w:p>
       <w:pPr>
         <w:pStyle w:val="CommentText"/>
@@ -14647,11 +14510,11 @@
         <w:annotationRef/>
       </w:r>
       <w:r>
-        <w:t>Revamo this introduction. It´s important to include main differences with wheat matrix bread (gluten discrepancies, starchprotein, etc, but maybe with a table or so</w:t>
+        <w:t>Free-phenolic?</w:t>
       </w:r>
     </w:p>
   </w:comment>
-  <w:comment w:id="1" w:author="Lucia Buzzeo" w:date="2026-04-26T21:02:00Z" w:initials="LB">
+  <w:comment w:id="1" w:author="Lucia Buzzeo" w:date="2026-05-08T13:04:00Z" w:initials="LB">
     <w:p>
       <w:pPr>
         <w:pStyle w:val="CommentText"/>
@@ -14664,24 +14527,7 @@
         <w:annotationRef/>
       </w:r>
       <w:r>
-        <w:t>Free-phenolic?</w:t>
-      </w:r>
-    </w:p>
-  </w:comment>
-  <w:comment w:id="2" w:author="Lucia Buzzeo" w:date="2026-04-26T21:21:00Z" w:initials="LB">
-    <w:p>
-      <w:pPr>
-        <w:pStyle w:val="CommentText"/>
-        <w:jc w:val="left"/>
-      </w:pPr>
-      <w:r>
-        <w:rPr>
-          <w:rStyle w:val="CommentReference"/>
-        </w:rPr>
-        <w:annotationRef/>
-      </w:r>
-      <w:r>
-        <w:t>Check all references to understand if they are repeated.</w:t>
+        <w:t>From here on, document is not completed.</w:t>
       </w:r>
     </w:p>
   </w:comment>
@@ -14690,25 +14536,22 @@
 
 <file path=word/commentsExtended.xml><?xml version="1.0" encoding="utf-8"?>
 <w15:commentsEx xmlns:wpc="http://schemas.microsoft.com/office/word/2010/wordprocessingCanvas" xmlns:cx="http://schemas.microsoft.com/office/drawing/2014/chartex" xmlns:cx1="http://schemas.microsoft.com/office/drawing/2015/9/8/chartex" xmlns:cx2="http://schemas.microsoft.com/office/drawing/2015/10/21/chartex" xmlns:cx3="http://schemas.microsoft.com/office/drawing/2016/5/9/chartex" xmlns:cx4="http://schemas.microsoft.com/office/drawing/2016/5/10/chartex" xmlns:cx5="http://schemas.microsoft.com/office/drawing/2016/5/11/chartex" xmlns:cx6="http://schemas.microsoft.com/office/drawing/2016/5/12/chartex" xmlns:cx7="http://schemas.microsoft.com/office/drawing/2016/5/13/chartex" xmlns:cx8="http://schemas.microsoft.com/office/drawing/2016/5/14/chartex" xmlns:mc="http://schemas.openxmlformats.org/markup-compatibility/2006" xmlns:aink="http://schemas.microsoft.com/office/drawing/2016/ink" xmlns:am3d="http://schemas.microsoft.com/office/drawing/2017/model3d" xmlns:o="urn:schemas-microsoft-com:office:office" xmlns:oel="http://schemas.microsoft.com/office/2019/extlst" xmlns:r="http://schemas.openxmlformats.org/officeDocument/2006/relationships" xmlns:m="http://schemas.openxmlformats.org/officeDocument/2006/math" xmlns:v="urn:schemas-microsoft-com:vml" xmlns:wp14="http://schemas.microsoft.com/office/word/2010/wordprocessingDrawing" xmlns:wp="http://schemas.openxmlformats.org/drawingml/2006/wordprocessingDrawing" xmlns:w10="urn:schemas-microsoft-com:office:word" xmlns:w="http://schemas.openxmlformats.org/wordprocessingml/2006/main" xmlns:w14="http://schemas.microsoft.com/office/word/2010/wordml" xmlns:w15="http://schemas.microsoft.com/office/word/2012/wordml" xmlns:w16cex="http://schemas.microsoft.com/office/word/2018/wordml/cex" xmlns:w16cid="http://schemas.microsoft.com/office/word/2016/wordml/cid" xmlns:w16="http://schemas.microsoft.com/office/word/2018/wordml" xmlns:w16du="http://schemas.microsoft.com/office/word/2023/wordml/word16du" xmlns:w16sdtdh="http://schemas.microsoft.com/office/word/2020/wordml/sdtdatahash" xmlns:w16sdtfl="http://schemas.microsoft.com/office/word/2024/wordml/sdtformatlock" xmlns:w16se="http://schemas.microsoft.com/office/word/2015/wordml/symex" xmlns:wpg="http://schemas.microsoft.com/office/word/2010/wordprocessingGroup" xmlns:wpi="http://schemas.microsoft.com/office/word/2010/wordprocessingInk" xmlns:wne="http://schemas.microsoft.com/office/word/2006/wordml" xmlns:wps="http://schemas.microsoft.com/office/word/2010/wordprocessingShape" mc:Ignorable="w14 w15 w16se w16cid w16 w16cex w16sdtdh w16sdtfl w16du wp14">
-  <w15:commentEx w15:paraId="5BFB7291" w15:done="0"/>
   <w15:commentEx w15:paraId="7CF313AE" w15:done="0"/>
-  <w15:commentEx w15:paraId="5D894154" w15:done="0"/>
+  <w15:commentEx w15:paraId="3ED40BF7" w15:done="0"/>
 </w15:commentsEx>
 </file>
 
 <file path=word/commentsExtensible.xml><?xml version="1.0" encoding="utf-8"?>
 <w16cex:commentsExtensible xmlns:wpc="http://schemas.microsoft.com/office/word/2010/wordprocessingCanvas" xmlns:cx="http://schemas.microsoft.com/office/drawing/2014/chartex" xmlns:cx1="http://schemas.microsoft.com/office/drawing/2015/9/8/chartex" xmlns:cx2="http://schemas.microsoft.com/office/drawing/2015/10/21/chartex" xmlns:cx3="http://schemas.microsoft.com/office/drawing/2016/5/9/chartex" xmlns:cx4="http://schemas.microsoft.com/office/drawing/2016/5/10/chartex" xmlns:cx5="http://schemas.microsoft.com/office/drawing/2016/5/11/chartex" xmlns:cx6="http://schemas.microsoft.com/office/drawing/2016/5/12/chartex" xmlns:cx7="http://schemas.microsoft.com/office/drawing/2016/5/13/chartex" xmlns:cx8="http://schemas.microsoft.com/office/drawing/2016/5/14/chartex" xmlns:cr="http://schemas.microsoft.com/office/comments/2020/reactions" xmlns:mc="http://schemas.openxmlformats.org/markup-compatibility/2006" xmlns:aink="http://schemas.microsoft.com/office/drawing/2016/ink" xmlns:am3d="http://schemas.microsoft.com/office/drawing/2017/model3d" xmlns:o="urn:schemas-microsoft-com:office:office" xmlns:oel="http://schemas.microsoft.com/office/2019/extlst" xmlns:r="http://schemas.openxmlformats.org/officeDocument/2006/relationships" xmlns:m="http://schemas.openxmlformats.org/officeDocument/2006/math" xmlns:v="urn:schemas-microsoft-com:vml" xmlns:wp14="http://schemas.microsoft.com/office/word/2010/wordprocessingDrawing" xmlns:wp="http://schemas.openxmlformats.org/drawingml/2006/wordprocessingDrawing" xmlns:w10="urn:schemas-microsoft-com:office:word" xmlns:w="http://schemas.openxmlformats.org/wordprocessingml/2006/main" xmlns:w14="http://schemas.microsoft.com/office/word/2010/wordml" xmlns:w15="http://schemas.microsoft.com/office/word/2012/wordml" xmlns:w16cex="http://schemas.microsoft.com/office/word/2018/wordml/cex" xmlns:w16cid="http://schemas.microsoft.com/office/word/2016/wordml/cid" xmlns:w16="http://schemas.microsoft.com/office/word/2018/wordml" xmlns:w16du="http://schemas.microsoft.com/office/word/2023/wordml/word16du" xmlns:w16sdtdh="http://schemas.microsoft.com/office/word/2020/wordml/sdtdatahash" xmlns:w16sdtfl="http://schemas.microsoft.com/office/word/2024/wordml/sdtformatlock" xmlns:w16se="http://schemas.microsoft.com/office/word/2015/wordml/symex" xmlns:wpg="http://schemas.microsoft.com/office/word/2010/wordprocessingGroup" xmlns:wpi="http://schemas.microsoft.com/office/word/2010/wordprocessingInk" xmlns:wne="http://schemas.microsoft.com/office/word/2006/wordml" xmlns:wps="http://schemas.microsoft.com/office/word/2010/wordprocessingShape" mc:Ignorable="w14 w15 w16se w16cid w16 w16cex w16sdtdh w16sdtfl cr w16du wp14">
-  <w16cex:commentExtensible w16cex:durableId="253E0E54" w16cex:dateUtc="2026-04-26T19:17:00Z"/>
   <w16cex:commentExtensible w16cex:durableId="41E56DA7" w16cex:dateUtc="2026-04-26T19:02:00Z"/>
-  <w16cex:commentExtensible w16cex:durableId="6736FAED" w16cex:dateUtc="2026-04-26T19:21:00Z"/>
+  <w16cex:commentExtensible w16cex:durableId="7B2FE85D" w16cex:dateUtc="2026-05-08T11:04:00Z"/>
 </w16cex:commentsExtensible>
 </file>
 
 <file path=word/commentsIds.xml><?xml version="1.0" encoding="utf-8"?>
 <w16cid:commentsIds xmlns:wpc="http://schemas.microsoft.com/office/word/2010/wordprocessingCanvas" xmlns:cx="http://schemas.microsoft.com/office/drawing/2014/chartex" xmlns:cx1="http://schemas.microsoft.com/office/drawing/2015/9/8/chartex" xmlns:cx2="http://schemas.microsoft.com/office/drawing/2015/10/21/chartex" xmlns:cx3="http://schemas.microsoft.com/office/drawing/2016/5/9/chartex" xmlns:cx4="http://schemas.microsoft.com/office/drawing/2016/5/10/chartex" xmlns:cx5="http://schemas.microsoft.com/office/drawing/2016/5/11/chartex" xmlns:cx6="http://schemas.microsoft.com/office/drawing/2016/5/12/chartex" xmlns:cx7="http://schemas.microsoft.com/office/drawing/2016/5/13/chartex" xmlns:cx8="http://schemas.microsoft.com/office/drawing/2016/5/14/chartex" xmlns:mc="http://schemas.openxmlformats.org/markup-compatibility/2006" xmlns:aink="http://schemas.microsoft.com/office/drawing/2016/ink" xmlns:am3d="http://schemas.microsoft.com/office/drawing/2017/model3d" xmlns:o="urn:schemas-microsoft-com:office:office" xmlns:oel="http://schemas.microsoft.com/office/2019/extlst" xmlns:r="http://schemas.openxmlformats.org/officeDocument/2006/relationships" xmlns:m="http://schemas.openxmlformats.org/officeDocument/2006/math" xmlns:v="urn:schemas-microsoft-com:vml" xmlns:wp14="http://schemas.microsoft.com/office/word/2010/wordprocessingDrawing" xmlns:wp="http://schemas.openxmlformats.org/drawingml/2006/wordprocessingDrawing" xmlns:w10="urn:schemas-microsoft-com:office:word" xmlns:w="http://schemas.openxmlformats.org/wordprocessingml/2006/main" xmlns:w14="http://schemas.microsoft.com/office/word/2010/wordml" xmlns:w15="http://schemas.microsoft.com/office/word/2012/wordml" xmlns:w16cex="http://schemas.microsoft.com/office/word/2018/wordml/cex" xmlns:w16cid="http://schemas.microsoft.com/office/word/2016/wordml/cid" xmlns:w16="http://schemas.microsoft.com/office/word/2018/wordml" xmlns:w16du="http://schemas.microsoft.com/office/word/2023/wordml/word16du" xmlns:w16sdtdh="http://schemas.microsoft.com/office/word/2020/wordml/sdtdatahash" xmlns:w16sdtfl="http://schemas.microsoft.com/office/word/2024/wordml/sdtformatlock" xmlns:w16se="http://schemas.microsoft.com/office/word/2015/wordml/symex" xmlns:wpg="http://schemas.microsoft.com/office/word/2010/wordprocessingGroup" xmlns:wpi="http://schemas.microsoft.com/office/word/2010/wordprocessingInk" xmlns:wne="http://schemas.microsoft.com/office/word/2006/wordml" xmlns:wps="http://schemas.microsoft.com/office/word/2010/wordprocessingShape" mc:Ignorable="w14 w15 w16se w16cid w16 w16cex w16sdtdh w16sdtfl w16du wp14">
-  <w16cid:commentId w16cid:paraId="5BFB7291" w16cid:durableId="253E0E54"/>
   <w16cid:commentId w16cid:paraId="7CF313AE" w16cid:durableId="41E56DA7"/>
-  <w16cid:commentId w16cid:paraId="5D894154" w16cid:durableId="6736FAED"/>
+  <w16cid:commentId w16cid:paraId="3ED40BF7" w16cid:durableId="7B2FE85D"/>
 </w16cid:commentsIds>
 </file>
 
@@ -16500,7 +16343,6 @@
   <w:style w:type="character" w:default="1" w:styleId="DefaultParagraphFont">
     <w:name w:val="Default Paragraph Font"/>
     <w:uiPriority w:val="1"/>
-    <w:semiHidden/>
     <w:unhideWhenUsed/>
   </w:style>
   <w:style w:type="table" w:default="1" w:styleId="TableNormal">

</xml_diff>

<commit_message>
Update literature review docx (in-Word edits)
</commit_message>
<xml_diff>
--- a/02_Proposal/Literature_Review_BSG_Thesis_03.docx
+++ b/02_Proposal/Literature_Review_BSG_Thesis_03.docx
@@ -13034,7 +13034,7 @@
         <w:rPr>
           <w:color w:val="C00000"/>
         </w:rPr>
-        <w:t xml:space="preserve">The experimental work of this thesis was carried out in two consecutive batches. The first batch (Phase 1) evaluated the effect of direct xylanase addition (Pentopan Mono BG, 70 ppm on flour basis) on the techno-functional behaviour of unsieved brewer's spent grain (BSG) when incorporated into wheat-based bread at 0%, 10% and 20% flour substitution levels. The second batch (Phase 2) refined this approach by introducing two combined modifications: (i) the dried BSG was sieved to retain only the fraction below 250 µm, removing coarse husk- and pericarp-rich particles that disrupt the gluten network without contributing arabinoxylan to xylanase activity, and (ii) the xylanase dosage was raised to 120 ppm to match the higher arabinoxylan concentration of the sieved fraction. Phase 2 also incorporated two analytical extensions not used in Phase 1: instrumental texture profile analysis (TPA) on the bread crumb and digital image analysis (DIA) of the crumb cross-section. Both batches used the same wheat-flour control, baking protocol and trained sensory panel, so that they can be compared on a common basis.</w:t>
+        <w:t>The experimental work of this thesis was carried out in two consecutive batches. The first batch (Phase 1) evaluated the effect of direct xylanase addition (Pentopan Mono BG, 70 ppm on flour basis) on the techno-functional behaviour of unsieved brewer's spent grain (BSG) when incorporated into wheat-based bread at 0%, 10% and 20% flour substitution levels. The second batch (Phase 2) refined this approach by introducing two combined modifications: (i) the dried BSG was sieved to retain only the fraction below 250 µm, removing coarse husk- and pericarp-rich particles that disrupt the gluten network without contributing arabinoxylan to xylanase activity, and (ii) the xylanase dosage was raised to 120 ppm to match the higher arabinoxylan concentration of the sieved fraction. Phase 2 also incorporated two analytical extensions not used in Phase 1: instrumental texture profile analysis (TPA) on the bread crumb and digital image analysis (DIA) of the crumb cross-section. Both batches used the same wheat-flour control, baking protocol and trained sensory panel, so that they can be compared on a common basis.</w:t>
       </w:r>
     </w:p>
     <w:p>
@@ -13127,7 +13127,26 @@
         <w:rPr>
           <w:color w:val="C00000"/>
         </w:rPr>
-        <w:t xml:space="preserve">The brewer's spent grain used in this study was obtained from [to be completed: brewery source and collection protocol] from a barley malt batch of variety [to be completed: malt variety]. Immediately after collection, the wet BSG (~80% moisture) was refrigerated at 4 °C until further processing, then dried [to be completed: drying temperature, duration and equipment] to a stable storage moisture; the residual moisture content of the dried material used in this study was 4.93 ± 0.03% (Phase 1 raw-material characterisation). The dried BSG was milled to a uniform particle size below 0.5 mm and stored in sealed polyethylene bags at room temperature until use. For Phase 2, an additional fractionation step was introduced: the dried, milled BSG was sieved through a 250 µm mesh, and only the fraction passing through the sieve (referred to as BSG&lt;250) was retained for incorporation into the dough.</w:t>
+        <w:t xml:space="preserve">The brewer's spent grain used in this study was obtained from [to be completed: brewery source and collection protocol] from a barley malt batch of variety [to be completed: malt variety]. Immediately after collection, the wet BSG (~80% moisture) was refrigerated at 4 °C until further processing, then dried [to be completed: drying temperature, duration and equipment] to a stable storage moisture; the residual moisture content of the dried material used in this study was 4.93 ± 0.03% (Phase 1 raw-material </w:t>
+      </w:r>
+      <w:r>
+        <w:rPr>
+          <w:color w:val="C00000"/>
+        </w:rPr>
+        <w:t>characterization</w:t>
+      </w:r>
+      <w:r>
+        <w:rPr>
+          <w:color w:val="C00000"/>
+        </w:rPr>
+        <w:t xml:space="preserve">). The dried BSG was milled to a uniform particle size below 0.5 mm and stored in sealed polyethylene bags at room temperature until use. For Phase 2, an additional fractionation step was introduced: the </w:t>
+      </w:r>
+      <w:r>
+        <w:rPr>
+          <w:color w:val="C00000"/>
+        </w:rPr>
+        <w:lastRenderedPageBreak/>
+        <w:t>dried, milled BSG was sieved through a 250 µm mesh, and only the fraction passing through the sieve (referred to as BSG&lt;250) was retained for incorporation into the dough.</w:t>
       </w:r>
     </w:p>
     <w:p>
@@ -13244,7 +13263,7 @@
         <w:rPr>
           <w:color w:val="C00000"/>
         </w:rPr>
-        <w:t xml:space="preserve">In both batches, the xylanase was applied as a direct dough additive rather than as a separate BSG pre-treatment step: the enzyme was weighed and added to the dry ingredients during mixing, where it acted in situ on the BSG arabinoxylans throughout fermentation until thermally inactivated during baking. Phase 1 used a dosage of 70 ppm of enzyme per kg of flour, applied to unsieved BSG. Phase 2 used a dosage of 120 ppm, applied to the sieved BSG&lt;250 fraction; the higher dosage was selected to match the higher arabinoxylan concentration of the sieved fraction and to compensate for the absence of cellulase activity in Pentopan Mono BG, which does not act on the cellulosic fraction removed by sieving. No separate aqueous pre-incubation of BSG with enzyme was performed in either batch.</w:t>
+        <w:t>In both batches, the xylanase was applied as a direct dough additive rather than as a separate BSG pre-treatment step: the enzyme was weighed and added to the dry ingredients during mixing, where it acted in situ on the BSG arabinoxylans throughout fermentation until thermally inactivated during baking. Phase 1 used a dosage of 70 ppm of enzyme per kg of flour, applied to unsieved BSG. Phase 2 used a dosage of 120 ppm, applied to the sieved BSG&lt;250 fraction; the higher dosage was selected to match the higher arabinoxylan concentration of the sieved fraction and to compensate for the absence of cellulase activity in Pentopan Mono BG, which does not act on the cellulosic fraction removed by sieving. No separate aqueous pre-incubation of BSG with enzyme was performed in either batch.</w:t>
       </w:r>
     </w:p>
     <w:p>
@@ -13252,7 +13271,6 @@
         <w:pStyle w:val="Heading2"/>
       </w:pPr>
       <w:r>
-        <w:lastRenderedPageBreak/>
         <w:t>Bread Formulation and Processing</w:t>
       </w:r>
     </w:p>
@@ -13312,7 +13330,14 @@
         <w:rPr>
           <w:color w:val="C00000"/>
         </w:rPr>
-        <w:t xml:space="preserve">All bread formulations were produced on a 250 g wheat-flour basis. Phase 1 produced five formulations: F1, control (100% wheat flour); F2, 10% unsieved BSG; F3, 20% unsieved BSG; F4, 10% unsieved BSG with 70 ppm xylanase; and F5, 20% unsieved BSG with 70 ppm xylanase. Phase 2 produced three additional formulations: F6, control (100% wheat flour, repeated for direct comparability); F7, 10% sieved BSG (BSG&lt;250); and F8, 10% sieved BSG (BSG&lt;250) with 120 ppm xylanase. Each formulation contained 250 g of flour (or flour + BSG mixture), 10 g of compressed yeast, 5 g of salt and 2.5 g of sugar. The amount of water added was adjusted to achieve adequate dough development and increased progressively with BSG inclusion and enzyme dosage: 162 mL for the control, 165–180 mL for the 10–20% BSG formulations without enzyme, and 175–190 mL for the corresponding enzyme-treated formulations. Mixing, fermentation and baking were performed identically in both batches: [to be completed: specify mixer model, mixing time and speed; proofing temperature, relative humidity and duration; oven type, baking temperature and baking time].</w:t>
+        <w:t xml:space="preserve">All bread formulations were produced on a 250 g wheat-flour basis. Phase 1 produced five formulations: F1, control (100% wheat flour); F2, 10% unsieved BSG; F3, 20% unsieved BSG; F4, 10% unsieved BSG with 70 ppm xylanase; and F5, 20% unsieved BSG with 70 ppm xylanase. Phase 2 produced three additional formulations: F6, control (100% wheat flour, repeated for direct comparability); F7, 10% sieved BSG (BSG&lt;250); and F8, 10% sieved BSG (BSG&lt;250) with 120 ppm xylanase. Each formulation contained 250 g of flour (or flour + BSG </w:t>
+      </w:r>
+      <w:r>
+        <w:rPr>
+          <w:color w:val="C00000"/>
+        </w:rPr>
+        <w:lastRenderedPageBreak/>
+        <w:t>mixture), 10 g of compressed yeast, 5 g of salt and 2.5 g of sugar. The amount of water added was adjusted to achieve adequate dough development and increased progressively with BSG inclusion and enzyme dosage: 162 mL for the control, 165–180 mL for the 10–20% BSG formulations without enzyme, and 175–190 mL for the corresponding enzyme-treated formulations. Mixing, fermentation and baking were performed identically in both batches: [to be completed: specify mixer model, mixing time and speed; proofing temperature, relative humidity and duration; oven type, baking temperature and baking time].</w:t>
       </w:r>
     </w:p>
     <w:p>
@@ -14078,7 +14103,8 @@
         <w:rPr>
           <w:color w:val="C00000"/>
         </w:rPr>
-        <w:t xml:space="preserve">Sensory Evaluation</w:t>
+        <w:lastRenderedPageBreak/>
+        <w:t>Sensory Evaluation</w:t>
       </w:r>
     </w:p>
     <w:p>
@@ -14086,7 +14112,7 @@
         <w:rPr>
           <w:color w:val="C00000"/>
         </w:rPr>
-        <w:t xml:space="preserve">Sensory evaluation was performed on all bread samples by the same panel of eight trained assessors, in accordance with the laboratory's standard bread evaluation protocol. Each sample was scored on five attributes using a 1–5 ordinal scale (1 = unacceptable, 5 = excellent): (i) bread overall appearance and shape, (ii) surface of the crust, (iii) proofing and appearance of the crumb, (iv) structure and elasticity of the crumb, and (v) overall smell and taste. The five attribute scores were combined into a single overall score using a fixed weighting scheme that reflects the relative importance of each attribute for bread quality: weights 1, 2, 4, 4 and 9 respectively, giving a maximum possible overall score of 100 points. Sessions were conducted under standardised conditions, and all formulations of a given batch were evaluated by each panellist within the same session. The Phase 1 samples scored were the control, 10% BSG, 20% BSG, 10% BSG with 70 ppm xylanase and 20% BSG with 70 ppm xylanase. Phase 2 samples (F6–F8) were evaluated by the same panel using the same protocol; their compositional analyses are pending and will be reported alongside the Phase 1 chemical results once completed.</w:t>
+        <w:t>Sensory evaluation was performed on all bread samples by the same panel of eight trained assessors, in accordance with the laboratory's standard bread evaluation protocol. Each sample was scored on five attributes using a 1–5 ordinal scale (1 = unacceptable, 5 = excellent): (i) bread overall appearance and shape, (ii) surface of the crust, (iii) proofing and appearance of the crumb, (iv) structure and elasticity of the crumb, and (v) overall smell and taste. The five attribute scores were combined into a single overall score using a fixed weighting scheme that reflects the relative importance of each attribute for bread quality: weights 1, 2, 4, 4 and 9 respectively, giving a maximum possible overall score of 100 points. Sessions were conducted under standardised conditions, and all formulations of a given batch were evaluated by each panellist within the same session. The Phase 1 samples scored were the control, 10% BSG, 20% BSG, 10% BSG with 70 ppm xylanase and 20% BSG with 70 ppm xylanase. Phase 2 samples (F6–F8) were evaluated by the same panel using the same protocol; their compositional analyses are pending and will be reported alongside the Phase 1 chemical results once completed.</w:t>
       </w:r>
     </w:p>
     <w:p>
@@ -14132,7 +14158,6 @@
               <w:spacing w:after="200" w:line="276" w:lineRule="auto"/>
             </w:pPr>
             <w:r>
-              <w:lastRenderedPageBreak/>
               <w:t>N </w:t>
             </w:r>
           </w:p>
@@ -14544,7 +14569,8 @@
         <w:rPr>
           <w:color w:val="C00000"/>
         </w:rPr>
-        <w:t xml:space="preserve">Crumb Structure: Texture Profile and Digital Image Analysis</w:t>
+        <w:lastRenderedPageBreak/>
+        <w:t>Crumb Structure: Texture Profile and Digital Image Analysis</w:t>
       </w:r>
     </w:p>
     <w:p>
@@ -14552,7 +14578,7 @@
         <w:rPr>
           <w:color w:val="C00000"/>
         </w:rPr>
-        <w:t xml:space="preserve">Two complementary techniques were used to characterise the structure of the bread crumb, both introduced in Phase 2 and applied retroactively to archived Phase 1 photographs where possible. Texture profile analysis (TPA) was performed on 25-mm-thick crumb slices using a [to be completed: texture analyser model] under a double-compression protocol [to be completed: probe diameter, compression depth, crosshead speed, hold time], reporting hardness, springiness, cohesiveness, chewiness and resilience. Digital image analysis (DIA) of bread cross-sections was performed in BreadScan, the in-house DIA application developed for this thesis (bread_porosity_analyzer.html). The full processing pipeline (preprocessing parameters, thresholding strategy, structuring elements and metric formulas) is documented in the Annex at the end of this document. Reported metrics include 2D porosity (void fraction), cell density, mean cell area, cell uniformity, wall thickness and macro-pore fraction. Phase 1 photographs were re-analysed retroactively using the same pipeline applied to Phase 2 images, so that crumb structure can be compared across the two batches on a common basis without additional baking.</w:t>
+        <w:t>Two complementary techniques were used to characterise the structure of the bread crumb, both introduced in Phase 2 and applied retroactively to archived Phase 1 photographs where possible. Texture profile analysis (TPA) was performed on 25-mm-thick crumb slices using a [to be completed: texture analyser model] under a double-compression protocol [to be completed: probe diameter, compression depth, crosshead speed, hold time], reporting hardness, springiness, cohesiveness, chewiness and resilience. Digital image analysis (DIA) of bread cross-sections was performed in BreadScan, the in-house DIA application developed for this thesis (bread_porosity_analyzer.html). The full processing pipeline (preprocessing parameters, thresholding strategy, structuring elements and metric formulas) is documented in the Annex at the end of this document. Reported metrics include 2D porosity (void fraction), cell density, mean cell area, cell uniformity, wall thickness and macro-pore fraction. Phase 1 photographs were re-analysed retroactively using the same pipeline applied to Phase 2 images, so that crumb structure can be compared across the two batches on a common basis without additional baking.</w:t>
       </w:r>
     </w:p>
     <w:p>
@@ -14578,11 +14604,7 @@
     </w:p>
     <w:p>
       <w:r>
-        <w:t xml:space="preserve">Raw crumb images often suffer from uneven illumination, noise and low contrast between the solid matrix and gas cells. The preprocessing pipeline begins with conversion to grayscale using luminance-weighted channel combination (ITU-R BT.601: Y = 0.299R + 0.587G + 0.114B), followed by Gaussian blurring to suppress high-frequency noise while preserving pore boundaries. A critical enhancement step is Contrast-Limited Adaptive Histogram Equalisation (CLAHE), which operates on local tile regions rather than the entire image, computing a clipped histogram equalisation per tile and interpolating across boundaries using bilinear interpolation. This corrects spatial variations in brightness without amplifying noise (Pizer, et al., 1987). For BSG-enriched breads, however, the brown pigmentation reduces luminance contrast between cell walls and pore interiors, and CLAHE flattens the intensity histogram, destroying the peak that represents the dominant crumb matrix colour. The solution is a bread-type-specific pipeline: CLAHE is applied for white bread analysis, but </w:t>
-      </w:r>
-      <w:r>
-        <w:lastRenderedPageBreak/>
-        <w:t>bypassed for BSG/dark bread where the threshold is computed on the raw grayscale to preserve the native histogram structure (Bosakova-Ardenska &amp; Danev, 2015).</w:t>
+        <w:t>Raw crumb images often suffer from uneven illumination, noise and low contrast between the solid matrix and gas cells. The preprocessing pipeline begins with conversion to grayscale using luminance-weighted channel combination (ITU-R BT.601: Y = 0.299R + 0.587G + 0.114B), followed by Gaussian blurring to suppress high-frequency noise while preserving pore boundaries. A critical enhancement step is Contrast-Limited Adaptive Histogram Equalisation (CLAHE), which operates on local tile regions rather than the entire image, computing a clipped histogram equalisation per tile and interpolating across boundaries using bilinear interpolation. This corrects spatial variations in brightness without amplifying noise (Pizer, et al., 1987). For BSG-enriched breads, however, the brown pigmentation reduces luminance contrast between cell walls and pore interiors, and CLAHE flattens the intensity histogram, destroying the peak that represents the dominant crumb matrix colour. The solution is a bread-type-specific pipeline: CLAHE is applied for white bread analysis, but bypassed for BSG/dark bread where the threshold is computed on the raw grayscale to preserve the native histogram structure (Bosakova-Ardenska &amp; Danev, 2015).</w:t>
       </w:r>
     </w:p>
     <w:p>
@@ -14590,6 +14612,7 @@
         <w:pStyle w:val="Heading3"/>
       </w:pPr>
       <w:r>
+        <w:lastRenderedPageBreak/>
         <w:t>Comparison of thresholding algorithms (Gonzales-Barron &amp; Butler, 2006)</w:t>
       </w:r>
     </w:p>
@@ -14634,11 +14657,7 @@
     </w:p>
     <w:p>
       <w:r>
-        <w:t xml:space="preserve">Once individual cells have been identified and size-filtered, a suite of quantitative metrics can be computed. Void Fraction (2D Porosity) is the ratio of total pore area to total image area, reflecting overall gas retention. Values for white bread typically range from 25–45% in flatbed scans, while BSG breads show reduced porosity (15–35%) (Zghal, Scanlon, &amp; Sapirstein, 1999) (Gonzales-Barron &amp; Butler, 2006). Cell Density (cells/cm²) indicates crumb fineness, with higher values reflecting more numerous, smaller pores (Scanlon &amp; Zghal, 2001). Mean Cell Area reflects coarseness. Cell Uniformity, quantified as 1 minus the coefficient of variation of cell areas, measures pore size regularity and is one of the most sensitive metrics to threshold selection (Gonzales-Barron &amp; Butler, 2006). Wall Thickness, </w:t>
-      </w:r>
-      <w:r>
-        <w:lastRenderedPageBreak/>
-        <w:t>estimated as WT = √(A_solid / N_cells), indicates crumb matrix density. Macro Pore Fraction captures the percentage of area occupied by cells exceeding a coarseness threshold, indicating gas cell coalescence.</w:t>
+        <w:t>Once individual cells have been identified and size-filtered, a suite of quantitative metrics can be computed. Void Fraction (2D Porosity) is the ratio of total pore area to total image area, reflecting overall gas retention. Values for white bread typically range from 25–45% in flatbed scans, while BSG breads show reduced porosity (15–35%) (Zghal, Scanlon, &amp; Sapirstein, 1999) (Gonzales-Barron &amp; Butler, 2006). Cell Density (cells/cm²) indicates crumb fineness, with higher values reflecting more numerous, smaller pores (Scanlon &amp; Zghal, 2001). Mean Cell Area reflects coarseness. Cell Uniformity, quantified as 1 minus the coefficient of variation of cell areas, measures pore size regularity and is one of the most sensitive metrics to threshold selection (Gonzales-Barron &amp; Butler, 2006). Wall Thickness, estimated as WT = √(A_solid / N_cells), indicates crumb matrix density. Macro Pore Fraction captures the percentage of area occupied by cells exceeding a coarseness threshold, indicating gas cell coalescence.</w:t>
       </w:r>
     </w:p>
     <w:sectPr>
@@ -16499,6 +16518,7 @@
   <w:style w:type="character" w:default="1" w:styleId="DefaultParagraphFont">
     <w:name w:val="Default Paragraph Font"/>
     <w:uiPriority w:val="1"/>
+    <w:semiHidden/>
     <w:unhideWhenUsed/>
   </w:style>
   <w:style w:type="table" w:default="1" w:styleId="TableNormal">

</xml_diff>

<commit_message>
Update R&D citations/tables and Literature Review; convert overview photos to JPG
- Results & Discussion: continuous-safe table numbering and citation
  standardization/re-links
- Update Literature Review and CITATIONS_TO_VERIFY notes
- Convert Bread_pictures_overview from HEIC to JPG

Co-Authored-By: Claude Opus 4.8 <noreply@anthropic.com>
</commit_message>
<xml_diff>
--- a/02_Proposal/Literature_Review_BSG_Thesis_03.docx
+++ b/02_Proposal/Literature_Review_BSG_Thesis_03.docx
@@ -54,7 +54,13 @@
         <w:t xml:space="preserve">separation, </w:t>
       </w:r>
       <w:r>
-        <w:t>fermentation, conditioning, and packaging</w:t>
+        <w:t xml:space="preserve">fermentation, </w:t>
+      </w:r>
+      <w:r>
+        <w:t>stabilization</w:t>
+      </w:r>
+      <w:r>
+        <w:t>, and packaging</w:t>
       </w:r>
       <w:r>
         <w:t xml:space="preserve"> </w:t>
@@ -273,7 +279,14 @@
           <w:b/>
           <w:bCs/>
         </w:rPr>
-        <w:t>conditioning and filtration</w:t>
+        <w:t>stabilization</w:t>
+      </w:r>
+      <w:r>
+        <w:rPr>
+          <w:b/>
+          <w:bCs/>
+        </w:rPr>
+        <w:t xml:space="preserve"> and filtration</w:t>
       </w:r>
       <w:r>
         <w:t>, remove remaining solids and ensure beer stability and clarity before packaging</w:t>
@@ -12989,1676 +13002,6 @@
       <w:pPr>
         <w:jc w:val="left"/>
       </w:pPr>
-      <w:r>
-        <w:br w:type="page"/>
-      </w:r>
-    </w:p>
-    <w:p>
-      <w:pPr>
-        <w:pStyle w:val="Heading1"/>
-      </w:pPr>
-      <w:commentRangeStart w:id="1"/>
-      <w:r>
-        <w:lastRenderedPageBreak/>
-        <w:t>Experimental Methodology</w:t>
-      </w:r>
-      <w:commentRangeEnd w:id="1"/>
-      <w:r>
-        <w:rPr>
-          <w:rStyle w:val="CommentReference"/>
-          <w:sz w:val="28"/>
-          <w:szCs w:val="28"/>
-        </w:rPr>
-        <w:commentReference w:id="1"/>
-      </w:r>
-    </w:p>
-    <w:p>
-      <w:pPr>
-        <w:pStyle w:val="Heading2"/>
-      </w:pPr>
-      <w:r>
-        <w:t>Overview and Research Approach</w:t>
-      </w:r>
-    </w:p>
-    <w:p>
-      <w:r>
-        <w:rPr>
-          <w:strike/>
-          <w:color w:val="C00000"/>
-        </w:rPr>
-        <w:t>The experimental phase of this thesis aims to evaluate how xylanase enzymatic pre-treatment influences the techno-functional behavior of brewer’s spent grain (BSG) when incorporated into wheat-based bread formulations. This stage addresses the limitations identified in the literature, such as reduced loaf volume, increased crumb firmness, and weakened gluten network, by assessing whether enzymatic modification can improve hydration, dough structure, and baking performance.</w:t>
-      </w:r>
-    </w:p>
-    <w:p>
-      <w:r>
-        <w:rPr>
-          <w:color w:val="C00000"/>
-        </w:rPr>
-        <w:t>The experimental work of this thesis was carried out in two consecutive batches. The first batch (Phase 1) evaluated the effect of direct xylanase addition (Pentopan Mono BG, 70 ppm on flour basis) on the techno-functional behaviour of unsieved brewer's spent grain (BSG) when incorporated into wheat-based bread at 0%, 10% and 20% flour substitution levels. The second batch (Phase 2) refined this approach by introducing two combined modifications: (i) the dried BSG was sieved to retain only the fraction below 250 µm, removing coarse husk- and pericarp-rich particles that disrupt the gluten network without contributing arabinoxylan to xylanase activity, and (ii) the xylanase dosage was raised to 120 ppm to match the higher arabinoxylan concentration of the sieved fraction. Phase 2 also incorporated two analytical extensions not used in Phase 1: instrumental texture profile analysis (TPA) on the bread crumb and digital image analysis (DIA) of the crumb cross-section. Both batches used the same wheat-flour control, baking protocol and trained sensory panel, so that they can be compared on a common basis.</w:t>
-      </w:r>
-    </w:p>
-    <w:p>
-      <w:pPr>
-        <w:pStyle w:val="Heading2"/>
-      </w:pPr>
-      <w:r>
-        <w:t>Raw Material Preparation and Characterization</w:t>
-      </w:r>
-    </w:p>
-    <w:p>
-      <w:pPr>
-        <w:pStyle w:val="Heading3"/>
-      </w:pPr>
-      <w:r>
-        <w:t>Brewer’s Spent Grain (BSG)</w:t>
-      </w:r>
-    </w:p>
-    <w:p>
-      <w:r>
-        <w:rPr>
-          <w:strike/>
-          <w:color w:val="C00000"/>
-        </w:rPr>
-        <w:t>The BSG will be obtained from [</w:t>
-      </w:r>
-      <w:r>
-        <w:rPr>
-          <w:strike/>
-          <w:color w:val="C00000"/>
-          <w:highlight w:val="yellow"/>
-        </w:rPr>
-        <w:t>to be completed: specify brewery source and collection protocol</w:t>
-      </w:r>
-      <w:r>
-        <w:rPr>
-          <w:strike/>
-          <w:color w:val="C00000"/>
-        </w:rPr>
-        <w:t>]. The barley malt variety used for mashing will be [</w:t>
-      </w:r>
-      <w:r>
-        <w:rPr>
-          <w:strike/>
-          <w:color w:val="C00000"/>
-          <w:highlight w:val="yellow"/>
-        </w:rPr>
-        <w:t>to be completed: indicate the malt variety</w:t>
-      </w:r>
-      <w:r>
-        <w:rPr>
-          <w:strike/>
-          <w:color w:val="C00000"/>
-        </w:rPr>
-        <w:t>]. Immediately after collection, the wet BSG will be refrigerated at 4 °C and then dried [</w:t>
-      </w:r>
-      <w:r>
-        <w:rPr>
-          <w:strike/>
-          <w:color w:val="C00000"/>
-          <w:highlight w:val="yellow"/>
-        </w:rPr>
-        <w:t>to be completed: specify drying temperature, duration, and equipment</w:t>
-      </w:r>
-      <w:r>
-        <w:rPr>
-          <w:strike/>
-          <w:color w:val="C00000"/>
-        </w:rPr>
-        <w:t xml:space="preserve">] until reaching a stable moisture content suitable for storage. The dried material will be milled to a uniform particle size </w:t>
-      </w:r>
-      <w:r>
-        <w:rPr>
-          <w:strike/>
-          <w:color w:val="C00000"/>
-          <w:highlight w:val="yellow"/>
-        </w:rPr>
-        <w:t>(≤ 0.5 mm)</w:t>
-      </w:r>
-      <w:r>
-        <w:rPr>
-          <w:strike/>
-          <w:color w:val="C00000"/>
-        </w:rPr>
-        <w:t xml:space="preserve"> and stored in sealed polyethylene bags at ambient temperature until use.</w:t>
-      </w:r>
-    </w:p>
-    <w:p>
-      <w:r>
-        <w:rPr>
-          <w:color w:val="C00000"/>
-        </w:rPr>
-        <w:t xml:space="preserve">The brewer's spent grain used in this study was obtained from [to be completed: brewery source and collection protocol] from a barley malt batch of variety [to be completed: malt variety]. Immediately after collection, the wet BSG (~80% moisture) was refrigerated at 4 °C until further processing, then dried [to be completed: drying temperature, duration and equipment] to a stable storage moisture; the residual moisture content of the dried material used in this study was 4.93 ± 0.03% (Phase 1 raw-material </w:t>
-      </w:r>
-      <w:r>
-        <w:rPr>
-          <w:color w:val="C00000"/>
-        </w:rPr>
-        <w:t>characterization</w:t>
-      </w:r>
-      <w:r>
-        <w:rPr>
-          <w:color w:val="C00000"/>
-        </w:rPr>
-        <w:t xml:space="preserve">). The dried BSG was milled to a uniform particle size below 0.5 mm and stored in sealed polyethylene bags at room temperature until use. For Phase 2, an additional fractionation step was introduced: the </w:t>
-      </w:r>
-      <w:r>
-        <w:rPr>
-          <w:color w:val="C00000"/>
-        </w:rPr>
-        <w:lastRenderedPageBreak/>
-        <w:t>dried, milled BSG was sieved through a 250 µm mesh, and only the fraction passing through the sieve (referred to as BSG&lt;250) was retained for incorporation into the dough.</w:t>
-      </w:r>
-    </w:p>
-    <w:p>
-      <w:pPr>
-        <w:pStyle w:val="Heading3"/>
-      </w:pPr>
-      <w:r>
-        <w:t>Baseline Composition</w:t>
-      </w:r>
-    </w:p>
-    <w:p>
-      <w:r>
-        <w:t>The baseline composition of the BSG will be determined according to standard AOAC (2019) procedures, including:</w:t>
-      </w:r>
-    </w:p>
-    <w:p>
-      <w:pPr>
-        <w:numPr>
-          <w:ilvl w:val="0"/>
-          <w:numId w:val="16"/>
-        </w:numPr>
-      </w:pPr>
-      <w:r>
-        <w:t>Moisture content (%) by oven drying to constant weight (AOAC 925.10)</w:t>
-      </w:r>
-    </w:p>
-    <w:p>
-      <w:pPr>
-        <w:numPr>
-          <w:ilvl w:val="0"/>
-          <w:numId w:val="16"/>
-        </w:numPr>
-      </w:pPr>
-      <w:r>
-        <w:t>Ash (%) by gravimetric determination after incineration at 550 °C (AOAC 923.03)</w:t>
-      </w:r>
-    </w:p>
-    <w:p>
-      <w:pPr>
-        <w:numPr>
-          <w:ilvl w:val="0"/>
-          <w:numId w:val="16"/>
-        </w:numPr>
-      </w:pPr>
-      <w:r>
-        <w:t>Crude protein (%) by the Kjeldahl method (N × 6.25; AOAC 979.09)</w:t>
-      </w:r>
-    </w:p>
-    <w:p>
-      <w:pPr>
-        <w:numPr>
-          <w:ilvl w:val="0"/>
-          <w:numId w:val="16"/>
-        </w:numPr>
-      </w:pPr>
-      <w:r>
-        <w:t>Wet gluten (%) by manual washing (AACC 38-12.02)</w:t>
-      </w:r>
-    </w:p>
-    <w:p>
-      <w:pPr>
-        <w:pStyle w:val="Heading2"/>
-      </w:pPr>
-      <w:r>
-        <w:t>Enzymatic Pre-treatment</w:t>
-      </w:r>
-    </w:p>
-    <w:p>
-      <w:r>
-        <w:t>The enzymatic pre-treatment will be performed using Pentopan Mono BG (Novozymes), a commercial xylanase preparation derived from Aspergillus oryzae characterized by endo-β-(1,4)-xylanase activity belonging to glycoside hydrolase family GH11.</w:t>
-      </w:r>
-    </w:p>
-    <w:p>
-      <w:r>
-        <w:rPr>
-          <w:strike/>
-          <w:color w:val="C00000"/>
-        </w:rPr>
-        <w:t>A target dosage of 70 ppm will be applied [</w:t>
-      </w:r>
-      <w:r>
-        <w:rPr>
-          <w:strike/>
-          <w:color w:val="C00000"/>
-          <w:highlight w:val="yellow"/>
-        </w:rPr>
-        <w:t>to be completed: confirm dosage</w:t>
-      </w:r>
-      <w:r>
-        <w:rPr>
-          <w:strike/>
-          <w:color w:val="C00000"/>
-        </w:rPr>
-        <w:t>]. The treatment procedure, including pH, buffer type, solid-to-liquid ratio, temperature, and incubation time, will be [</w:t>
-      </w:r>
-      <w:r>
-        <w:rPr>
-          <w:strike/>
-          <w:color w:val="C00000"/>
-          <w:highlight w:val="yellow"/>
-        </w:rPr>
-        <w:t>to be completed: define experimental conditions</w:t>
-      </w:r>
-      <w:r>
-        <w:rPr>
-          <w:strike/>
-          <w:color w:val="C00000"/>
-        </w:rPr>
-        <w:t>]. Following enzymatic action, the BSG will be dried and stored prior to its inclusion in bread formulations.</w:t>
-      </w:r>
-    </w:p>
-    <w:p>
-      <w:r>
-        <w:rPr>
-          <w:color w:val="C00000"/>
-        </w:rPr>
-        <w:t>In both batches, the xylanase was applied as a direct dough additive rather than as a separate BSG pre-treatment step: the enzyme was weighed and added to the dry ingredients during mixing, where it acted in situ on the BSG arabinoxylans throughout fermentation until thermally inactivated during baking. Phase 1 used a dosage of 70 ppm of enzyme per kg of flour, applied to unsieved BSG. Phase 2 used a dosage of 120 ppm, applied to the sieved BSG&lt;250 fraction; the higher dosage was selected to match the higher arabinoxylan concentration of the sieved fraction and to compensate for the absence of cellulase activity in Pentopan Mono BG, which does not act on the cellulosic fraction removed by sieving. No separate aqueous pre-incubation of BSG with enzyme was performed in either batch.</w:t>
-      </w:r>
-    </w:p>
-    <w:p>
-      <w:pPr>
-        <w:pStyle w:val="Heading2"/>
-      </w:pPr>
-      <w:r>
-        <w:t>Bread Formulation and Processing</w:t>
-      </w:r>
-    </w:p>
-    <w:p>
-      <w:r>
-        <w:rPr>
-          <w:strike/>
-          <w:color w:val="C00000"/>
-        </w:rPr>
-        <w:t>Three bread formulations will be developed, containing 0</w:t>
-      </w:r>
-      <w:r>
-        <w:rPr>
-          <w:strike/>
-          <w:color w:val="C00000"/>
-        </w:rPr>
-        <w:t>%</w:t>
-      </w:r>
-      <w:r>
-        <w:rPr>
-          <w:strike/>
-          <w:color w:val="C00000"/>
-        </w:rPr>
-        <w:t>, 10</w:t>
-      </w:r>
-      <w:r>
-        <w:rPr>
-          <w:strike/>
-          <w:color w:val="C00000"/>
-        </w:rPr>
-        <w:t>%</w:t>
-      </w:r>
-      <w:r>
-        <w:rPr>
-          <w:strike/>
-          <w:color w:val="C00000"/>
-        </w:rPr>
-        <w:t>, and 20</w:t>
-      </w:r>
-      <w:r>
-        <w:rPr>
-          <w:strike/>
-          <w:color w:val="C00000"/>
-        </w:rPr>
-        <w:t>%</w:t>
-      </w:r>
-      <w:r>
-        <w:rPr>
-          <w:strike/>
-          <w:color w:val="C00000"/>
-        </w:rPr>
-        <w:t xml:space="preserve"> BSG on flour basis. Each formulation will be prepared in two variants: one incorporating raw BSG and one incorporating enzymatically pretreated BSG.</w:t>
-      </w:r>
-    </w:p>
-    <w:p>
-      <w:r>
-        <w:rPr>
-          <w:color w:val="C00000"/>
-        </w:rPr>
-        <w:t xml:space="preserve">All bread formulations were produced on a 250 g wheat-flour basis. Phase 1 produced five formulations: F1, control (100% wheat flour); F2, 10% unsieved BSG; F3, 20% unsieved BSG; F4, 10% unsieved BSG with 70 ppm xylanase; and F5, 20% unsieved BSG with 70 ppm xylanase. Phase 2 produced three additional formulations: F6, control (100% wheat flour, repeated for direct comparability); F7, 10% sieved BSG (BSG&lt;250); and F8, 10% sieved BSG (BSG&lt;250) with 120 ppm xylanase. Each formulation contained 250 g of flour (or flour + BSG </w:t>
-      </w:r>
-      <w:r>
-        <w:rPr>
-          <w:color w:val="C00000"/>
-        </w:rPr>
-        <w:lastRenderedPageBreak/>
-        <w:t>mixture), 10 g of compressed yeast, 5 g of salt and 2.5 g of sugar. The amount of water added was adjusted to achieve adequate dough development and increased progressively with BSG inclusion and enzyme dosage: 162 mL for the control, 165–180 mL for the 10–20% BSG formulations without enzyme, and 175–190 mL for the corresponding enzyme-treated formulations. Mixing, fermentation and baking were performed identically in both batches: [to be completed: specify mixer model, mixing time and speed; proofing temperature, relative humidity and duration; oven type, baking temperature and baking time].</w:t>
-      </w:r>
-    </w:p>
-    <w:p>
-      <w:r>
-        <w:rPr>
-          <w:strike/>
-          <w:color w:val="C00000"/>
-        </w:rPr>
-        <w:t>The formulation ingredients (flour, yeast, water, salt, sugar, and fat proportions) and the processing conditions (mixing time, proofing conditions, and baking temperature and time) will be [</w:t>
-      </w:r>
-      <w:r>
-        <w:rPr>
-          <w:strike/>
-          <w:color w:val="C00000"/>
-          <w:highlight w:val="yellow"/>
-        </w:rPr>
-        <w:t>to be completed: specify formulation and process details</w:t>
-      </w:r>
-      <w:r>
-        <w:rPr>
-          <w:strike/>
-          <w:color w:val="C00000"/>
-        </w:rPr>
-        <w:t>].</w:t>
-      </w:r>
-    </w:p>
-    <w:tbl>
-      <w:tblPr>
-        <w:tblStyle w:val="GridTable1Light-Accent1"/>
-        <w:tblW w:w="0" w:type="auto"/>
-        <w:jc w:val="center"/>
-        <w:tblLook w:val="04A0" w:firstRow="1" w:lastRow="0" w:firstColumn="1" w:lastColumn="0" w:noHBand="0" w:noVBand="1"/>
-      </w:tblPr>
-      <w:tblGrid>
-        <w:gridCol w:w="2033"/>
-        <w:gridCol w:w="2151"/>
-        <w:gridCol w:w="2046"/>
-      </w:tblGrid>
-      <w:tr>
-        <w:trPr>
-          <w:cnfStyle w:val="100000000000" w:firstRow="1" w:lastRow="0" w:firstColumn="0" w:lastColumn="0" w:oddVBand="0" w:evenVBand="0" w:oddHBand="0" w:evenHBand="0" w:firstRowFirstColumn="0" w:firstRowLastColumn="0" w:lastRowFirstColumn="0" w:lastRowLastColumn="0"/>
-          <w:jc w:val="center"/>
-        </w:trPr>
-        <w:tc>
-          <w:tcPr>
-            <w:cnfStyle w:val="001000000000" w:firstRow="0" w:lastRow="0" w:firstColumn="1" w:lastColumn="0" w:oddVBand="0" w:evenVBand="0" w:oddHBand="0" w:evenHBand="0" w:firstRowFirstColumn="0" w:firstRowLastColumn="0" w:lastRowFirstColumn="0" w:lastRowLastColumn="0"/>
-            <w:tcW w:w="0" w:type="auto"/>
-            <w:hideMark/>
-          </w:tcPr>
-          <w:p>
-            <w:pPr>
-              <w:spacing w:after="200" w:line="276" w:lineRule="auto"/>
-            </w:pPr>
-            <w:r>
-              <w:t>Formulation Code</w:t>
-            </w:r>
-          </w:p>
-        </w:tc>
-        <w:tc>
-          <w:tcPr>
-            <w:tcW w:w="0" w:type="auto"/>
-            <w:hideMark/>
-          </w:tcPr>
-          <w:p>
-            <w:pPr>
-              <w:spacing w:after="200" w:line="276" w:lineRule="auto"/>
-              <w:cnfStyle w:val="100000000000" w:firstRow="1" w:lastRow="0" w:firstColumn="0" w:lastColumn="0" w:oddVBand="0" w:evenVBand="0" w:oddHBand="0" w:evenHBand="0" w:firstRowFirstColumn="0" w:firstRowLastColumn="0" w:lastRowFirstColumn="0" w:lastRowLastColumn="0"/>
-            </w:pPr>
-            <w:r>
-              <w:t>BSG Treatment</w:t>
-            </w:r>
-          </w:p>
-        </w:tc>
-        <w:tc>
-          <w:tcPr>
-            <w:tcW w:w="0" w:type="auto"/>
-            <w:hideMark/>
-          </w:tcPr>
-          <w:p>
-            <w:pPr>
-              <w:spacing w:after="200" w:line="276" w:lineRule="auto"/>
-              <w:cnfStyle w:val="100000000000" w:firstRow="1" w:lastRow="0" w:firstColumn="0" w:lastColumn="0" w:oddVBand="0" w:evenVBand="0" w:oddHBand="0" w:evenHBand="0" w:firstRowFirstColumn="0" w:firstRowLastColumn="0" w:lastRowFirstColumn="0" w:lastRowLastColumn="0"/>
-            </w:pPr>
-            <w:r>
-              <w:t>BSG Inclusion (%)</w:t>
-            </w:r>
-          </w:p>
-        </w:tc>
-      </w:tr>
-      <w:tr>
-        <w:trPr>
-          <w:jc w:val="center"/>
-        </w:trPr>
-        <w:tc>
-          <w:tcPr>
-            <w:cnfStyle w:val="001000000000" w:firstRow="0" w:lastRow="0" w:firstColumn="1" w:lastColumn="0" w:oddVBand="0" w:evenVBand="0" w:oddHBand="0" w:evenHBand="0" w:firstRowFirstColumn="0" w:firstRowLastColumn="0" w:lastRowFirstColumn="0" w:lastRowLastColumn="0"/>
-            <w:tcW w:w="0" w:type="auto"/>
-            <w:hideMark/>
-          </w:tcPr>
-          <w:p>
-            <w:pPr>
-              <w:spacing w:after="200" w:line="276" w:lineRule="auto"/>
-            </w:pPr>
-            <w:r>
-              <w:t>F1</w:t>
-            </w:r>
-          </w:p>
-        </w:tc>
-        <w:tc>
-          <w:tcPr>
-            <w:tcW w:w="0" w:type="auto"/>
-            <w:hideMark/>
-          </w:tcPr>
-          <w:p>
-            <w:pPr>
-              <w:spacing w:after="200" w:line="276" w:lineRule="auto"/>
-              <w:cnfStyle w:val="000000000000" w:firstRow="0" w:lastRow="0" w:firstColumn="0" w:lastColumn="0" w:oddVBand="0" w:evenVBand="0" w:oddHBand="0" w:evenHBand="0" w:firstRowFirstColumn="0" w:firstRowLastColumn="0" w:lastRowFirstColumn="0" w:lastRowLastColumn="0"/>
-            </w:pPr>
-            <w:r>
-              <w:t>None (control)</w:t>
-            </w:r>
-          </w:p>
-        </w:tc>
-        <w:tc>
-          <w:tcPr>
-            <w:tcW w:w="0" w:type="auto"/>
-            <w:hideMark/>
-          </w:tcPr>
-          <w:p>
-            <w:pPr>
-              <w:spacing w:after="200" w:line="276" w:lineRule="auto"/>
-              <w:cnfStyle w:val="000000000000" w:firstRow="0" w:lastRow="0" w:firstColumn="0" w:lastColumn="0" w:oddVBand="0" w:evenVBand="0" w:oddHBand="0" w:evenHBand="0" w:firstRowFirstColumn="0" w:firstRowLastColumn="0" w:lastRowFirstColumn="0" w:lastRowLastColumn="0"/>
-            </w:pPr>
-            <w:r>
-              <w:t>0</w:t>
-            </w:r>
-          </w:p>
-        </w:tc>
-      </w:tr>
-      <w:tr>
-        <w:trPr>
-          <w:jc w:val="center"/>
-        </w:trPr>
-        <w:tc>
-          <w:tcPr>
-            <w:cnfStyle w:val="001000000000" w:firstRow="0" w:lastRow="0" w:firstColumn="1" w:lastColumn="0" w:oddVBand="0" w:evenVBand="0" w:oddHBand="0" w:evenHBand="0" w:firstRowFirstColumn="0" w:firstRowLastColumn="0" w:lastRowFirstColumn="0" w:lastRowLastColumn="0"/>
-            <w:tcW w:w="0" w:type="auto"/>
-            <w:hideMark/>
-          </w:tcPr>
-          <w:p>
-            <w:pPr>
-              <w:spacing w:after="200" w:line="276" w:lineRule="auto"/>
-            </w:pPr>
-            <w:r>
-              <w:t>F2</w:t>
-            </w:r>
-          </w:p>
-        </w:tc>
-        <w:tc>
-          <w:tcPr>
-            <w:tcW w:w="0" w:type="auto"/>
-            <w:hideMark/>
-          </w:tcPr>
-          <w:p>
-            <w:pPr>
-              <w:spacing w:after="200" w:line="276" w:lineRule="auto"/>
-              <w:cnfStyle w:val="000000000000" w:firstRow="0" w:lastRow="0" w:firstColumn="0" w:lastColumn="0" w:oddVBand="0" w:evenVBand="0" w:oddHBand="0" w:evenHBand="0" w:firstRowFirstColumn="0" w:firstRowLastColumn="0" w:lastRowFirstColumn="0" w:lastRowLastColumn="0"/>
-            </w:pPr>
-            <w:r>
-              <w:t>Raw BSG</w:t>
-            </w:r>
-          </w:p>
-        </w:tc>
-        <w:tc>
-          <w:tcPr>
-            <w:tcW w:w="0" w:type="auto"/>
-            <w:hideMark/>
-          </w:tcPr>
-          <w:p>
-            <w:pPr>
-              <w:spacing w:after="200" w:line="276" w:lineRule="auto"/>
-              <w:cnfStyle w:val="000000000000" w:firstRow="0" w:lastRow="0" w:firstColumn="0" w:lastColumn="0" w:oddVBand="0" w:evenVBand="0" w:oddHBand="0" w:evenHBand="0" w:firstRowFirstColumn="0" w:firstRowLastColumn="0" w:lastRowFirstColumn="0" w:lastRowLastColumn="0"/>
-            </w:pPr>
-            <w:r>
-              <w:t>10</w:t>
-            </w:r>
-          </w:p>
-        </w:tc>
-      </w:tr>
-      <w:tr>
-        <w:trPr>
-          <w:jc w:val="center"/>
-        </w:trPr>
-        <w:tc>
-          <w:tcPr>
-            <w:cnfStyle w:val="001000000000" w:firstRow="0" w:lastRow="0" w:firstColumn="1" w:lastColumn="0" w:oddVBand="0" w:evenVBand="0" w:oddHBand="0" w:evenHBand="0" w:firstRowFirstColumn="0" w:firstRowLastColumn="0" w:lastRowFirstColumn="0" w:lastRowLastColumn="0"/>
-            <w:tcW w:w="0" w:type="auto"/>
-            <w:hideMark/>
-          </w:tcPr>
-          <w:p>
-            <w:pPr>
-              <w:spacing w:after="200" w:line="276" w:lineRule="auto"/>
-            </w:pPr>
-            <w:r>
-              <w:t>F3</w:t>
-            </w:r>
-          </w:p>
-        </w:tc>
-        <w:tc>
-          <w:tcPr>
-            <w:tcW w:w="0" w:type="auto"/>
-            <w:hideMark/>
-          </w:tcPr>
-          <w:p>
-            <w:pPr>
-              <w:spacing w:after="200" w:line="276" w:lineRule="auto"/>
-              <w:cnfStyle w:val="000000000000" w:firstRow="0" w:lastRow="0" w:firstColumn="0" w:lastColumn="0" w:oddVBand="0" w:evenVBand="0" w:oddHBand="0" w:evenHBand="0" w:firstRowFirstColumn="0" w:firstRowLastColumn="0" w:lastRowFirstColumn="0" w:lastRowLastColumn="0"/>
-            </w:pPr>
-            <w:r>
-              <w:t>Raw BSG</w:t>
-            </w:r>
-          </w:p>
-        </w:tc>
-        <w:tc>
-          <w:tcPr>
-            <w:tcW w:w="0" w:type="auto"/>
-            <w:hideMark/>
-          </w:tcPr>
-          <w:p>
-            <w:pPr>
-              <w:spacing w:after="200" w:line="276" w:lineRule="auto"/>
-              <w:cnfStyle w:val="000000000000" w:firstRow="0" w:lastRow="0" w:firstColumn="0" w:lastColumn="0" w:oddVBand="0" w:evenVBand="0" w:oddHBand="0" w:evenHBand="0" w:firstRowFirstColumn="0" w:firstRowLastColumn="0" w:lastRowFirstColumn="0" w:lastRowLastColumn="0"/>
-            </w:pPr>
-            <w:r>
-              <w:t>20</w:t>
-            </w:r>
-          </w:p>
-        </w:tc>
-      </w:tr>
-      <w:tr>
-        <w:trPr>
-          <w:jc w:val="center"/>
-        </w:trPr>
-        <w:tc>
-          <w:tcPr>
-            <w:cnfStyle w:val="001000000000" w:firstRow="0" w:lastRow="0" w:firstColumn="1" w:lastColumn="0" w:oddVBand="0" w:evenVBand="0" w:oddHBand="0" w:evenHBand="0" w:firstRowFirstColumn="0" w:firstRowLastColumn="0" w:lastRowFirstColumn="0" w:lastRowLastColumn="0"/>
-            <w:tcW w:w="0" w:type="auto"/>
-            <w:hideMark/>
-          </w:tcPr>
-          <w:p>
-            <w:pPr>
-              <w:spacing w:after="200" w:line="276" w:lineRule="auto"/>
-            </w:pPr>
-            <w:r>
-              <w:t>F4</w:t>
-            </w:r>
-          </w:p>
-        </w:tc>
-        <w:tc>
-          <w:tcPr>
-            <w:tcW w:w="0" w:type="auto"/>
-            <w:hideMark/>
-          </w:tcPr>
-          <w:p>
-            <w:pPr>
-              <w:spacing w:after="200" w:line="276" w:lineRule="auto"/>
-              <w:cnfStyle w:val="000000000000" w:firstRow="0" w:lastRow="0" w:firstColumn="0" w:lastColumn="0" w:oddVBand="0" w:evenVBand="0" w:oddHBand="0" w:evenHBand="0" w:firstRowFirstColumn="0" w:firstRowLastColumn="0" w:lastRowFirstColumn="0" w:lastRowLastColumn="0"/>
-            </w:pPr>
-            <w:r>
-              <w:t>Enzyme-treated BSG</w:t>
-            </w:r>
-          </w:p>
-        </w:tc>
-        <w:tc>
-          <w:tcPr>
-            <w:tcW w:w="0" w:type="auto"/>
-            <w:hideMark/>
-          </w:tcPr>
-          <w:p>
-            <w:pPr>
-              <w:spacing w:after="200" w:line="276" w:lineRule="auto"/>
-              <w:cnfStyle w:val="000000000000" w:firstRow="0" w:lastRow="0" w:firstColumn="0" w:lastColumn="0" w:oddVBand="0" w:evenVBand="0" w:oddHBand="0" w:evenHBand="0" w:firstRowFirstColumn="0" w:firstRowLastColumn="0" w:lastRowFirstColumn="0" w:lastRowLastColumn="0"/>
-            </w:pPr>
-            <w:r>
-              <w:t>10</w:t>
-            </w:r>
-          </w:p>
-        </w:tc>
-      </w:tr>
-      <w:tr>
-        <w:trPr>
-          <w:jc w:val="center"/>
-        </w:trPr>
-        <w:tc>
-          <w:tcPr>
-            <w:cnfStyle w:val="001000000000" w:firstRow="0" w:lastRow="0" w:firstColumn="1" w:lastColumn="0" w:oddVBand="0" w:evenVBand="0" w:oddHBand="0" w:evenHBand="0" w:firstRowFirstColumn="0" w:firstRowLastColumn="0" w:lastRowFirstColumn="0" w:lastRowLastColumn="0"/>
-            <w:tcW w:w="0" w:type="auto"/>
-            <w:hideMark/>
-          </w:tcPr>
-          <w:p>
-            <w:pPr>
-              <w:spacing w:after="200" w:line="276" w:lineRule="auto"/>
-            </w:pPr>
-            <w:r>
-              <w:t>F5</w:t>
-            </w:r>
-          </w:p>
-        </w:tc>
-        <w:tc>
-          <w:tcPr>
-            <w:tcW w:w="0" w:type="auto"/>
-            <w:hideMark/>
-          </w:tcPr>
-          <w:p>
-            <w:pPr>
-              <w:spacing w:after="200" w:line="276" w:lineRule="auto"/>
-              <w:cnfStyle w:val="000000000000" w:firstRow="0" w:lastRow="0" w:firstColumn="0" w:lastColumn="0" w:oddVBand="0" w:evenVBand="0" w:oddHBand="0" w:evenHBand="0" w:firstRowFirstColumn="0" w:firstRowLastColumn="0" w:lastRowFirstColumn="0" w:lastRowLastColumn="0"/>
-            </w:pPr>
-            <w:r>
-              <w:t>Enzyme-treated BSG</w:t>
-            </w:r>
-          </w:p>
-        </w:tc>
-        <w:tc>
-          <w:tcPr>
-            <w:tcW w:w="0" w:type="auto"/>
-            <w:hideMark/>
-          </w:tcPr>
-          <w:p>
-            <w:pPr>
-              <w:spacing w:after="200" w:line="276" w:lineRule="auto"/>
-              <w:cnfStyle w:val="000000000000" w:firstRow="0" w:lastRow="0" w:firstColumn="0" w:lastColumn="0" w:oddVBand="0" w:evenVBand="0" w:oddHBand="0" w:evenHBand="0" w:firstRowFirstColumn="0" w:firstRowLastColumn="0" w:lastRowFirstColumn="0" w:lastRowLastColumn="0"/>
-            </w:pPr>
-            <w:r>
-              <w:t>20</w:t>
-            </w:r>
-          </w:p>
-        </w:tc>
-      </w:tr>
-    </w:tbl>
-    <w:p/>
-    <w:p>
-      <w:pPr>
-        <w:pStyle w:val="Heading2"/>
-      </w:pPr>
-      <w:r>
-        <w:t>Analytical Plan</w:t>
-      </w:r>
-    </w:p>
-    <w:p>
-      <w:pPr>
-        <w:pStyle w:val="Heading3"/>
-      </w:pPr>
-      <w:r>
-        <w:t>Compositional Analysis</w:t>
-      </w:r>
-    </w:p>
-    <w:p>
-      <w:r>
-        <w:t>All samples (</w:t>
-      </w:r>
-      <w:r>
-        <w:t>Flour/Mixture with BSG</w:t>
-      </w:r>
-      <w:r>
-        <w:t>, and breads) will be analyzed according to AOAC standard methods for:</w:t>
-      </w:r>
-    </w:p>
-    <w:tbl>
-      <w:tblPr>
-        <w:tblStyle w:val="GridTable1Light-Accent1"/>
-        <w:tblW w:w="7020" w:type="dxa"/>
-        <w:jc w:val="center"/>
-        <w:tblLook w:val="04A0" w:firstRow="1" w:lastRow="0" w:firstColumn="1" w:lastColumn="0" w:noHBand="0" w:noVBand="1"/>
-      </w:tblPr>
-      <w:tblGrid>
-        <w:gridCol w:w="414"/>
-        <w:gridCol w:w="1947"/>
-        <w:gridCol w:w="2160"/>
-        <w:gridCol w:w="2499"/>
-      </w:tblGrid>
-      <w:tr>
-        <w:trPr>
-          <w:cnfStyle w:val="100000000000" w:firstRow="1" w:lastRow="0" w:firstColumn="0" w:lastColumn="0" w:oddVBand="0" w:evenVBand="0" w:oddHBand="0" w:evenHBand="0" w:firstRowFirstColumn="0" w:firstRowLastColumn="0" w:lastRowFirstColumn="0" w:lastRowLastColumn="0"/>
-          <w:trHeight w:val="300"/>
-          <w:jc w:val="center"/>
-        </w:trPr>
-        <w:tc>
-          <w:tcPr>
-            <w:cnfStyle w:val="001000000000" w:firstRow="0" w:lastRow="0" w:firstColumn="1" w:lastColumn="0" w:oddVBand="0" w:evenVBand="0" w:oddHBand="0" w:evenHBand="0" w:firstRowFirstColumn="0" w:firstRowLastColumn="0" w:lastRowFirstColumn="0" w:lastRowLastColumn="0"/>
-            <w:tcW w:w="414" w:type="dxa"/>
-            <w:hideMark/>
-          </w:tcPr>
-          <w:p>
-            <w:pPr>
-              <w:spacing w:after="200" w:line="276" w:lineRule="auto"/>
-            </w:pPr>
-            <w:r>
-              <w:t>N </w:t>
-            </w:r>
-          </w:p>
-        </w:tc>
-        <w:tc>
-          <w:tcPr>
-            <w:tcW w:w="1947" w:type="dxa"/>
-            <w:hideMark/>
-          </w:tcPr>
-          <w:p>
-            <w:pPr>
-              <w:spacing w:after="200" w:line="276" w:lineRule="auto"/>
-              <w:cnfStyle w:val="100000000000" w:firstRow="1" w:lastRow="0" w:firstColumn="0" w:lastColumn="0" w:oddVBand="0" w:evenVBand="0" w:oddHBand="0" w:evenHBand="0" w:firstRowFirstColumn="0" w:firstRowLastColumn="0" w:lastRowFirstColumn="0" w:lastRowLastColumn="0"/>
-            </w:pPr>
-            <w:r>
-              <w:t>Parameter </w:t>
-            </w:r>
-          </w:p>
-        </w:tc>
-        <w:tc>
-          <w:tcPr>
-            <w:tcW w:w="2160" w:type="dxa"/>
-            <w:hideMark/>
-          </w:tcPr>
-          <w:p>
-            <w:pPr>
-              <w:spacing w:after="200" w:line="276" w:lineRule="auto"/>
-              <w:cnfStyle w:val="100000000000" w:firstRow="1" w:lastRow="0" w:firstColumn="0" w:lastColumn="0" w:oddVBand="0" w:evenVBand="0" w:oddHBand="0" w:evenHBand="0" w:firstRowFirstColumn="0" w:firstRowLastColumn="0" w:lastRowFirstColumn="0" w:lastRowLastColumn="0"/>
-            </w:pPr>
-            <w:r>
-              <w:t>Sample </w:t>
-            </w:r>
-          </w:p>
-        </w:tc>
-        <w:tc>
-          <w:tcPr>
-            <w:tcW w:w="2499" w:type="dxa"/>
-            <w:hideMark/>
-          </w:tcPr>
-          <w:p>
-            <w:pPr>
-              <w:spacing w:after="200" w:line="276" w:lineRule="auto"/>
-              <w:cnfStyle w:val="100000000000" w:firstRow="1" w:lastRow="0" w:firstColumn="0" w:lastColumn="0" w:oddVBand="0" w:evenVBand="0" w:oddHBand="0" w:evenHBand="0" w:firstRowFirstColumn="0" w:firstRowLastColumn="0" w:lastRowFirstColumn="0" w:lastRowLastColumn="0"/>
-            </w:pPr>
-            <w:r>
-              <w:t>Purpose </w:t>
-            </w:r>
-          </w:p>
-        </w:tc>
-      </w:tr>
-      <w:tr>
-        <w:trPr>
-          <w:trHeight w:val="300"/>
-          <w:jc w:val="center"/>
-        </w:trPr>
-        <w:tc>
-          <w:tcPr>
-            <w:cnfStyle w:val="001000000000" w:firstRow="0" w:lastRow="0" w:firstColumn="1" w:lastColumn="0" w:oddVBand="0" w:evenVBand="0" w:oddHBand="0" w:evenHBand="0" w:firstRowFirstColumn="0" w:firstRowLastColumn="0" w:lastRowFirstColumn="0" w:lastRowLastColumn="0"/>
-            <w:tcW w:w="414" w:type="dxa"/>
-            <w:hideMark/>
-          </w:tcPr>
-          <w:p>
-            <w:pPr>
-              <w:spacing w:after="200" w:line="276" w:lineRule="auto"/>
-            </w:pPr>
-            <w:r>
-              <w:t>1 </w:t>
-            </w:r>
-          </w:p>
-        </w:tc>
-        <w:tc>
-          <w:tcPr>
-            <w:tcW w:w="1947" w:type="dxa"/>
-            <w:hideMark/>
-          </w:tcPr>
-          <w:p>
-            <w:pPr>
-              <w:spacing w:after="200" w:line="276" w:lineRule="auto"/>
-              <w:cnfStyle w:val="000000000000" w:firstRow="0" w:lastRow="0" w:firstColumn="0" w:lastColumn="0" w:oddVBand="0" w:evenVBand="0" w:oddHBand="0" w:evenHBand="0" w:firstRowFirstColumn="0" w:firstRowLastColumn="0" w:lastRowFirstColumn="0" w:lastRowLastColumn="0"/>
-            </w:pPr>
-            <w:r>
-              <w:t>Moisture (%) </w:t>
-            </w:r>
-          </w:p>
-        </w:tc>
-        <w:tc>
-          <w:tcPr>
-            <w:tcW w:w="2160" w:type="dxa"/>
-            <w:hideMark/>
-          </w:tcPr>
-          <w:p>
-            <w:pPr>
-              <w:spacing w:after="200" w:line="276" w:lineRule="auto"/>
-              <w:cnfStyle w:val="000000000000" w:firstRow="0" w:lastRow="0" w:firstColumn="0" w:lastColumn="0" w:oddVBand="0" w:evenVBand="0" w:oddHBand="0" w:evenHBand="0" w:firstRowFirstColumn="0" w:firstRowLastColumn="0" w:lastRowFirstColumn="0" w:lastRowLastColumn="0"/>
-              <w:rPr>
-                <w:lang w:val="es-ES"/>
-              </w:rPr>
-            </w:pPr>
-            <w:r>
-              <w:t>Flour/Mixture, Bread</w:t>
-            </w:r>
-            <w:r>
-              <w:rPr>
-                <w:lang w:val="es-ES"/>
-              </w:rPr>
-              <w:t> </w:t>
-            </w:r>
-          </w:p>
-        </w:tc>
-        <w:tc>
-          <w:tcPr>
-            <w:tcW w:w="2499" w:type="dxa"/>
-            <w:hideMark/>
-          </w:tcPr>
-          <w:p>
-            <w:pPr>
-              <w:spacing w:after="200" w:line="276" w:lineRule="auto"/>
-              <w:cnfStyle w:val="000000000000" w:firstRow="0" w:lastRow="0" w:firstColumn="0" w:lastColumn="0" w:oddVBand="0" w:evenVBand="0" w:oddHBand="0" w:evenHBand="0" w:firstRowFirstColumn="0" w:firstRowLastColumn="0" w:lastRowFirstColumn="0" w:lastRowLastColumn="0"/>
-            </w:pPr>
-            <w:r>
-              <w:t>Process control, texture, shelf life </w:t>
-            </w:r>
-          </w:p>
-        </w:tc>
-      </w:tr>
-      <w:tr>
-        <w:trPr>
-          <w:trHeight w:val="300"/>
-          <w:jc w:val="center"/>
-        </w:trPr>
-        <w:tc>
-          <w:tcPr>
-            <w:cnfStyle w:val="001000000000" w:firstRow="0" w:lastRow="0" w:firstColumn="1" w:lastColumn="0" w:oddVBand="0" w:evenVBand="0" w:oddHBand="0" w:evenHBand="0" w:firstRowFirstColumn="0" w:firstRowLastColumn="0" w:lastRowFirstColumn="0" w:lastRowLastColumn="0"/>
-            <w:tcW w:w="414" w:type="dxa"/>
-            <w:hideMark/>
-          </w:tcPr>
-          <w:p>
-            <w:pPr>
-              <w:spacing w:after="200" w:line="276" w:lineRule="auto"/>
-            </w:pPr>
-            <w:r>
-              <w:t>2 </w:t>
-            </w:r>
-          </w:p>
-        </w:tc>
-        <w:tc>
-          <w:tcPr>
-            <w:tcW w:w="1947" w:type="dxa"/>
-            <w:hideMark/>
-          </w:tcPr>
-          <w:p>
-            <w:pPr>
-              <w:spacing w:after="200" w:line="276" w:lineRule="auto"/>
-              <w:cnfStyle w:val="000000000000" w:firstRow="0" w:lastRow="0" w:firstColumn="0" w:lastColumn="0" w:oddVBand="0" w:evenVBand="0" w:oddHBand="0" w:evenHBand="0" w:firstRowFirstColumn="0" w:firstRowLastColumn="0" w:lastRowFirstColumn="0" w:lastRowLastColumn="0"/>
-            </w:pPr>
-            <w:r>
-              <w:t>Crude protein (%) </w:t>
-            </w:r>
-          </w:p>
-        </w:tc>
-        <w:tc>
-          <w:tcPr>
-            <w:tcW w:w="2160" w:type="dxa"/>
-            <w:hideMark/>
-          </w:tcPr>
-          <w:p>
-            <w:pPr>
-              <w:spacing w:after="200" w:line="276" w:lineRule="auto"/>
-              <w:cnfStyle w:val="000000000000" w:firstRow="0" w:lastRow="0" w:firstColumn="0" w:lastColumn="0" w:oddVBand="0" w:evenVBand="0" w:oddHBand="0" w:evenHBand="0" w:firstRowFirstColumn="0" w:firstRowLastColumn="0" w:lastRowFirstColumn="0" w:lastRowLastColumn="0"/>
-              <w:rPr>
-                <w:lang w:val="es-ES"/>
-              </w:rPr>
-            </w:pPr>
-            <w:r>
-              <w:t>Flour/Mixture, Bread</w:t>
-            </w:r>
-            <w:r>
-              <w:rPr>
-                <w:lang w:val="es-ES"/>
-              </w:rPr>
-              <w:t> </w:t>
-            </w:r>
-          </w:p>
-        </w:tc>
-        <w:tc>
-          <w:tcPr>
-            <w:tcW w:w="2499" w:type="dxa"/>
-            <w:hideMark/>
-          </w:tcPr>
-          <w:p>
-            <w:pPr>
-              <w:spacing w:after="200" w:line="276" w:lineRule="auto"/>
-              <w:cnfStyle w:val="000000000000" w:firstRow="0" w:lastRow="0" w:firstColumn="0" w:lastColumn="0" w:oddVBand="0" w:evenVBand="0" w:oddHBand="0" w:evenHBand="0" w:firstRowFirstColumn="0" w:firstRowLastColumn="0" w:lastRowFirstColumn="0" w:lastRowLastColumn="0"/>
-            </w:pPr>
-            <w:r>
-              <w:t>Nutritional assessment </w:t>
-            </w:r>
-          </w:p>
-        </w:tc>
-      </w:tr>
-      <w:tr>
-        <w:trPr>
-          <w:trHeight w:val="300"/>
-          <w:jc w:val="center"/>
-        </w:trPr>
-        <w:tc>
-          <w:tcPr>
-            <w:cnfStyle w:val="001000000000" w:firstRow="0" w:lastRow="0" w:firstColumn="1" w:lastColumn="0" w:oddVBand="0" w:evenVBand="0" w:oddHBand="0" w:evenHBand="0" w:firstRowFirstColumn="0" w:firstRowLastColumn="0" w:lastRowFirstColumn="0" w:lastRowLastColumn="0"/>
-            <w:tcW w:w="414" w:type="dxa"/>
-            <w:hideMark/>
-          </w:tcPr>
-          <w:p>
-            <w:pPr>
-              <w:spacing w:after="200" w:line="276" w:lineRule="auto"/>
-            </w:pPr>
-            <w:r>
-              <w:t>4 </w:t>
-            </w:r>
-          </w:p>
-        </w:tc>
-        <w:tc>
-          <w:tcPr>
-            <w:tcW w:w="1947" w:type="dxa"/>
-            <w:hideMark/>
-          </w:tcPr>
-          <w:p>
-            <w:pPr>
-              <w:spacing w:after="200" w:line="276" w:lineRule="auto"/>
-              <w:cnfStyle w:val="000000000000" w:firstRow="0" w:lastRow="0" w:firstColumn="0" w:lastColumn="0" w:oddVBand="0" w:evenVBand="0" w:oddHBand="0" w:evenHBand="0" w:firstRowFirstColumn="0" w:firstRowLastColumn="0" w:lastRowFirstColumn="0" w:lastRowLastColumn="0"/>
-            </w:pPr>
-            <w:r>
-              <w:t>Ash content (%) </w:t>
-            </w:r>
-          </w:p>
-        </w:tc>
-        <w:tc>
-          <w:tcPr>
-            <w:tcW w:w="2160" w:type="dxa"/>
-            <w:hideMark/>
-          </w:tcPr>
-          <w:p>
-            <w:pPr>
-              <w:spacing w:after="200" w:line="276" w:lineRule="auto"/>
-              <w:cnfStyle w:val="000000000000" w:firstRow="0" w:lastRow="0" w:firstColumn="0" w:lastColumn="0" w:oddVBand="0" w:evenVBand="0" w:oddHBand="0" w:evenHBand="0" w:firstRowFirstColumn="0" w:firstRowLastColumn="0" w:lastRowFirstColumn="0" w:lastRowLastColumn="0"/>
-              <w:rPr>
-                <w:lang w:val="es-ES"/>
-              </w:rPr>
-            </w:pPr>
-            <w:r>
-              <w:t>Flour/Mixture, Bread</w:t>
-            </w:r>
-            <w:r>
-              <w:rPr>
-                <w:lang w:val="es-ES"/>
-              </w:rPr>
-              <w:t> </w:t>
-            </w:r>
-          </w:p>
-        </w:tc>
-        <w:tc>
-          <w:tcPr>
-            <w:tcW w:w="2499" w:type="dxa"/>
-            <w:hideMark/>
-          </w:tcPr>
-          <w:p>
-            <w:pPr>
-              <w:spacing w:after="200" w:line="276" w:lineRule="auto"/>
-              <w:cnfStyle w:val="000000000000" w:firstRow="0" w:lastRow="0" w:firstColumn="0" w:lastColumn="0" w:oddVBand="0" w:evenVBand="0" w:oddHBand="0" w:evenHBand="0" w:firstRowFirstColumn="0" w:firstRowLastColumn="0" w:lastRowFirstColumn="0" w:lastRowLastColumn="0"/>
-            </w:pPr>
-            <w:r>
-              <w:t>Estimate total mineral content </w:t>
-            </w:r>
-          </w:p>
-        </w:tc>
-      </w:tr>
-      <w:tr>
-        <w:trPr>
-          <w:trHeight w:val="300"/>
-          <w:jc w:val="center"/>
-        </w:trPr>
-        <w:tc>
-          <w:tcPr>
-            <w:cnfStyle w:val="001000000000" w:firstRow="0" w:lastRow="0" w:firstColumn="1" w:lastColumn="0" w:oddVBand="0" w:evenVBand="0" w:oddHBand="0" w:evenHBand="0" w:firstRowFirstColumn="0" w:firstRowLastColumn="0" w:lastRowFirstColumn="0" w:lastRowLastColumn="0"/>
-            <w:tcW w:w="414" w:type="dxa"/>
-            <w:hideMark/>
-          </w:tcPr>
-          <w:p>
-            <w:pPr>
-              <w:spacing w:after="200" w:line="276" w:lineRule="auto"/>
-            </w:pPr>
-            <w:r>
-              <w:t>6 </w:t>
-            </w:r>
-          </w:p>
-        </w:tc>
-        <w:tc>
-          <w:tcPr>
-            <w:tcW w:w="1947" w:type="dxa"/>
-            <w:hideMark/>
-          </w:tcPr>
-          <w:p>
-            <w:pPr>
-              <w:spacing w:after="200" w:line="276" w:lineRule="auto"/>
-              <w:cnfStyle w:val="000000000000" w:firstRow="0" w:lastRow="0" w:firstColumn="0" w:lastColumn="0" w:oddVBand="0" w:evenVBand="0" w:oddHBand="0" w:evenHBand="0" w:firstRowFirstColumn="0" w:firstRowLastColumn="0" w:lastRowFirstColumn="0" w:lastRowLastColumn="0"/>
-            </w:pPr>
-            <w:r>
-              <w:t>Total gluten (wet gluten) </w:t>
-            </w:r>
-          </w:p>
-        </w:tc>
-        <w:tc>
-          <w:tcPr>
-            <w:tcW w:w="2160" w:type="dxa"/>
-            <w:hideMark/>
-          </w:tcPr>
-          <w:p>
-            <w:pPr>
-              <w:spacing w:after="200" w:line="276" w:lineRule="auto"/>
-              <w:cnfStyle w:val="000000000000" w:firstRow="0" w:lastRow="0" w:firstColumn="0" w:lastColumn="0" w:oddVBand="0" w:evenVBand="0" w:oddHBand="0" w:evenHBand="0" w:firstRowFirstColumn="0" w:firstRowLastColumn="0" w:lastRowFirstColumn="0" w:lastRowLastColumn="0"/>
-              <w:rPr>
-                <w:lang w:val="es-ES"/>
-              </w:rPr>
-            </w:pPr>
-            <w:r>
-              <w:t>Flour/Mixture, Bread</w:t>
-            </w:r>
-            <w:r>
-              <w:rPr>
-                <w:lang w:val="es-ES"/>
-              </w:rPr>
-              <w:t> </w:t>
-            </w:r>
-          </w:p>
-        </w:tc>
-        <w:tc>
-          <w:tcPr>
-            <w:tcW w:w="2499" w:type="dxa"/>
-            <w:hideMark/>
-          </w:tcPr>
-          <w:p>
-            <w:pPr>
-              <w:spacing w:after="200" w:line="276" w:lineRule="auto"/>
-              <w:cnfStyle w:val="000000000000" w:firstRow="0" w:lastRow="0" w:firstColumn="0" w:lastColumn="0" w:oddVBand="0" w:evenVBand="0" w:oddHBand="0" w:evenHBand="0" w:firstRowFirstColumn="0" w:firstRowLastColumn="0" w:lastRowFirstColumn="0" w:lastRowLastColumn="0"/>
-            </w:pPr>
-            <w:r>
-              <w:t>Assess effect of xylanase on gluten network </w:t>
-            </w:r>
-          </w:p>
-        </w:tc>
-      </w:tr>
-    </w:tbl>
-    <w:p>
-      <w:r>
-        <w:rPr>
-          <w:highlight w:val="yellow"/>
-        </w:rPr>
-        <w:t>Optional: total dietary fiber (%) may be evaluated as an indicator of enzymatic modification.</w:t>
-      </w:r>
-    </w:p>
-    <w:p>
-      <w:pPr>
-        <w:pStyle w:val="Heading2"/>
-      </w:pPr>
-      <w:r>
-        <w:rPr>
-          <w:color w:val="C00000"/>
-        </w:rPr>
-        <w:lastRenderedPageBreak/>
-        <w:t>Sensory Evaluation</w:t>
-      </w:r>
-    </w:p>
-    <w:p>
-      <w:r>
-        <w:rPr>
-          <w:color w:val="C00000"/>
-        </w:rPr>
-        <w:t>Sensory evaluation was performed on all bread samples by the same panel of eight trained assessors, in accordance with the laboratory's standard bread evaluation protocol. Each sample was scored on five attributes using a 1–5 ordinal scale (1 = unacceptable, 5 = excellent): (i) bread overall appearance and shape, (ii) surface of the crust, (iii) proofing and appearance of the crumb, (iv) structure and elasticity of the crumb, and (v) overall smell and taste. The five attribute scores were combined into a single overall score using a fixed weighting scheme that reflects the relative importance of each attribute for bread quality: weights 1, 2, 4, 4 and 9 respectively, giving a maximum possible overall score of 100 points. Sessions were conducted under standardised conditions, and all formulations of a given batch were evaluated by each panellist within the same session. The Phase 1 samples scored were the control, 10% BSG, 20% BSG, 10% BSG with 70 ppm xylanase and 20% BSG with 70 ppm xylanase. Phase 2 samples (F6–F8) were evaluated by the same panel using the same protocol; their compositional analyses are pending and will be reported alongside the Phase 1 chemical results once completed.</w:t>
-      </w:r>
-    </w:p>
-    <w:p>
-      <w:pPr>
-        <w:pStyle w:val="Heading2"/>
-      </w:pPr>
-      <w:r>
-        <w:t>Rheological and Technological Measurements</w:t>
-      </w:r>
-    </w:p>
-    <w:p>
-      <w:r>
-        <w:t>The rheological behavior and baking performance will be assessed to understand how enzymatic treatment modifies dough development and baking response.</w:t>
-      </w:r>
-    </w:p>
-    <w:tbl>
-      <w:tblPr>
-        <w:tblStyle w:val="GridTable1Light-Accent1"/>
-        <w:tblW w:w="6727" w:type="dxa"/>
-        <w:jc w:val="center"/>
-        <w:tblLook w:val="04A0" w:firstRow="1" w:lastRow="0" w:firstColumn="1" w:lastColumn="0" w:noHBand="0" w:noVBand="1"/>
-      </w:tblPr>
-      <w:tblGrid>
-        <w:gridCol w:w="414"/>
-        <w:gridCol w:w="2870"/>
-        <w:gridCol w:w="1661"/>
-        <w:gridCol w:w="1782"/>
-      </w:tblGrid>
-      <w:tr>
-        <w:trPr>
-          <w:cnfStyle w:val="100000000000" w:firstRow="1" w:lastRow="0" w:firstColumn="0" w:lastColumn="0" w:oddVBand="0" w:evenVBand="0" w:oddHBand="0" w:evenHBand="0" w:firstRowFirstColumn="0" w:firstRowLastColumn="0" w:lastRowFirstColumn="0" w:lastRowLastColumn="0"/>
-          <w:trHeight w:val="300"/>
-          <w:jc w:val="center"/>
-        </w:trPr>
-        <w:tc>
-          <w:tcPr>
-            <w:cnfStyle w:val="001000000000" w:firstRow="0" w:lastRow="0" w:firstColumn="1" w:lastColumn="0" w:oddVBand="0" w:evenVBand="0" w:oddHBand="0" w:evenHBand="0" w:firstRowFirstColumn="0" w:firstRowLastColumn="0" w:lastRowFirstColumn="0" w:lastRowLastColumn="0"/>
-            <w:tcW w:w="414" w:type="dxa"/>
-            <w:hideMark/>
-          </w:tcPr>
-          <w:p>
-            <w:pPr>
-              <w:spacing w:after="200" w:line="276" w:lineRule="auto"/>
-            </w:pPr>
-            <w:r>
-              <w:t>N </w:t>
-            </w:r>
-          </w:p>
-        </w:tc>
-        <w:tc>
-          <w:tcPr>
-            <w:tcW w:w="2870" w:type="dxa"/>
-            <w:hideMark/>
-          </w:tcPr>
-          <w:p>
-            <w:pPr>
-              <w:spacing w:after="200" w:line="276" w:lineRule="auto"/>
-              <w:cnfStyle w:val="100000000000" w:firstRow="1" w:lastRow="0" w:firstColumn="0" w:lastColumn="0" w:oddVBand="0" w:evenVBand="0" w:oddHBand="0" w:evenHBand="0" w:firstRowFirstColumn="0" w:firstRowLastColumn="0" w:lastRowFirstColumn="0" w:lastRowLastColumn="0"/>
-            </w:pPr>
-            <w:r>
-              <w:t>Parameter </w:t>
-            </w:r>
-          </w:p>
-        </w:tc>
-        <w:tc>
-          <w:tcPr>
-            <w:tcW w:w="1661" w:type="dxa"/>
-            <w:hideMark/>
-          </w:tcPr>
-          <w:p>
-            <w:pPr>
-              <w:spacing w:after="200" w:line="276" w:lineRule="auto"/>
-              <w:cnfStyle w:val="100000000000" w:firstRow="1" w:lastRow="0" w:firstColumn="0" w:lastColumn="0" w:oddVBand="0" w:evenVBand="0" w:oddHBand="0" w:evenHBand="0" w:firstRowFirstColumn="0" w:firstRowLastColumn="0" w:lastRowFirstColumn="0" w:lastRowLastColumn="0"/>
-            </w:pPr>
-            <w:r>
-              <w:t>Sample </w:t>
-            </w:r>
-          </w:p>
-        </w:tc>
-        <w:tc>
-          <w:tcPr>
-            <w:tcW w:w="1782" w:type="dxa"/>
-            <w:hideMark/>
-          </w:tcPr>
-          <w:p>
-            <w:pPr>
-              <w:spacing w:after="200" w:line="276" w:lineRule="auto"/>
-              <w:cnfStyle w:val="100000000000" w:firstRow="1" w:lastRow="0" w:firstColumn="0" w:lastColumn="0" w:oddVBand="0" w:evenVBand="0" w:oddHBand="0" w:evenHBand="0" w:firstRowFirstColumn="0" w:firstRowLastColumn="0" w:lastRowFirstColumn="0" w:lastRowLastColumn="0"/>
-            </w:pPr>
-            <w:r>
-              <w:t>Objective </w:t>
-            </w:r>
-          </w:p>
-        </w:tc>
-      </w:tr>
-      <w:tr>
-        <w:trPr>
-          <w:trHeight w:val="300"/>
-          <w:jc w:val="center"/>
-        </w:trPr>
-        <w:tc>
-          <w:tcPr>
-            <w:cnfStyle w:val="001000000000" w:firstRow="0" w:lastRow="0" w:firstColumn="1" w:lastColumn="0" w:oddVBand="0" w:evenVBand="0" w:oddHBand="0" w:evenHBand="0" w:firstRowFirstColumn="0" w:firstRowLastColumn="0" w:lastRowFirstColumn="0" w:lastRowLastColumn="0"/>
-            <w:tcW w:w="414" w:type="dxa"/>
-            <w:hideMark/>
-          </w:tcPr>
-          <w:p>
-            <w:pPr>
-              <w:spacing w:after="200" w:line="276" w:lineRule="auto"/>
-            </w:pPr>
-            <w:r>
-              <w:t>1 </w:t>
-            </w:r>
-          </w:p>
-        </w:tc>
-        <w:tc>
-          <w:tcPr>
-            <w:tcW w:w="2870" w:type="dxa"/>
-            <w:hideMark/>
-          </w:tcPr>
-          <w:p>
-            <w:pPr>
-              <w:spacing w:after="200" w:line="276" w:lineRule="auto"/>
-              <w:cnfStyle w:val="000000000000" w:firstRow="0" w:lastRow="0" w:firstColumn="0" w:lastColumn="0" w:oddVBand="0" w:evenVBand="0" w:oddHBand="0" w:evenHBand="0" w:firstRowFirstColumn="0" w:firstRowLastColumn="0" w:lastRowFirstColumn="0" w:lastRowLastColumn="0"/>
-            </w:pPr>
-            <w:r>
-              <w:t>Water absorption, dough stability </w:t>
-            </w:r>
-          </w:p>
-        </w:tc>
-        <w:tc>
-          <w:tcPr>
-            <w:tcW w:w="1661" w:type="dxa"/>
-            <w:hideMark/>
-          </w:tcPr>
-          <w:p>
-            <w:pPr>
-              <w:spacing w:after="200" w:line="276" w:lineRule="auto"/>
-              <w:cnfStyle w:val="000000000000" w:firstRow="0" w:lastRow="0" w:firstColumn="0" w:lastColumn="0" w:oddVBand="0" w:evenVBand="0" w:oddHBand="0" w:evenHBand="0" w:firstRowFirstColumn="0" w:firstRowLastColumn="0" w:lastRowFirstColumn="0" w:lastRowLastColumn="0"/>
-            </w:pPr>
-            <w:r>
-              <w:t>Dough </w:t>
-            </w:r>
-          </w:p>
-        </w:tc>
-        <w:tc>
-          <w:tcPr>
-            <w:tcW w:w="1782" w:type="dxa"/>
-            <w:hideMark/>
-          </w:tcPr>
-          <w:p>
-            <w:pPr>
-              <w:spacing w:after="200" w:line="276" w:lineRule="auto"/>
-              <w:cnfStyle w:val="000000000000" w:firstRow="0" w:lastRow="0" w:firstColumn="0" w:lastColumn="0" w:oddVBand="0" w:evenVBand="0" w:oddHBand="0" w:evenHBand="0" w:firstRowFirstColumn="0" w:firstRowLastColumn="0" w:lastRowFirstColumn="0" w:lastRowLastColumn="0"/>
-            </w:pPr>
-            <w:r>
-              <w:t>Hydration and mixing properties </w:t>
-            </w:r>
-          </w:p>
-        </w:tc>
-      </w:tr>
-      <w:tr>
-        <w:trPr>
-          <w:trHeight w:val="300"/>
-          <w:jc w:val="center"/>
-        </w:trPr>
-        <w:tc>
-          <w:tcPr>
-            <w:cnfStyle w:val="001000000000" w:firstRow="0" w:lastRow="0" w:firstColumn="1" w:lastColumn="0" w:oddVBand="0" w:evenVBand="0" w:oddHBand="0" w:evenHBand="0" w:firstRowFirstColumn="0" w:firstRowLastColumn="0" w:lastRowFirstColumn="0" w:lastRowLastColumn="0"/>
-            <w:tcW w:w="414" w:type="dxa"/>
-            <w:hideMark/>
-          </w:tcPr>
-          <w:p>
-            <w:pPr>
-              <w:spacing w:after="200" w:line="276" w:lineRule="auto"/>
-            </w:pPr>
-            <w:r>
-              <w:t>2 </w:t>
-            </w:r>
-          </w:p>
-        </w:tc>
-        <w:tc>
-          <w:tcPr>
-            <w:tcW w:w="2870" w:type="dxa"/>
-            <w:hideMark/>
-          </w:tcPr>
-          <w:p>
-            <w:pPr>
-              <w:spacing w:after="200" w:line="276" w:lineRule="auto"/>
-              <w:cnfStyle w:val="000000000000" w:firstRow="0" w:lastRow="0" w:firstColumn="0" w:lastColumn="0" w:oddVBand="0" w:evenVBand="0" w:oddHBand="0" w:evenHBand="0" w:firstRowFirstColumn="0" w:firstRowLastColumn="0" w:lastRowFirstColumn="0" w:lastRowLastColumn="0"/>
-              <w:rPr>
-                <w:lang w:val="es-ES"/>
-              </w:rPr>
-            </w:pPr>
-            <w:r>
-              <w:t>Mixolab</w:t>
-            </w:r>
-            <w:r>
-              <w:rPr>
-                <w:lang w:val="es-ES"/>
-              </w:rPr>
-              <w:t> </w:t>
-            </w:r>
-          </w:p>
-        </w:tc>
-        <w:tc>
-          <w:tcPr>
-            <w:tcW w:w="1661" w:type="dxa"/>
-            <w:hideMark/>
-          </w:tcPr>
-          <w:p>
-            <w:pPr>
-              <w:spacing w:after="200" w:line="276" w:lineRule="auto"/>
-              <w:cnfStyle w:val="000000000000" w:firstRow="0" w:lastRow="0" w:firstColumn="0" w:lastColumn="0" w:oddVBand="0" w:evenVBand="0" w:oddHBand="0" w:evenHBand="0" w:firstRowFirstColumn="0" w:firstRowLastColumn="0" w:lastRowFirstColumn="0" w:lastRowLastColumn="0"/>
-            </w:pPr>
-            <w:r>
-              <w:t>Dough </w:t>
-            </w:r>
-          </w:p>
-        </w:tc>
-        <w:tc>
-          <w:tcPr>
-            <w:tcW w:w="1782" w:type="dxa"/>
-            <w:hideMark/>
-          </w:tcPr>
-          <w:p>
-            <w:pPr>
-              <w:spacing w:after="200" w:line="276" w:lineRule="auto"/>
-              <w:cnfStyle w:val="000000000000" w:firstRow="0" w:lastRow="0" w:firstColumn="0" w:lastColumn="0" w:oddVBand="0" w:evenVBand="0" w:oddHBand="0" w:evenHBand="0" w:firstRowFirstColumn="0" w:firstRowLastColumn="0" w:lastRowFirstColumn="0" w:lastRowLastColumn="0"/>
-            </w:pPr>
-            <w:r>
-              <w:t> Hydration and mixing properties </w:t>
-            </w:r>
-          </w:p>
-        </w:tc>
-      </w:tr>
-      <w:tr>
-        <w:trPr>
-          <w:trHeight w:val="300"/>
-          <w:jc w:val="center"/>
-        </w:trPr>
-        <w:tc>
-          <w:tcPr>
-            <w:cnfStyle w:val="001000000000" w:firstRow="0" w:lastRow="0" w:firstColumn="1" w:lastColumn="0" w:oddVBand="0" w:evenVBand="0" w:oddHBand="0" w:evenHBand="0" w:firstRowFirstColumn="0" w:firstRowLastColumn="0" w:lastRowFirstColumn="0" w:lastRowLastColumn="0"/>
-            <w:tcW w:w="414" w:type="dxa"/>
-            <w:hideMark/>
-          </w:tcPr>
-          <w:p>
-            <w:pPr>
-              <w:spacing w:after="200" w:line="276" w:lineRule="auto"/>
-            </w:pPr>
-            <w:r>
-              <w:t>3 </w:t>
-            </w:r>
-          </w:p>
-        </w:tc>
-        <w:tc>
-          <w:tcPr>
-            <w:tcW w:w="2870" w:type="dxa"/>
-            <w:hideMark/>
-          </w:tcPr>
-          <w:p>
-            <w:pPr>
-              <w:spacing w:after="200" w:line="276" w:lineRule="auto"/>
-              <w:cnfStyle w:val="000000000000" w:firstRow="0" w:lastRow="0" w:firstColumn="0" w:lastColumn="0" w:oddVBand="0" w:evenVBand="0" w:oddHBand="0" w:evenHBand="0" w:firstRowFirstColumn="0" w:firstRowLastColumn="0" w:lastRowFirstColumn="0" w:lastRowLastColumn="0"/>
-            </w:pPr>
-            <w:r>
-              <w:t>Specific volume (cm³/g) </w:t>
-            </w:r>
-          </w:p>
-        </w:tc>
-        <w:tc>
-          <w:tcPr>
-            <w:tcW w:w="1661" w:type="dxa"/>
-            <w:hideMark/>
-          </w:tcPr>
-          <w:p>
-            <w:pPr>
-              <w:spacing w:after="200" w:line="276" w:lineRule="auto"/>
-              <w:cnfStyle w:val="000000000000" w:firstRow="0" w:lastRow="0" w:firstColumn="0" w:lastColumn="0" w:oddVBand="0" w:evenVBand="0" w:oddHBand="0" w:evenHBand="0" w:firstRowFirstColumn="0" w:firstRowLastColumn="0" w:lastRowFirstColumn="0" w:lastRowLastColumn="0"/>
-            </w:pPr>
-            <w:r>
-              <w:t>Bread </w:t>
-            </w:r>
-          </w:p>
-        </w:tc>
-        <w:tc>
-          <w:tcPr>
-            <w:tcW w:w="1782" w:type="dxa"/>
-            <w:hideMark/>
-          </w:tcPr>
-          <w:p>
-            <w:pPr>
-              <w:spacing w:after="200" w:line="276" w:lineRule="auto"/>
-              <w:cnfStyle w:val="000000000000" w:firstRow="0" w:lastRow="0" w:firstColumn="0" w:lastColumn="0" w:oddVBand="0" w:evenVBand="0" w:oddHBand="0" w:evenHBand="0" w:firstRowFirstColumn="0" w:firstRowLastColumn="0" w:lastRowFirstColumn="0" w:lastRowLastColumn="0"/>
-            </w:pPr>
-            <w:r>
-              <w:t>Loaf expansion and gas retention </w:t>
-            </w:r>
-          </w:p>
-        </w:tc>
-      </w:tr>
-      <w:tr>
-        <w:trPr>
-          <w:trHeight w:val="300"/>
-          <w:jc w:val="center"/>
-        </w:trPr>
-        <w:tc>
-          <w:tcPr>
-            <w:cnfStyle w:val="001000000000" w:firstRow="0" w:lastRow="0" w:firstColumn="1" w:lastColumn="0" w:oddVBand="0" w:evenVBand="0" w:oddHBand="0" w:evenHBand="0" w:firstRowFirstColumn="0" w:firstRowLastColumn="0" w:lastRowFirstColumn="0" w:lastRowLastColumn="0"/>
-            <w:tcW w:w="414" w:type="dxa"/>
-            <w:hideMark/>
-          </w:tcPr>
-          <w:p>
-            <w:pPr>
-              <w:spacing w:after="200" w:line="276" w:lineRule="auto"/>
-            </w:pPr>
-            <w:r>
-              <w:t>4 </w:t>
-            </w:r>
-          </w:p>
-        </w:tc>
-        <w:tc>
-          <w:tcPr>
-            <w:tcW w:w="2870" w:type="dxa"/>
-            <w:hideMark/>
-          </w:tcPr>
-          <w:p>
-            <w:pPr>
-              <w:spacing w:after="200" w:line="276" w:lineRule="auto"/>
-              <w:cnfStyle w:val="000000000000" w:firstRow="0" w:lastRow="0" w:firstColumn="0" w:lastColumn="0" w:oddVBand="0" w:evenVBand="0" w:oddHBand="0" w:evenHBand="0" w:firstRowFirstColumn="0" w:firstRowLastColumn="0" w:lastRowFirstColumn="0" w:lastRowLastColumn="0"/>
-            </w:pPr>
-            <w:r>
-              <w:t>Crumb firmness </w:t>
-            </w:r>
-          </w:p>
-        </w:tc>
-        <w:tc>
-          <w:tcPr>
-            <w:tcW w:w="1661" w:type="dxa"/>
-            <w:hideMark/>
-          </w:tcPr>
-          <w:p>
-            <w:pPr>
-              <w:spacing w:after="200" w:line="276" w:lineRule="auto"/>
-              <w:cnfStyle w:val="000000000000" w:firstRow="0" w:lastRow="0" w:firstColumn="0" w:lastColumn="0" w:oddVBand="0" w:evenVBand="0" w:oddHBand="0" w:evenHBand="0" w:firstRowFirstColumn="0" w:firstRowLastColumn="0" w:lastRowFirstColumn="0" w:lastRowLastColumn="0"/>
-            </w:pPr>
-            <w:r>
-              <w:t>Bread </w:t>
-            </w:r>
-          </w:p>
-        </w:tc>
-        <w:tc>
-          <w:tcPr>
-            <w:tcW w:w="1782" w:type="dxa"/>
-            <w:hideMark/>
-          </w:tcPr>
-          <w:p>
-            <w:pPr>
-              <w:spacing w:after="200" w:line="276" w:lineRule="auto"/>
-              <w:cnfStyle w:val="000000000000" w:firstRow="0" w:lastRow="0" w:firstColumn="0" w:lastColumn="0" w:oddVBand="0" w:evenVBand="0" w:oddHBand="0" w:evenHBand="0" w:firstRowFirstColumn="0" w:firstRowLastColumn="0" w:lastRowFirstColumn="0" w:lastRowLastColumn="0"/>
-            </w:pPr>
-            <w:r>
-              <w:t>Softness and crumb structure </w:t>
-            </w:r>
-          </w:p>
-        </w:tc>
-      </w:tr>
-      <w:tr>
-        <w:trPr>
-          <w:trHeight w:val="300"/>
-          <w:jc w:val="center"/>
-        </w:trPr>
-        <w:tc>
-          <w:tcPr>
-            <w:cnfStyle w:val="001000000000" w:firstRow="0" w:lastRow="0" w:firstColumn="1" w:lastColumn="0" w:oddVBand="0" w:evenVBand="0" w:oddHBand="0" w:evenHBand="0" w:firstRowFirstColumn="0" w:firstRowLastColumn="0" w:lastRowFirstColumn="0" w:lastRowLastColumn="0"/>
-            <w:tcW w:w="414" w:type="dxa"/>
-            <w:hideMark/>
-          </w:tcPr>
-          <w:p>
-            <w:pPr>
-              <w:spacing w:after="200" w:line="276" w:lineRule="auto"/>
-            </w:pPr>
-            <w:r>
-              <w:t>5 </w:t>
-            </w:r>
-          </w:p>
-        </w:tc>
-        <w:tc>
-          <w:tcPr>
-            <w:tcW w:w="2870" w:type="dxa"/>
-            <w:hideMark/>
-          </w:tcPr>
-          <w:p>
-            <w:pPr>
-              <w:spacing w:after="200" w:line="276" w:lineRule="auto"/>
-              <w:cnfStyle w:val="000000000000" w:firstRow="0" w:lastRow="0" w:firstColumn="0" w:lastColumn="0" w:oddVBand="0" w:evenVBand="0" w:oddHBand="0" w:evenHBand="0" w:firstRowFirstColumn="0" w:firstRowLastColumn="0" w:lastRowFirstColumn="0" w:lastRowLastColumn="0"/>
-              <w:rPr>
-                <w:lang w:val="es-ES"/>
-              </w:rPr>
-            </w:pPr>
-            <w:r>
-              <w:t>Porosity by sensometric model</w:t>
-            </w:r>
-            <w:r>
-              <w:rPr>
-                <w:lang w:val="es-ES"/>
-              </w:rPr>
-              <w:t> </w:t>
-            </w:r>
-          </w:p>
-        </w:tc>
-        <w:tc>
-          <w:tcPr>
-            <w:tcW w:w="1661" w:type="dxa"/>
-            <w:hideMark/>
-          </w:tcPr>
-          <w:p>
-            <w:pPr>
-              <w:spacing w:after="200" w:line="276" w:lineRule="auto"/>
-              <w:cnfStyle w:val="000000000000" w:firstRow="0" w:lastRow="0" w:firstColumn="0" w:lastColumn="0" w:oddVBand="0" w:evenVBand="0" w:oddHBand="0" w:evenHBand="0" w:firstRowFirstColumn="0" w:firstRowLastColumn="0" w:lastRowFirstColumn="0" w:lastRowLastColumn="0"/>
-            </w:pPr>
-            <w:r>
-              <w:t>Bread </w:t>
-            </w:r>
-          </w:p>
-        </w:tc>
-        <w:tc>
-          <w:tcPr>
-            <w:tcW w:w="1782" w:type="dxa"/>
-            <w:hideMark/>
-          </w:tcPr>
-          <w:p>
-            <w:pPr>
-              <w:spacing w:after="200" w:line="276" w:lineRule="auto"/>
-              <w:cnfStyle w:val="000000000000" w:firstRow="0" w:lastRow="0" w:firstColumn="0" w:lastColumn="0" w:oddVBand="0" w:evenVBand="0" w:oddHBand="0" w:evenHBand="0" w:firstRowFirstColumn="0" w:firstRowLastColumn="0" w:lastRowFirstColumn="0" w:lastRowLastColumn="0"/>
-            </w:pPr>
-            <w:r>
-              <w:t> </w:t>
-            </w:r>
-            <w:r>
-              <w:t>Structure</w:t>
-            </w:r>
-          </w:p>
-        </w:tc>
-      </w:tr>
-    </w:tbl>
-    <w:p/>
-    <w:p>
-      <w:pPr>
-        <w:pStyle w:val="Heading2"/>
-      </w:pPr>
-      <w:r>
-        <w:rPr>
-          <w:color w:val="C00000"/>
-        </w:rPr>
-        <w:lastRenderedPageBreak/>
-        <w:t>Crumb Structure: Texture Profile and Digital Image Analysis</w:t>
-      </w:r>
-    </w:p>
-    <w:p>
-      <w:r>
-        <w:rPr>
-          <w:color w:val="C00000"/>
-        </w:rPr>
-        <w:t>Two complementary techniques were used to characterise the structure of the bread crumb, both introduced in Phase 2 and applied retroactively to archived Phase 1 photographs where possible. Texture profile analysis (TPA) was performed on 25-mm-thick crumb slices using a [to be completed: texture analyser model] under a double-compression protocol [to be completed: probe diameter, compression depth, crosshead speed, hold time], reporting hardness, springiness, cohesiveness, chewiness and resilience. Digital image analysis (DIA) of bread cross-sections was performed in BreadScan, the in-house DIA application developed for this thesis (bread_porosity_analyzer.html). The full processing pipeline (preprocessing parameters, thresholding strategy, structuring elements and metric formulas) is documented in the Annex at the end of this document. Reported metrics include 2D porosity (void fraction), cell density, mean cell area, cell uniformity, wall thickness and macro-pore fraction. Phase 1 photographs were re-analysed retroactively using the same pipeline applied to Phase 2 images, so that crumb structure can be compared across the two batches on a common basis without additional baking.</w:t>
-      </w:r>
-    </w:p>
-    <w:p>
-      <w:pPr>
-        <w:pStyle w:val="Heading1"/>
-      </w:pPr>
-      <w:r>
-        <w:t>Annex — Technical detail for Materials &amp; Methods (Digital Image Analysis)</w:t>
-      </w:r>
-    </w:p>
-    <w:p>
-      <w:r>
-        <w:t>The following passages were originally drafted as part of the Digital Image Analysis section of the literature review but contain implementation-level detail (specific algorithms, parameter values and formulas) that more naturally belongs in the Materials &amp; Methods chapter. They have been moved here verbatim so that they can be reused when the methods chapter is written.</w:t>
-      </w:r>
-    </w:p>
-    <w:p>
-      <w:pPr>
-        <w:pStyle w:val="Heading3"/>
-      </w:pPr>
-      <w:r>
-        <w:t>Image preprocessing and contrast enhancement (CLAHE, ITU-R BT.601)</w:t>
-      </w:r>
-    </w:p>
-    <w:p>
-      <w:r>
-        <w:t>Raw crumb images often suffer from uneven illumination, noise and low contrast between the solid matrix and gas cells. The preprocessing pipeline begins with conversion to grayscale using luminance-weighted channel combination (ITU-R BT.601: Y = 0.299R + 0.587G + 0.114B), followed by Gaussian blurring to suppress high-frequency noise while preserving pore boundaries. A critical enhancement step is Contrast-Limited Adaptive Histogram Equalisation (CLAHE), which operates on local tile regions rather than the entire image, computing a clipped histogram equalisation per tile and interpolating across boundaries using bilinear interpolation. This corrects spatial variations in brightness without amplifying noise (Pizer, et al., 1987). For BSG-enriched breads, however, the brown pigmentation reduces luminance contrast between cell walls and pore interiors, and CLAHE flattens the intensity histogram, destroying the peak that represents the dominant crumb matrix colour. The solution is a bread-type-specific pipeline: CLAHE is applied for white bread analysis, but bypassed for BSG/dark bread where the threshold is computed on the raw grayscale to preserve the native histogram structure (Bosakova-Ardenska &amp; Danev, 2015).</w:t>
-      </w:r>
-    </w:p>
-    <w:p>
-      <w:pPr>
-        <w:pStyle w:val="Heading3"/>
-      </w:pPr>
-      <w:r>
-        <w:lastRenderedPageBreak/>
-        <w:t>Comparison of thresholding algorithms (Gonzales-Barron &amp; Butler, 2006)</w:t>
-      </w:r>
-    </w:p>
-    <w:p>
-      <w:r>
-        <w:t>The central computational step in crumb DIA is image segmentation—classifying each pixel as either pore or wall. Thresholding is the dominant approach. Gonzales-Barron and Butler (Gonzales-Barron &amp; Butler, 2006) systematically compared seven thresholding algorithms (Otsu, isodata, minimum error, moment-preserving, Pun, fuzzy and manual) against K-means clustering on 135 bread slice images, finding that slight threshold variations caused substantial changes in cell uniformity and void fraction, with Otsu, isodata and fuzzy methods yielding the most consistent segmentation.</w:t>
-      </w:r>
-    </w:p>
-    <w:p>
-      <w:pPr>
-        <w:pStyle w:val="Heading3"/>
-      </w:pPr>
-      <w:r>
-        <w:t>Local adaptive thresholding: Sauvola formula</w:t>
-      </w:r>
-    </w:p>
-    <w:p>
-      <w:r>
-        <w:t>Global methods such as Otsu assume a bimodal intensity histogram and compute a single optimal cut-off. While effective for scanner images of white bread, global methods fail when illumination varies or when the crumb colour is heterogeneous, as occurs in BSG breads. Local adaptive thresholding overcomes this by computing a separate threshold for each pixel neighbourhood. The Sauvola method calculates T(x,y) = μ(x,y) × [1 + k × (σ(x,y)/R − 1)], where k controls sensitivity (typically 0.2) and R is the dynamic range of standard deviation (Sauvola &amp; Pietikäinen, 2000).</w:t>
-      </w:r>
-    </w:p>
-    <w:p>
-      <w:pPr>
-        <w:pStyle w:val="Heading3"/>
-      </w:pPr>
-      <w:r>
-        <w:t>Morphological post-processing: structuring elements and connectivity</w:t>
-      </w:r>
-    </w:p>
-    <w:p>
-      <w:r>
-        <w:t>After thresholding, binary images contain fragmented pore regions requiring morphological post-processing. Morphological closing (dilation followed by erosion) bridges small gaps between disconnected pore segments. The structuring element radius should be adapted to bread type: r = 1 for white bread with well-defined pores, and r = 3 for BSG breads where fibrous artefacts fragment genuine pores during thresholding. Individual gas cells are then identified through connected component labelling using 8-connectivity, which avoids artificially splitting cells at narrow connections. A size-based filter excludes noise (too small) and crust artefacts (too large). Importantly, no circularity filter should be applied: Gonzales-Barron and Butler (Gonzales-Barron &amp; Butler, 2006) demonstrated that bread pores are inherently elliptical and irregularly shaped, circularity-based rejection would discard genuine cells.</w:t>
-      </w:r>
-    </w:p>
-    <w:p>
-      <w:pPr>
-        <w:pStyle w:val="Heading3"/>
-      </w:pPr>
-      <w:r>
-        <w:t>Quantitative crumb metrics and formulas</w:t>
-      </w:r>
-    </w:p>
-    <w:p>
-      <w:r>
-        <w:t>Once individual cells have been identified and size-filtered, a suite of quantitative metrics can be computed. Void Fraction (2D Porosity) is the ratio of total pore area to total image area, reflecting overall gas retention. Values for white bread typically range from 25–45% in flatbed scans, while BSG breads show reduced porosity (15–35%) (Zghal, Scanlon, &amp; Sapirstein, 1999) (Gonzales-Barron &amp; Butler, 2006). Cell Density (cells/cm²) indicates crumb fineness, with higher values reflecting more numerous, smaller pores (Scanlon &amp; Zghal, 2001). Mean Cell Area reflects coarseness. Cell Uniformity, quantified as 1 minus the coefficient of variation of cell areas, measures pore size regularity and is one of the most sensitive metrics to threshold selection (Gonzales-Barron &amp; Butler, 2006). Wall Thickness, estimated as WT = √(A_solid / N_cells), indicates crumb matrix density. Macro Pore Fraction captures the percentage of area occupied by cells exceeding a coarseness threshold, indicating gas cell coalescence.</w:t>
-      </w:r>
     </w:p>
     <w:sectPr>
       <w:pgSz w:w="12240" w:h="15840"/>
@@ -14689,44 +13032,24 @@
       </w:r>
     </w:p>
   </w:comment>
-  <w:comment w:id="1" w:author="Lucia Buzzeo" w:date="2026-05-08T13:04:00Z" w:initials="LB">
-    <w:p>
-      <w:pPr>
-        <w:pStyle w:val="CommentText"/>
-        <w:jc w:val="left"/>
-      </w:pPr>
-      <w:r>
-        <w:rPr>
-          <w:rStyle w:val="CommentReference"/>
-        </w:rPr>
-        <w:annotationRef/>
-      </w:r>
-      <w:r>
-        <w:t>From here on, document is not completed.</w:t>
-      </w:r>
-    </w:p>
-  </w:comment>
 </w:comments>
 </file>
 
 <file path=word/commentsExtended.xml><?xml version="1.0" encoding="utf-8"?>
 <w15:commentsEx xmlns:wpc="http://schemas.microsoft.com/office/word/2010/wordprocessingCanvas" xmlns:cx="http://schemas.microsoft.com/office/drawing/2014/chartex" xmlns:cx1="http://schemas.microsoft.com/office/drawing/2015/9/8/chartex" xmlns:cx2="http://schemas.microsoft.com/office/drawing/2015/10/21/chartex" xmlns:cx3="http://schemas.microsoft.com/office/drawing/2016/5/9/chartex" xmlns:cx4="http://schemas.microsoft.com/office/drawing/2016/5/10/chartex" xmlns:cx5="http://schemas.microsoft.com/office/drawing/2016/5/11/chartex" xmlns:cx6="http://schemas.microsoft.com/office/drawing/2016/5/12/chartex" xmlns:cx7="http://schemas.microsoft.com/office/drawing/2016/5/13/chartex" xmlns:cx8="http://schemas.microsoft.com/office/drawing/2016/5/14/chartex" xmlns:mc="http://schemas.openxmlformats.org/markup-compatibility/2006" xmlns:aink="http://schemas.microsoft.com/office/drawing/2016/ink" xmlns:am3d="http://schemas.microsoft.com/office/drawing/2017/model3d" xmlns:o="urn:schemas-microsoft-com:office:office" xmlns:oel="http://schemas.microsoft.com/office/2019/extlst" xmlns:r="http://schemas.openxmlformats.org/officeDocument/2006/relationships" xmlns:m="http://schemas.openxmlformats.org/officeDocument/2006/math" xmlns:v="urn:schemas-microsoft-com:vml" xmlns:wp14="http://schemas.microsoft.com/office/word/2010/wordprocessingDrawing" xmlns:wp="http://schemas.openxmlformats.org/drawingml/2006/wordprocessingDrawing" xmlns:w10="urn:schemas-microsoft-com:office:word" xmlns:w="http://schemas.openxmlformats.org/wordprocessingml/2006/main" xmlns:w14="http://schemas.microsoft.com/office/word/2010/wordml" xmlns:w15="http://schemas.microsoft.com/office/word/2012/wordml" xmlns:w16cex="http://schemas.microsoft.com/office/word/2018/wordml/cex" xmlns:w16cid="http://schemas.microsoft.com/office/word/2016/wordml/cid" xmlns:w16="http://schemas.microsoft.com/office/word/2018/wordml" xmlns:w16du="http://schemas.microsoft.com/office/word/2023/wordml/word16du" xmlns:w16sdtdh="http://schemas.microsoft.com/office/word/2020/wordml/sdtdatahash" xmlns:w16sdtfl="http://schemas.microsoft.com/office/word/2024/wordml/sdtformatlock" xmlns:w16se="http://schemas.microsoft.com/office/word/2015/wordml/symex" xmlns:wpg="http://schemas.microsoft.com/office/word/2010/wordprocessingGroup" xmlns:wpi="http://schemas.microsoft.com/office/word/2010/wordprocessingInk" xmlns:wne="http://schemas.microsoft.com/office/word/2006/wordml" xmlns:wps="http://schemas.microsoft.com/office/word/2010/wordprocessingShape" mc:Ignorable="w14 w15 w16se w16cid w16 w16cex w16sdtdh w16sdtfl w16du wp14">
   <w15:commentEx w15:paraId="7CF313AE" w15:done="0"/>
-  <w15:commentEx w15:paraId="3ED40BF7" w15:done="0"/>
 </w15:commentsEx>
 </file>
 
 <file path=word/commentsExtensible.xml><?xml version="1.0" encoding="utf-8"?>
 <w16cex:commentsExtensible xmlns:wpc="http://schemas.microsoft.com/office/word/2010/wordprocessingCanvas" xmlns:cx="http://schemas.microsoft.com/office/drawing/2014/chartex" xmlns:cx1="http://schemas.microsoft.com/office/drawing/2015/9/8/chartex" xmlns:cx2="http://schemas.microsoft.com/office/drawing/2015/10/21/chartex" xmlns:cx3="http://schemas.microsoft.com/office/drawing/2016/5/9/chartex" xmlns:cx4="http://schemas.microsoft.com/office/drawing/2016/5/10/chartex" xmlns:cx5="http://schemas.microsoft.com/office/drawing/2016/5/11/chartex" xmlns:cx6="http://schemas.microsoft.com/office/drawing/2016/5/12/chartex" xmlns:cx7="http://schemas.microsoft.com/office/drawing/2016/5/13/chartex" xmlns:cx8="http://schemas.microsoft.com/office/drawing/2016/5/14/chartex" xmlns:cr="http://schemas.microsoft.com/office/comments/2020/reactions" xmlns:mc="http://schemas.openxmlformats.org/markup-compatibility/2006" xmlns:aink="http://schemas.microsoft.com/office/drawing/2016/ink" xmlns:am3d="http://schemas.microsoft.com/office/drawing/2017/model3d" xmlns:o="urn:schemas-microsoft-com:office:office" xmlns:oel="http://schemas.microsoft.com/office/2019/extlst" xmlns:r="http://schemas.openxmlformats.org/officeDocument/2006/relationships" xmlns:m="http://schemas.openxmlformats.org/officeDocument/2006/math" xmlns:v="urn:schemas-microsoft-com:vml" xmlns:wp14="http://schemas.microsoft.com/office/word/2010/wordprocessingDrawing" xmlns:wp="http://schemas.openxmlformats.org/drawingml/2006/wordprocessingDrawing" xmlns:w10="urn:schemas-microsoft-com:office:word" xmlns:w="http://schemas.openxmlformats.org/wordprocessingml/2006/main" xmlns:w14="http://schemas.microsoft.com/office/word/2010/wordml" xmlns:w15="http://schemas.microsoft.com/office/word/2012/wordml" xmlns:w16cex="http://schemas.microsoft.com/office/word/2018/wordml/cex" xmlns:w16cid="http://schemas.microsoft.com/office/word/2016/wordml/cid" xmlns:w16="http://schemas.microsoft.com/office/word/2018/wordml" xmlns:w16du="http://schemas.microsoft.com/office/word/2023/wordml/word16du" xmlns:w16sdtdh="http://schemas.microsoft.com/office/word/2020/wordml/sdtdatahash" xmlns:w16sdtfl="http://schemas.microsoft.com/office/word/2024/wordml/sdtformatlock" xmlns:w16se="http://schemas.microsoft.com/office/word/2015/wordml/symex" xmlns:wpg="http://schemas.microsoft.com/office/word/2010/wordprocessingGroup" xmlns:wpi="http://schemas.microsoft.com/office/word/2010/wordprocessingInk" xmlns:wne="http://schemas.microsoft.com/office/word/2006/wordml" xmlns:wps="http://schemas.microsoft.com/office/word/2010/wordprocessingShape" mc:Ignorable="w14 w15 w16se w16cid w16 w16cex w16sdtdh w16sdtfl cr w16du wp14">
   <w16cex:commentExtensible w16cex:durableId="41E56DA7" w16cex:dateUtc="2026-04-26T19:02:00Z"/>
-  <w16cex:commentExtensible w16cex:durableId="7B2FE85D" w16cex:dateUtc="2026-05-08T11:04:00Z"/>
 </w16cex:commentsExtensible>
 </file>
 
 <file path=word/commentsIds.xml><?xml version="1.0" encoding="utf-8"?>
 <w16cid:commentsIds xmlns:wpc="http://schemas.microsoft.com/office/word/2010/wordprocessingCanvas" xmlns:cx="http://schemas.microsoft.com/office/drawing/2014/chartex" xmlns:cx1="http://schemas.microsoft.com/office/drawing/2015/9/8/chartex" xmlns:cx2="http://schemas.microsoft.com/office/drawing/2015/10/21/chartex" xmlns:cx3="http://schemas.microsoft.com/office/drawing/2016/5/9/chartex" xmlns:cx4="http://schemas.microsoft.com/office/drawing/2016/5/10/chartex" xmlns:cx5="http://schemas.microsoft.com/office/drawing/2016/5/11/chartex" xmlns:cx6="http://schemas.microsoft.com/office/drawing/2016/5/12/chartex" xmlns:cx7="http://schemas.microsoft.com/office/drawing/2016/5/13/chartex" xmlns:cx8="http://schemas.microsoft.com/office/drawing/2016/5/14/chartex" xmlns:mc="http://schemas.openxmlformats.org/markup-compatibility/2006" xmlns:aink="http://schemas.microsoft.com/office/drawing/2016/ink" xmlns:am3d="http://schemas.microsoft.com/office/drawing/2017/model3d" xmlns:o="urn:schemas-microsoft-com:office:office" xmlns:oel="http://schemas.microsoft.com/office/2019/extlst" xmlns:r="http://schemas.openxmlformats.org/officeDocument/2006/relationships" xmlns:m="http://schemas.openxmlformats.org/officeDocument/2006/math" xmlns:v="urn:schemas-microsoft-com:vml" xmlns:wp14="http://schemas.microsoft.com/office/word/2010/wordprocessingDrawing" xmlns:wp="http://schemas.openxmlformats.org/drawingml/2006/wordprocessingDrawing" xmlns:w10="urn:schemas-microsoft-com:office:word" xmlns:w="http://schemas.openxmlformats.org/wordprocessingml/2006/main" xmlns:w14="http://schemas.microsoft.com/office/word/2010/wordml" xmlns:w15="http://schemas.microsoft.com/office/word/2012/wordml" xmlns:w16cex="http://schemas.microsoft.com/office/word/2018/wordml/cex" xmlns:w16cid="http://schemas.microsoft.com/office/word/2016/wordml/cid" xmlns:w16="http://schemas.microsoft.com/office/word/2018/wordml" xmlns:w16du="http://schemas.microsoft.com/office/word/2023/wordml/word16du" xmlns:w16sdtdh="http://schemas.microsoft.com/office/word/2020/wordml/sdtdatahash" xmlns:w16sdtfl="http://schemas.microsoft.com/office/word/2024/wordml/sdtformatlock" xmlns:w16se="http://schemas.microsoft.com/office/word/2015/wordml/symex" xmlns:wpg="http://schemas.microsoft.com/office/word/2010/wordprocessingGroup" xmlns:wpi="http://schemas.microsoft.com/office/word/2010/wordprocessingInk" xmlns:wne="http://schemas.microsoft.com/office/word/2006/wordml" xmlns:wps="http://schemas.microsoft.com/office/word/2010/wordprocessingShape" mc:Ignorable="w14 w15 w16se w16cid w16 w16cex w16sdtdh w16sdtfl w16du wp14">
   <w16cid:commentId w16cid:paraId="7CF313AE" w16cid:durableId="41E56DA7"/>
-  <w16cid:commentId w16cid:paraId="3ED40BF7" w16cid:durableId="7B2FE85D"/>
 </w16cid:commentsIds>
 </file>
 

</xml_diff>